<commit_message>
add refs to ms
</commit_message>
<xml_diff>
--- a/doc/DIMms20260821.docx
+++ b/doc/DIMms20260821.docx
@@ -1,6 +1,6 @@
 
 <file path=word/document.xml><?xml version="1.0" encoding="utf-8"?>
-<w:document xmlns:wpc="http://schemas.microsoft.com/office/word/2010/wordprocessingCanvas" xmlns:cx="http://schemas.microsoft.com/office/drawing/2014/chartex" xmlns:cx1="http://schemas.microsoft.com/office/drawing/2015/9/8/chartex" xmlns:cx2="http://schemas.microsoft.com/office/drawing/2015/10/21/chartex" xmlns:cx3="http://schemas.microsoft.com/office/drawing/2016/5/9/chartex" xmlns:cx4="http://schemas.microsoft.com/office/drawing/2016/5/10/chartex" xmlns:cx5="http://schemas.microsoft.com/office/drawing/2016/5/11/chartex" xmlns:cx6="http://schemas.microsoft.com/office/drawing/2016/5/12/chartex" xmlns:cx7="http://schemas.microsoft.com/office/drawing/2016/5/13/chartex" xmlns:cx8="http://schemas.microsoft.com/office/drawing/2016/5/14/chartex" xmlns:mc="http://schemas.openxmlformats.org/markup-compatibility/2006" xmlns:aink="http://schemas.microsoft.com/office/drawing/2016/ink" xmlns:am3d="http://schemas.microsoft.com/office/drawing/2017/model3d" xmlns:o="urn:schemas-microsoft-com:office:office" xmlns:oel="http://schemas.microsoft.com/office/2019/extlst" xmlns:r="http://schemas.openxmlformats.org/officeDocument/2006/relationships" xmlns:m="http://schemas.openxmlformats.org/officeDocument/2006/math" xmlns:v="urn:schemas-microsoft-com:vml" xmlns:wp14="http://schemas.microsoft.com/office/word/2010/wordprocessingDrawing" xmlns:wp="http://schemas.openxmlformats.org/drawingml/2006/wordprocessingDrawing" xmlns:w10="urn:schemas-microsoft-com:office:word" xmlns:w="http://schemas.openxmlformats.org/wordprocessingml/2006/main" xmlns:w14="http://schemas.microsoft.com/office/word/2010/wordml" xmlns:w15="http://schemas.microsoft.com/office/word/2012/wordml" xmlns:w16cex="http://schemas.microsoft.com/office/word/2018/wordml/cex" xmlns:w16cid="http://schemas.microsoft.com/office/word/2016/wordml/cid" xmlns:w16="http://schemas.microsoft.com/office/word/2018/wordml" xmlns:w16du="http://schemas.microsoft.com/office/word/2023/wordml/word16du" xmlns:w16sdtdh="http://schemas.microsoft.com/office/word/2020/wordml/sdtdatahash" xmlns:w16sdtfl="http://schemas.microsoft.com/office/word/2024/wordml/sdtformatlock" xmlns:w16se="http://schemas.microsoft.com/office/word/2015/wordml/symex" xmlns:wpg="http://schemas.microsoft.com/office/word/2010/wordprocessingGroup" xmlns:wpi="http://schemas.microsoft.com/office/word/2010/wordprocessingInk" xmlns:wne="http://schemas.microsoft.com/office/word/2006/wordml" xmlns:wps="http://schemas.microsoft.com/office/word/2010/wordprocessingShape" mc:Ignorable="w14 w15 w16se w16cid w16 w16cex w16sdtdh w16sdtfl w16du wp14">
+<w:document xmlns:wpc="http://schemas.microsoft.com/office/word/2010/wordprocessingCanvas" xmlns:cx="http://schemas.microsoft.com/office/drawing/2014/chartex" xmlns:cx1="http://schemas.microsoft.com/office/drawing/2015/9/8/chartex" xmlns:cx2="http://schemas.microsoft.com/office/drawing/2015/10/21/chartex" xmlns:cx3="http://schemas.microsoft.com/office/drawing/2016/5/9/chartex" xmlns:cx4="http://schemas.microsoft.com/office/drawing/2016/5/10/chartex" xmlns:cx5="http://schemas.microsoft.com/office/drawing/2016/5/11/chartex" xmlns:cx6="http://schemas.microsoft.com/office/drawing/2016/5/12/chartex" xmlns:cx7="http://schemas.microsoft.com/office/drawing/2016/5/13/chartex" xmlns:cx8="http://schemas.microsoft.com/office/drawing/2016/5/14/chartex" xmlns:mc="http://schemas.openxmlformats.org/markup-compatibility/2006" xmlns:m="http://schemas.openxmlformats.org/officeDocument/2006/math" xmlns:aink="http://schemas.microsoft.com/office/drawing/2016/ink" xmlns:am3d="http://schemas.microsoft.com/office/drawing/2017/model3d" xmlns:oel="http://schemas.microsoft.com/office/2019/extlst" xmlns:r="http://schemas.openxmlformats.org/officeDocument/2006/relationships" xmlns:wp14="http://schemas.microsoft.com/office/word/2010/wordprocessingDrawing" xmlns:wp="http://schemas.openxmlformats.org/drawingml/2006/wordprocessingDrawing" xmlns:wpg="http://schemas.microsoft.com/office/word/2010/wordprocessingGroup" xmlns:wpi="http://schemas.microsoft.com/office/word/2010/wordprocessingInk" xmlns:wps="http://schemas.microsoft.com/office/word/2010/wordprocessingShape" xmlns:o="urn:schemas-microsoft-com:office:office" xmlns:v="urn:schemas-microsoft-com:vml" xmlns:w10="urn:schemas-microsoft-com:office:word" xmlns:w="http://schemas.openxmlformats.org/wordprocessingml/2006/main" xmlns:w14="http://schemas.microsoft.com/office/word/2010/wordml" xmlns:w15="http://schemas.microsoft.com/office/word/2012/wordml" xmlns:w16cex="http://schemas.microsoft.com/office/word/2018/wordml/cex" xmlns:w16cid="http://schemas.microsoft.com/office/word/2016/wordml/cid" xmlns:w16="http://schemas.microsoft.com/office/word/2018/wordml" xmlns:w16sdtdh="http://schemas.microsoft.com/office/word/2020/wordml/sdtdatahash" xmlns:w16sdtfl="http://schemas.microsoft.com/office/word/2024/wordml/sdtformatlock" xmlns:w16se="http://schemas.microsoft.com/office/word/2015/wordml/symex" xmlns:w16du="http://schemas.microsoft.com/office/word/2023/wordml/word16du" xmlns:wne="http://schemas.microsoft.com/office/word/2006/wordml" mc:Ignorable="w14 w15 w16se w16cid w16 w16cex w16sdtdh w16sdtfl w16du wp14">
   <w:body>
     <w:p>
       <w:pPr>
@@ -1826,7 +1826,7 @@
         <w:rPr>
           <w:lang w:val="fr-FR"/>
         </w:rPr>
-        <w:t>bservations and LES (Nuijens et al.</w:t>
+        <w:t>bservations and LES (Bretherton et al.</w:t>
       </w:r>
       <w:r>
         <w:rPr>
@@ -1838,19 +1838,37 @@
         <w:rPr>
           <w:lang w:val="fr-FR"/>
         </w:rPr>
-        <w:t xml:space="preserve"> 2013; Bretherton et al.</w:t>
+        <w:t xml:space="preserve"> 2013</w:t>
       </w:r>
       <w:r>
         <w:rPr>
           <w:lang w:val="fr-FR"/>
         </w:rPr>
+        <w:t xml:space="preserve">; </w:t>
+      </w:r>
+      <w:r>
+        <w:rPr>
+          <w:lang w:val="fr-FR"/>
+        </w:rPr>
+        <w:t>Nuijens et al.</w:t>
+      </w:r>
+      <w:r>
+        <w:rPr>
+          <w:lang w:val="fr-FR"/>
+        </w:rPr>
         <w:t>,</w:t>
       </w:r>
       <w:r>
         <w:rPr>
           <w:lang w:val="fr-FR"/>
         </w:rPr>
-        <w:t xml:space="preserve"> 2013</w:t>
+        <w:t xml:space="preserve"> 201</w:t>
+      </w:r>
+      <w:r>
+        <w:rPr>
+          <w:lang w:val="fr-FR"/>
+        </w:rPr>
+        <w:t>4</w:t>
       </w:r>
       <w:r>
         <w:rPr>
@@ -1906,19 +1924,7 @@
         <w:rPr>
           <w:rFonts w:ascii="Aptos" w:hAnsi="Aptos"/>
         </w:rPr>
-        <w:t xml:space="preserve"> The</w:t>
-      </w:r>
-      <w:r>
-        <w:rPr>
-          <w:rFonts w:ascii="Aptos" w:hAnsi="Aptos"/>
-        </w:rPr>
-        <w:t xml:space="preserve"> moisture and the cloud profiles</w:t>
-      </w:r>
-      <w:r>
-        <w:rPr>
-          <w:rFonts w:ascii="Aptos" w:hAnsi="Aptos"/>
-        </w:rPr>
-        <w:t xml:space="preserve"> are key ingredients in a recipe for clouds and vertical moisture flux, and how they change with global surface temperature.</w:t>
+        <w:t xml:space="preserve"> The moisture and the cloud profiles are key ingredients in a recipe for clouds and vertical moisture flux, and how they change with global surface temperature.</w:t>
       </w:r>
     </w:p>
     <w:p>
@@ -3138,13 +3144,7 @@
             <w:rPr>
               <w:rFonts w:ascii="Cambria Math" w:hAnsi="Cambria Math"/>
             </w:rPr>
-            <m:t>q</m:t>
-          </m:r>
-          <m:r>
-            <w:rPr>
-              <w:rFonts w:ascii="Cambria Math" w:hAnsi="Cambria Math"/>
-            </w:rPr>
-            <m:t>,</m:t>
+            <m:t>q,</m:t>
           </m:r>
           <m:r>
             <m:rPr>
@@ -4329,19 +4329,7 @@
         <w:t>moisture flux divergence balancing the mean moisture budget</w:t>
       </w:r>
       <w:r>
-        <w:t xml:space="preserve"> does not constrain c</w:t>
-      </w:r>
-      <w:r>
-        <w:t>louds</w:t>
-      </w:r>
-      <w:r>
-        <w:t xml:space="preserve"> below 1 km. These clouds are </w:t>
-      </w:r>
-      <w:r>
-        <w:t xml:space="preserve">directly coupled to subcloud </w:t>
-      </w:r>
-      <w:r>
-        <w:t xml:space="preserve">moisture </w:t>
+        <w:t xml:space="preserve"> does not constrain clouds below 1 km. These clouds are directly coupled to subcloud moisture </w:t>
       </w:r>
       <w:r>
         <w:rPr>
@@ -4854,13 +4842,7 @@
         <w:rPr>
           <w:rFonts w:ascii="Aptos" w:eastAsiaTheme="minorEastAsia" w:hAnsi="Aptos"/>
         </w:rPr>
-        <w:t>in e</w:t>
-      </w:r>
-      <w:r>
-        <w:rPr>
-          <w:rFonts w:ascii="Aptos" w:eastAsiaTheme="minorEastAsia" w:hAnsi="Aptos"/>
-        </w:rPr>
-        <w:t xml:space="preserve">xperiment </w:t>
+        <w:t xml:space="preserve">in experiment </w:t>
       </w:r>
       <w:r>
         <w:rPr>
@@ -5451,10 +5433,7 @@
         <w:t>DIM</w:t>
       </w:r>
       <w:r>
-        <w:t xml:space="preserve">, also increasing cloud base RH </w:t>
-      </w:r>
-      <w:r>
-        <w:t>by</w:t>
+        <w:t>, also increasing cloud base RH by</w:t>
       </w:r>
       <w:r>
         <w:rPr>
@@ -5621,10 +5600,7 @@
         <w:t>lclRH+0.003</w:t>
       </w:r>
       <w:r>
-        <w:t xml:space="preserve"> results in</w:t>
-      </w:r>
-      <w:r>
-        <w:t xml:space="preserve"> +2.7% more clouds than the </w:t>
+        <w:t xml:space="preserve"> results in +2.7% more clouds than the </w:t>
       </w:r>
       <w:r>
         <w:rPr>
@@ -5633,16 +5609,7 @@
         <w:t>DIM</w:t>
       </w:r>
       <w:r>
-        <w:t xml:space="preserve"> experiment</w:t>
-      </w:r>
-      <w:r>
-        <w:t xml:space="preserve"> (</w:t>
-      </w:r>
-      <w:r>
-        <w:t>–5.03% less clouds than the control simulation</w:t>
-      </w:r>
-      <w:r>
-        <w:t xml:space="preserve">). Surface RH and wind speed both increase to damp the surface evaporation change to +2% </w:t>
+        <w:t xml:space="preserve"> experiment (–5.03% less clouds than the control simulation). Surface RH and wind speed both increase to damp the surface evaporation change to +2% </w:t>
       </w:r>
       <w:r>
         <w:rPr>
@@ -5877,13 +5844,7 @@
           <w:rPr>
             <w:rFonts w:ascii="Cambria Math" w:hAnsi="Cambria Math"/>
           </w:rPr>
-          <m:t>C/</m:t>
-        </m:r>
-        <m:r>
-          <w:rPr>
-            <w:rFonts w:ascii="Cambria Math" w:hAnsi="Cambria Math"/>
-          </w:rPr>
-          <m:t>C=</m:t>
+          <m:t>C/C=</m:t>
         </m:r>
         <m:r>
           <m:rPr>
@@ -6357,25 +6318,7 @@
                 <w:rPr>
                   <w:rFonts w:ascii="Cambria Math" w:hAnsi="Cambria Math"/>
                 </w:rPr>
-                <m:t>C</m:t>
-              </m:r>
-              <m:r>
-                <m:rPr>
-                  <m:sty m:val="bi"/>
-                </m:rPr>
-                <w:rPr>
-                  <w:rFonts w:ascii="Cambria Math" w:hAnsi="Cambria Math"/>
-                </w:rPr>
-                <m:t>/</m:t>
-              </m:r>
-              <m:r>
-                <m:rPr>
-                  <m:sty m:val="bi"/>
-                </m:rPr>
-                <w:rPr>
-                  <w:rFonts w:ascii="Cambria Math" w:hAnsi="Cambria Math"/>
-                </w:rPr>
-                <m:t>C</m:t>
+                <m:t>C/C</m:t>
               </m:r>
             </m:oMath>
             <w:r>
@@ -7935,19 +7878,7 @@
           <w:rPr>
             <w:rFonts w:ascii="Cambria Math" w:eastAsiaTheme="minorEastAsia" w:hAnsi="Cambria Math" w:cs="Times New Roman"/>
           </w:rPr>
-          <m:t>dM/d</m:t>
-        </m:r>
-        <m:r>
-          <w:rPr>
-            <w:rFonts w:ascii="Cambria Math" w:eastAsiaTheme="minorEastAsia" w:hAnsi="Cambria Math" w:cs="Times New Roman"/>
-          </w:rPr>
-          <m:t>A</m:t>
-        </m:r>
-        <m:r>
-          <w:rPr>
-            <w:rFonts w:ascii="Cambria Math" w:eastAsiaTheme="minorEastAsia" w:hAnsi="Cambria Math" w:cs="Times New Roman"/>
-          </w:rPr>
-          <m:t xml:space="preserve"> </m:t>
+          <m:t xml:space="preserve">dM/dA </m:t>
         </m:r>
       </m:oMath>
       <w:r>
@@ -8037,19 +7968,7 @@
           <w:rPr>
             <w:rFonts w:ascii="Cambria Math" w:eastAsiaTheme="minorEastAsia" w:hAnsi="Cambria Math"/>
           </w:rPr>
-          <m:t>d</m:t>
-        </m:r>
-        <m:r>
-          <w:rPr>
-            <w:rFonts w:ascii="Cambria Math" w:eastAsiaTheme="minorEastAsia" w:hAnsi="Cambria Math"/>
-          </w:rPr>
-          <m:t>M</m:t>
-        </m:r>
-        <m:r>
-          <w:rPr>
-            <w:rFonts w:ascii="Cambria Math" w:eastAsiaTheme="minorEastAsia" w:hAnsi="Cambria Math"/>
-          </w:rPr>
-          <m:t>/dA</m:t>
+          <m:t>dM/dA</m:t>
         </m:r>
       </m:oMath>
       <w:r>
@@ -8532,13 +8451,7 @@
         <w:rPr>
           <w:rFonts w:ascii="Aptos" w:hAnsi="Aptos"/>
         </w:rPr>
-        <w:t>–</w:t>
-      </w:r>
-      <w:r>
-        <w:rPr>
-          <w:rFonts w:ascii="Aptos" w:hAnsi="Aptos"/>
-        </w:rPr>
-        <w:t xml:space="preserve">8% </w:t>
+        <w:t xml:space="preserve">–8% </w:t>
       </w:r>
       <w:r>
         <w:rPr>
@@ -8840,13 +8753,7 @@
         <w:rPr>
           <w:rFonts w:ascii="Aptos" w:hAnsi="Aptos"/>
         </w:rPr>
-        <w:t>–4.7</w:t>
-      </w:r>
-      <w:r>
-        <w:rPr>
-          <w:rFonts w:ascii="Aptos" w:hAnsi="Aptos"/>
-        </w:rPr>
-        <w:t xml:space="preserve"> to </w:t>
+        <w:t xml:space="preserve">–4.7 to </w:t>
       </w:r>
       <w:r>
         <w:rPr>
@@ -9019,14 +8926,7 @@
           <w:rFonts w:eastAsiaTheme="minorEastAsia"/>
           <w:iCs/>
         </w:rPr>
-        <w:t>in the descending branch of the Hadley circulation</w:t>
-      </w:r>
-      <w:r>
-        <w:rPr>
-          <w:rFonts w:eastAsiaTheme="minorEastAsia"/>
-          <w:iCs/>
-        </w:rPr>
-        <w:t xml:space="preserve"> </w:t>
+        <w:t xml:space="preserve">in the descending branch of the Hadley circulation </w:t>
       </w:r>
       <w:r>
         <w:rPr>
@@ -9187,21 +9087,7 @@
           <w:rFonts w:eastAsiaTheme="minorEastAsia"/>
           <w:iCs/>
         </w:rPr>
-        <w:t xml:space="preserve"> (Vogel et al. 2022), and </w:t>
-      </w:r>
-      <w:r>
-        <w:rPr>
-          <w:rFonts w:eastAsiaTheme="minorEastAsia"/>
-          <w:iCs/>
-        </w:rPr>
-        <w:t>extends</w:t>
-      </w:r>
-      <w:r>
-        <w:rPr>
-          <w:rFonts w:eastAsiaTheme="minorEastAsia"/>
-          <w:iCs/>
-        </w:rPr>
-        <w:t xml:space="preserve"> it </w:t>
+        <w:t xml:space="preserve"> (Vogel et al. 2022), and extends it </w:t>
       </w:r>
       <w:r>
         <w:rPr>
@@ -10171,16 +10057,7 @@
           <w:rPr>
             <w:rFonts w:ascii="Cambria Math" w:hAnsi="Cambria Math"/>
           </w:rPr>
-          <m:t>[</m:t>
-        </m:r>
-        <m:r>
-          <m:rPr>
-            <m:sty m:val="p"/>
-          </m:rPr>
-          <w:rPr>
-            <w:rFonts w:ascii="Cambria Math" w:hAnsi="Cambria Math"/>
-          </w:rPr>
-          <m:t>Δ</m:t>
+          <m:t>[Δ</m:t>
         </m:r>
         <m:r>
           <w:rPr>
@@ -10304,13 +10181,7 @@
           <w:rPr>
             <w:rFonts w:ascii="Cambria Math" w:hAnsi="Cambria Math"/>
           </w:rPr>
-          <m:t>)</m:t>
-        </m:r>
-        <m:r>
-          <w:rPr>
-            <w:rFonts w:ascii="Cambria Math" w:hAnsi="Cambria Math"/>
-          </w:rPr>
-          <m:t>[</m:t>
+          <m:t>)[</m:t>
         </m:r>
         <m:r>
           <m:rPr>
@@ -10325,13 +10196,7 @@
           <w:rPr>
             <w:rFonts w:ascii="Cambria Math" w:hAnsi="Cambria Math"/>
           </w:rPr>
-          <m:t>q)/</m:t>
-        </m:r>
-        <m:r>
-          <w:rPr>
-            <w:rFonts w:ascii="Cambria Math" w:hAnsi="Cambria Math"/>
-          </w:rPr>
-          <m:t>(</m:t>
+          <m:t>q)/(</m:t>
         </m:r>
         <m:r>
           <m:rPr>
@@ -10346,13 +10211,7 @@
           <w:rPr>
             <w:rFonts w:ascii="Cambria Math" w:hAnsi="Cambria Math"/>
           </w:rPr>
-          <m:t>q)</m:t>
-        </m:r>
-        <m:r>
-          <w:rPr>
-            <w:rFonts w:ascii="Cambria Math" w:hAnsi="Cambria Math"/>
-          </w:rPr>
-          <m:t>]</m:t>
+          <m:t>q)]</m:t>
         </m:r>
       </m:oMath>
       <w:r>
@@ -10700,7 +10559,13 @@
         <w:t xml:space="preserve"> </w:t>
       </w:r>
       <w:r>
-        <w:t>stratocumulus clouds (Myers and Norris, 2014).</w:t>
+        <w:t>stratocumulus clouds (Myers and Norris, 201</w:t>
+      </w:r>
+      <w:r>
+        <w:t>3</w:t>
+      </w:r>
+      <w:r>
+        <w:t>).</w:t>
       </w:r>
       <w:commentRangeEnd w:id="31"/>
       <w:r>
@@ -10725,55 +10590,83 @@
           <w:rFonts w:eastAsiaTheme="minorEastAsia"/>
           <w:iCs/>
         </w:rPr>
-        <w:t>C</w:t>
+        <w:t>Convective plumes balancing large-scale drying do not accurately parameterize t</w:t>
       </w:r>
       <w:r>
         <w:rPr>
           <w:rFonts w:eastAsiaTheme="minorEastAsia"/>
           <w:iCs/>
         </w:rPr>
-        <w:t>onvective plumes balancing large-scale drying</w:t>
+        <w:t xml:space="preserve">he </w:t>
       </w:r>
       <w:r>
         <w:rPr>
           <w:rFonts w:eastAsiaTheme="minorEastAsia"/>
           <w:iCs/>
         </w:rPr>
-        <w:t xml:space="preserve"> do not accurately parameterize t</w:t>
+        <w:t>19%</w:t>
       </w:r>
       <w:r>
         <w:rPr>
           <w:rFonts w:eastAsiaTheme="minorEastAsia"/>
           <w:iCs/>
         </w:rPr>
-        <w:t xml:space="preserve">he </w:t>
+        <w:t xml:space="preserve"> of clouds with cloud tops below 1 km</w:t>
       </w:r>
       <w:r>
         <w:rPr>
           <w:rFonts w:eastAsiaTheme="minorEastAsia"/>
           <w:iCs/>
         </w:rPr>
-        <w:t>19%</w:t>
+        <w:t xml:space="preserve"> </w:t>
       </w:r>
       <w:r>
         <w:rPr>
           <w:rFonts w:eastAsiaTheme="minorEastAsia"/>
           <w:iCs/>
         </w:rPr>
-        <w:t xml:space="preserve"> of clouds </w:t>
+        <w:t>over the tropical Atlantic study</w:t>
       </w:r>
       <w:r>
         <w:rPr>
           <w:rFonts w:eastAsiaTheme="minorEastAsia"/>
           <w:iCs/>
         </w:rPr>
-        <w:t>with cloud tops below 1 km</w:t>
+        <w:t xml:space="preserve"> region</w:t>
       </w:r>
       <w:r>
         <w:rPr>
           <w:rFonts w:eastAsiaTheme="minorEastAsia"/>
           <w:iCs/>
         </w:rPr>
+        <w:t xml:space="preserve">. </w:t>
+      </w:r>
+      <w:r>
+        <w:rPr>
+          <w:rFonts w:eastAsiaTheme="minorEastAsia"/>
+          <w:iCs/>
+        </w:rPr>
+        <w:t xml:space="preserve">Rather, these cloud base clouds are </w:t>
+      </w:r>
+      <w:r>
+        <w:rPr>
+          <w:rFonts w:eastAsiaTheme="minorEastAsia"/>
+          <w:iCs/>
+        </w:rPr>
+        <w:t>coupled to subcloud humidity fluctuations</w:t>
+      </w:r>
+      <w:r>
+        <w:rPr>
+          <w:rFonts w:eastAsiaTheme="minorEastAsia"/>
+          <w:iCs/>
+        </w:rPr>
+        <w:t>.</w:t>
+      </w:r>
+      <w:r>
+        <w:rPr>
+          <w:rFonts w:eastAsiaTheme="minorEastAsia"/>
+          <w:iCs/>
+        </w:rPr>
         <w:t xml:space="preserve"> </w:t>
       </w:r>
       <w:r>
@@ -10781,84 +10674,28 @@
           <w:rFonts w:eastAsiaTheme="minorEastAsia"/>
           <w:iCs/>
         </w:rPr>
-        <w:t>over the tropical Atlantic study</w:t>
+        <w:t xml:space="preserve">The fraction of these </w:t>
       </w:r>
       <w:r>
         <w:rPr>
           <w:rFonts w:eastAsiaTheme="minorEastAsia"/>
           <w:iCs/>
         </w:rPr>
-        <w:t xml:space="preserve"> region</w:t>
+        <w:t>humidity fluctuations</w:t>
       </w:r>
       <w:r>
         <w:rPr>
           <w:rFonts w:eastAsiaTheme="minorEastAsia"/>
           <w:iCs/>
         </w:rPr>
-        <w:t xml:space="preserve">. </w:t>
+        <w:t xml:space="preserve"> resulting in clouds</w:t>
       </w:r>
       <w:r>
         <w:rPr>
           <w:rFonts w:eastAsiaTheme="minorEastAsia"/>
           <w:iCs/>
         </w:rPr>
-        <w:t xml:space="preserve">Rather, these cloud base clouds are </w:t>
-      </w:r>
-      <w:r>
-        <w:rPr>
-          <w:rFonts w:eastAsiaTheme="minorEastAsia"/>
-          <w:iCs/>
-        </w:rPr>
-        <w:t>coupled to subcloud humidity fluctuations</w:t>
-      </w:r>
-      <w:r>
-        <w:rPr>
-          <w:rFonts w:eastAsiaTheme="minorEastAsia"/>
-          <w:iCs/>
-        </w:rPr>
-        <w:t>.</w:t>
-      </w:r>
-      <w:r>
-        <w:rPr>
-          <w:rFonts w:eastAsiaTheme="minorEastAsia"/>
-          <w:iCs/>
-        </w:rPr>
-        <w:t xml:space="preserve"> </w:t>
-      </w:r>
-      <w:r>
-        <w:rPr>
-          <w:rFonts w:eastAsiaTheme="minorEastAsia"/>
-          <w:iCs/>
-        </w:rPr>
-        <w:t xml:space="preserve">The fraction of these </w:t>
-      </w:r>
-      <w:r>
-        <w:rPr>
-          <w:rFonts w:eastAsiaTheme="minorEastAsia"/>
-          <w:iCs/>
-        </w:rPr>
-        <w:t>humidity fluctuations</w:t>
-      </w:r>
-      <w:r>
-        <w:rPr>
-          <w:rFonts w:eastAsiaTheme="minorEastAsia"/>
-          <w:iCs/>
-        </w:rPr>
-        <w:t xml:space="preserve"> resulting in clouds</w:t>
-      </w:r>
-      <w:r>
-        <w:rPr>
-          <w:rFonts w:eastAsiaTheme="minorEastAsia"/>
-          <w:iCs/>
-        </w:rPr>
-        <w:t xml:space="preserve"> </w:t>
-      </w:r>
-      <w:r>
-        <w:rPr>
-          <w:rFonts w:eastAsiaTheme="minorEastAsia"/>
-          <w:iCs/>
-        </w:rPr>
-        <w:t>may increase or decrease</w:t>
+        <w:t xml:space="preserve"> may increase or decrease</w:t>
       </w:r>
       <w:r>
         <w:rPr>
@@ -10994,14 +10831,7 @@
           <w:rFonts w:eastAsiaTheme="minorEastAsia"/>
           <w:iCs/>
         </w:rPr>
-        <w:t>The present study is not suited to assess the effect of</w:t>
-      </w:r>
-      <w:r>
-        <w:rPr>
-          <w:rFonts w:eastAsiaTheme="minorEastAsia"/>
-          <w:iCs/>
-        </w:rPr>
-        <w:t xml:space="preserve"> m</w:t>
+        <w:t>The present study is not suited to assess the effect of m</w:t>
       </w:r>
       <w:r>
         <w:rPr>
@@ -12617,15 +12447,7 @@
           <w:kern w:val="0"/>
           <w14:ligatures w14:val="none"/>
         </w:rPr>
-        <w:t xml:space="preserve">, and </w:t>
-      </w:r>
-      <w:r>
-        <w:rPr>
-          <w:rFonts w:ascii="Aptos Narrow" w:eastAsiaTheme="minorEastAsia" w:hAnsi="Aptos Narrow" w:cs="Times New Roman"/>
-          <w:kern w:val="0"/>
-          <w14:ligatures w14:val="none"/>
-        </w:rPr>
-        <w:t xml:space="preserve">(c) </w:t>
+        <w:t xml:space="preserve">, and (c) </w:t>
       </w:r>
       <w:r>
         <w:rPr>
@@ -12643,7 +12465,19 @@
         <w:rPr>
           <w:rFonts w:ascii="Aptos Narrow" w:hAnsi="Aptos Narrow"/>
         </w:rPr>
-        <w:t xml:space="preserve"> Webb et al. 2012) Atmospheric (AMIP) preindustrial</w:t>
+        <w:t xml:space="preserve"> Webb et al. 201</w:t>
+      </w:r>
+      <w:r>
+        <w:rPr>
+          <w:rFonts w:ascii="Aptos Narrow" w:hAnsi="Aptos Narrow"/>
+        </w:rPr>
+        <w:t>7</w:t>
+      </w:r>
+      <w:r>
+        <w:rPr>
+          <w:rFonts w:ascii="Aptos Narrow" w:hAnsi="Aptos Narrow"/>
+        </w:rPr>
+        <w:t>) Atmospheric (AMIP) preindustrial</w:t>
       </w:r>
       <w:r>
         <w:rPr>
@@ -22290,7 +22124,21 @@
           <w:rFonts w:ascii="Aptos" w:hAnsi="Aptos"/>
           <w:lang w:val="fr-FR"/>
         </w:rPr>
-        <w:t xml:space="preserve">Large-eddy simulation (LES; (Bretherton et al. 2013, Blossey et al. 2013) and observations (Bony et al., 2021; Vogel et al., 2022; Fig. </w:t>
+        <w:t>Large-eddy simulation (LES; (Bretherton et al. 2013, Blossey et al. 2013) and observations (Bony et al., 202</w:t>
+      </w:r>
+      <w:r>
+        <w:rPr>
+          <w:rFonts w:ascii="Aptos" w:hAnsi="Aptos"/>
+          <w:lang w:val="fr-FR"/>
+        </w:rPr>
+        <w:t>2</w:t>
+      </w:r>
+      <w:r>
+        <w:rPr>
+          <w:rFonts w:ascii="Aptos" w:hAnsi="Aptos"/>
+          <w:lang w:val="fr-FR"/>
+        </w:rPr>
+        <w:t xml:space="preserve">; Vogel et al., 2022; Fig. </w:t>
       </w:r>
       <w:r>
         <w:rPr>
@@ -23086,13 +22934,7 @@
         <w:rPr>
           <w:rFonts w:ascii="Aptos" w:hAnsi="Aptos"/>
         </w:rPr>
-        <w:t xml:space="preserve"> </w:t>
-      </w:r>
-      <w:r>
-        <w:rPr>
-          <w:rFonts w:ascii="Aptos" w:hAnsi="Aptos"/>
-        </w:rPr>
-        <w:t>C</w:t>
+        <w:t xml:space="preserve"> C</w:t>
       </w:r>
       <w:r>
         <w:rPr>
@@ -23104,13 +22946,7 @@
         <w:rPr>
           <w:rFonts w:ascii="Aptos" w:hAnsi="Aptos"/>
         </w:rPr>
-        <w:t xml:space="preserve">loud fraction changes </w:t>
-      </w:r>
-      <w:r>
-        <w:rPr>
-          <w:rFonts w:ascii="Aptos" w:hAnsi="Aptos"/>
-        </w:rPr>
-        <w:t xml:space="preserve">as </w:t>
+        <w:t xml:space="preserve">loud fraction changes as </w:t>
       </w:r>
       <m:oMath>
         <m:sSub>
@@ -27306,19 +27142,7 @@
         <w:rPr>
           <w:rFonts w:ascii="Aptos" w:eastAsiaTheme="minorEastAsia" w:hAnsi="Aptos"/>
         </w:rPr>
-        <w:t xml:space="preserve"> </w:t>
-      </w:r>
-      <w:r>
-        <w:rPr>
-          <w:rFonts w:ascii="Aptos" w:eastAsiaTheme="minorEastAsia" w:hAnsi="Aptos"/>
-        </w:rPr>
-        <w:t>surface RH is constant</w:t>
-      </w:r>
-      <w:r>
-        <w:rPr>
-          <w:rFonts w:ascii="Aptos" w:eastAsiaTheme="minorEastAsia" w:hAnsi="Aptos"/>
-        </w:rPr>
-        <w:t xml:space="preserve"> and</w:t>
+        <w:t xml:space="preserve"> surface RH is constant and</w:t>
       </w:r>
       <w:r>
         <w:rPr>
@@ -27975,42 +27799,7 @@
           <w:rFonts w:ascii="Aptos" w:eastAsiaTheme="minorEastAsia" w:hAnsi="Aptos"/>
           <w:iCs/>
         </w:rPr>
-        <w:t xml:space="preserve"> </w:t>
-      </w:r>
-      <w:r>
-        <w:rPr>
-          <w:rFonts w:ascii="Aptos" w:eastAsiaTheme="minorEastAsia" w:hAnsi="Aptos"/>
-          <w:iCs/>
-        </w:rPr>
-        <w:t>a</w:t>
-      </w:r>
-      <w:r>
-        <w:rPr>
-          <w:rFonts w:ascii="Aptos" w:eastAsiaTheme="minorEastAsia" w:hAnsi="Aptos"/>
-          <w:iCs/>
-        </w:rPr>
-        <w:t>re</w:t>
-      </w:r>
-      <w:r>
-        <w:rPr>
-          <w:rFonts w:ascii="Aptos" w:eastAsiaTheme="minorEastAsia" w:hAnsi="Aptos"/>
-          <w:iCs/>
-        </w:rPr>
-        <w:t xml:space="preserve"> </w:t>
-      </w:r>
-      <w:r>
-        <w:rPr>
-          <w:rFonts w:ascii="Aptos" w:eastAsiaTheme="minorEastAsia" w:hAnsi="Aptos"/>
-          <w:iCs/>
-        </w:rPr>
-        <w:t xml:space="preserve">monotonic with </w:t>
-      </w:r>
-      <w:r>
-        <w:rPr>
-          <w:rFonts w:ascii="Aptos" w:eastAsiaTheme="minorEastAsia" w:hAnsi="Aptos"/>
-          <w:iCs/>
-        </w:rPr>
-        <w:t xml:space="preserve">the sensitivity </w:t>
+        <w:t xml:space="preserve"> are monotonic with the sensitivity </w:t>
       </w:r>
       <m:oMath>
         <m:r>
@@ -28025,41 +27814,14 @@
           <w:rFonts w:ascii="Aptos" w:eastAsiaTheme="minorEastAsia" w:hAnsi="Aptos"/>
           <w:iCs/>
         </w:rPr>
-        <w:t xml:space="preserve"> </w:t>
-      </w:r>
-      <w:r>
-        <w:rPr>
-          <w:rFonts w:ascii="Aptos" w:eastAsiaTheme="minorEastAsia" w:hAnsi="Aptos"/>
-          <w:iCs/>
-        </w:rPr>
-        <w:t>to cloud base saturation deficit</w:t>
-      </w:r>
-      <w:r>
-        <w:rPr>
-          <w:rFonts w:ascii="Aptos" w:eastAsiaTheme="minorEastAsia" w:hAnsi="Aptos"/>
-          <w:iCs/>
-        </w:rPr>
-        <w:t xml:space="preserve"> and symmetric about</w:t>
-      </w:r>
-      <w:r>
-        <w:rPr>
-          <w:rFonts w:ascii="Aptos" w:eastAsiaTheme="minorEastAsia" w:hAnsi="Aptos"/>
-          <w:iCs/>
-        </w:rPr>
-        <w:t xml:space="preserve"> </w:t>
+        <w:t xml:space="preserve"> to cloud base saturation deficit and symmetric about </w:t>
       </w:r>
       <m:oMath>
         <m:r>
           <w:rPr>
             <w:rFonts w:ascii="Cambria Math" w:eastAsiaTheme="minorEastAsia" w:hAnsi="Cambria Math"/>
           </w:rPr>
-          <m:t>b</m:t>
-        </m:r>
-        <m:r>
-          <w:rPr>
-            <w:rFonts w:ascii="Cambria Math" w:eastAsiaTheme="minorEastAsia" w:hAnsi="Cambria Math"/>
-          </w:rPr>
-          <m:t>=1/2</m:t>
+          <m:t>b=1/2</m:t>
         </m:r>
       </m:oMath>
       <w:r>
@@ -28106,19 +27868,7 @@
         <w:rPr>
           <w:rFonts w:ascii="Aptos" w:eastAsiaTheme="minorEastAsia" w:hAnsi="Aptos"/>
         </w:rPr>
-        <w:t>,</w:t>
-      </w:r>
-      <w:r>
-        <w:rPr>
-          <w:rFonts w:ascii="Aptos" w:eastAsiaTheme="minorEastAsia" w:hAnsi="Aptos"/>
-        </w:rPr>
-        <w:t xml:space="preserve"> </w:t>
-      </w:r>
-      <w:r>
-        <w:rPr>
-          <w:rFonts w:ascii="Aptos" w:eastAsiaTheme="minorEastAsia" w:hAnsi="Aptos"/>
-        </w:rPr>
-        <w:t xml:space="preserve">increasing mean RH and narrowing its standard deviation </w:t>
+        <w:t xml:space="preserve">, increasing mean RH and narrowing its standard deviation </w:t>
       </w:r>
       <m:oMath>
         <m:sSub>
@@ -28152,19 +27902,7 @@
         <w:rPr>
           <w:rFonts w:ascii="Aptos" w:eastAsiaTheme="minorEastAsia" w:hAnsi="Aptos"/>
         </w:rPr>
-        <w:t xml:space="preserve"> perfectly </w:t>
-      </w:r>
-      <w:r>
-        <w:rPr>
-          <w:rFonts w:ascii="Aptos" w:eastAsiaTheme="minorEastAsia" w:hAnsi="Aptos"/>
-        </w:rPr>
-        <w:t>balance</w:t>
-      </w:r>
-      <w:r>
-        <w:rPr>
-          <w:rFonts w:ascii="Aptos" w:eastAsiaTheme="minorEastAsia" w:hAnsi="Aptos"/>
-        </w:rPr>
-        <w:t>, and there is no change in cloud base cloud fraction.</w:t>
+        <w:t xml:space="preserve"> perfectly balance, and there is no change in cloud base cloud fraction.</w:t>
       </w:r>
     </w:p>
     <w:p>
@@ -28383,13 +28121,7 @@
           <w:rPr>
             <w:rFonts w:ascii="Cambria Math" w:eastAsiaTheme="minorEastAsia" w:hAnsi="Cambria Math"/>
           </w:rPr>
-          <m:t>=-3.2</m:t>
-        </m:r>
-        <m:r>
-          <w:rPr>
-            <w:rFonts w:ascii="Cambria Math" w:eastAsiaTheme="minorEastAsia" w:hAnsi="Cambria Math"/>
-          </w:rPr>
-          <m:t>d</m:t>
+          <m:t>=-3.2d</m:t>
         </m:r>
         <m:func>
           <m:funcPr>
@@ -28427,21 +28159,7 @@
           <w:rFonts w:ascii="Aptos" w:eastAsiaTheme="minorEastAsia" w:hAnsi="Aptos"/>
           <w:iCs/>
         </w:rPr>
-        <w:t xml:space="preserve"> </w:t>
-      </w:r>
-      <w:r>
-        <w:rPr>
-          <w:rFonts w:ascii="Aptos" w:eastAsiaTheme="minorEastAsia" w:hAnsi="Aptos"/>
-          <w:iCs/>
-        </w:rPr>
-        <w:t>(Fig. BCSENS</w:t>
-      </w:r>
-      <w:r>
-        <w:rPr>
-          <w:rFonts w:ascii="Aptos" w:eastAsiaTheme="minorEastAsia" w:hAnsi="Aptos"/>
-          <w:iCs/>
-        </w:rPr>
-        <w:t>)</w:t>
+        <w:t xml:space="preserve"> (Fig. BCSENS)</w:t>
       </w:r>
       <w:r>
         <w:rPr>
@@ -29342,13 +29060,7 @@
           <w:rPr>
             <w:rFonts w:ascii="Cambria Math" w:eastAsiaTheme="minorEastAsia" w:hAnsi="Cambria Math"/>
           </w:rPr>
-          <m:t>c=</m:t>
-        </m:r>
-        <m:r>
-          <w:rPr>
-            <w:rFonts w:ascii="Cambria Math" w:eastAsiaTheme="minorEastAsia" w:hAnsi="Cambria Math"/>
-          </w:rPr>
-          <m:t>0</m:t>
+          <m:t>c=0</m:t>
         </m:r>
       </m:oMath>
       <w:r>
@@ -30023,6 +29735,2384 @@
         <w:t>ferences</w:t>
       </w:r>
     </w:p>
+    <w:p>
+      <w:pPr>
+        <w:tabs>
+          <w:tab w:val="left" w:pos="504"/>
+        </w:tabs>
+        <w:autoSpaceDE w:val="0"/>
+        <w:autoSpaceDN w:val="0"/>
+        <w:adjustRightInd w:val="0"/>
+        <w:spacing w:after="240" w:line="240" w:lineRule="auto"/>
+        <w:ind w:left="504" w:hanging="504"/>
+        <w:rPr>
+          <w:rFonts w:ascii="Aptos" w:hAnsi="Aptos" w:cs="Helvetica"/>
+          <w:kern w:val="0"/>
+        </w:rPr>
+      </w:pPr>
+      <w:r>
+        <w:rPr>
+          <w:rFonts w:ascii="Aptos" w:hAnsi="Aptos" w:cs="Helvetica"/>
+          <w:kern w:val="0"/>
+        </w:rPr>
+        <w:t xml:space="preserve">1. </w:t>
+      </w:r>
+      <w:r>
+        <w:rPr>
+          <w:rFonts w:ascii="Aptos" w:hAnsi="Aptos" w:cs="Helvetica"/>
+          <w:kern w:val="0"/>
+        </w:rPr>
+        <w:tab/>
+        <w:t xml:space="preserve">A. L. Albright, B. Stevens, S. Bony, R. Vogel, A New Conceptual Picture of the Trade Wind Transition Layer. </w:t>
+      </w:r>
+      <w:r>
+        <w:rPr>
+          <w:rFonts w:ascii="Aptos" w:hAnsi="Aptos" w:cs="Helvetica"/>
+          <w:i/>
+          <w:iCs/>
+          <w:kern w:val="0"/>
+        </w:rPr>
+        <w:t>Journal of the Atmospheric Sciences</w:t>
+      </w:r>
+      <w:r>
+        <w:rPr>
+          <w:rFonts w:ascii="Aptos" w:hAnsi="Aptos" w:cs="Helvetica"/>
+          <w:kern w:val="0"/>
+        </w:rPr>
+        <w:t xml:space="preserve"> </w:t>
+      </w:r>
+      <w:r>
+        <w:rPr>
+          <w:rFonts w:ascii="Aptos" w:hAnsi="Aptos" w:cs="Helvetica"/>
+          <w:b/>
+          <w:bCs/>
+          <w:kern w:val="0"/>
+        </w:rPr>
+        <w:t>80</w:t>
+      </w:r>
+      <w:r>
+        <w:rPr>
+          <w:rFonts w:ascii="Aptos" w:hAnsi="Aptos" w:cs="Helvetica"/>
+          <w:kern w:val="0"/>
+        </w:rPr>
+        <w:t>, 1547–1563 (2023).</w:t>
+      </w:r>
+    </w:p>
+    <w:p>
+      <w:pPr>
+        <w:tabs>
+          <w:tab w:val="left" w:pos="504"/>
+        </w:tabs>
+        <w:autoSpaceDE w:val="0"/>
+        <w:autoSpaceDN w:val="0"/>
+        <w:adjustRightInd w:val="0"/>
+        <w:spacing w:after="240" w:line="240" w:lineRule="auto"/>
+        <w:ind w:left="504" w:hanging="504"/>
+        <w:rPr>
+          <w:rFonts w:ascii="Aptos" w:hAnsi="Aptos" w:cs="Helvetica"/>
+          <w:kern w:val="0"/>
+        </w:rPr>
+      </w:pPr>
+      <w:r>
+        <w:rPr>
+          <w:rFonts w:ascii="Aptos" w:hAnsi="Aptos" w:cs="Helvetica"/>
+          <w:kern w:val="0"/>
+        </w:rPr>
+        <w:t xml:space="preserve">2. </w:t>
+      </w:r>
+      <w:r>
+        <w:rPr>
+          <w:rFonts w:ascii="Aptos" w:hAnsi="Aptos" w:cs="Helvetica"/>
+          <w:kern w:val="0"/>
+        </w:rPr>
+        <w:tab/>
+        <w:t xml:space="preserve">S. Bony, R. Colman, V. M. Kattsov, R. P. Allan, C. S. Bretherton, J.-L. Dufresne, A. Hall, S. Hallegatte, M. M. Holland, W. Ingram, D. A. Randall, B. J. Soden, G. Tselioudis, M. J. Webb, How Well Do We Understand and Evaluate Climate Change Feedback Processes? </w:t>
+      </w:r>
+      <w:r>
+        <w:rPr>
+          <w:rFonts w:ascii="Aptos" w:hAnsi="Aptos" w:cs="Helvetica"/>
+          <w:i/>
+          <w:iCs/>
+          <w:kern w:val="0"/>
+        </w:rPr>
+        <w:t>Journal of Climate</w:t>
+      </w:r>
+      <w:r>
+        <w:rPr>
+          <w:rFonts w:ascii="Aptos" w:hAnsi="Aptos" w:cs="Helvetica"/>
+          <w:kern w:val="0"/>
+        </w:rPr>
+        <w:t xml:space="preserve"> </w:t>
+      </w:r>
+      <w:r>
+        <w:rPr>
+          <w:rFonts w:ascii="Aptos" w:hAnsi="Aptos" w:cs="Helvetica"/>
+          <w:b/>
+          <w:bCs/>
+          <w:kern w:val="0"/>
+        </w:rPr>
+        <w:t>19</w:t>
+      </w:r>
+      <w:r>
+        <w:rPr>
+          <w:rFonts w:ascii="Aptos" w:hAnsi="Aptos" w:cs="Helvetica"/>
+          <w:kern w:val="0"/>
+        </w:rPr>
+        <w:t>, 3445–3482 (2006).</w:t>
+      </w:r>
+    </w:p>
+    <w:p>
+      <w:pPr>
+        <w:tabs>
+          <w:tab w:val="left" w:pos="504"/>
+        </w:tabs>
+        <w:autoSpaceDE w:val="0"/>
+        <w:autoSpaceDN w:val="0"/>
+        <w:adjustRightInd w:val="0"/>
+        <w:spacing w:after="240" w:line="240" w:lineRule="auto"/>
+        <w:ind w:left="504" w:hanging="504"/>
+        <w:rPr>
+          <w:rFonts w:ascii="Aptos" w:hAnsi="Aptos" w:cs="Helvetica"/>
+          <w:kern w:val="0"/>
+        </w:rPr>
+      </w:pPr>
+      <w:r>
+        <w:rPr>
+          <w:rFonts w:ascii="Aptos" w:hAnsi="Aptos" w:cs="Helvetica"/>
+          <w:kern w:val="0"/>
+        </w:rPr>
+        <w:t xml:space="preserve">3. </w:t>
+      </w:r>
+      <w:r>
+        <w:rPr>
+          <w:rFonts w:ascii="Aptos" w:hAnsi="Aptos" w:cs="Helvetica"/>
+          <w:kern w:val="0"/>
+        </w:rPr>
+        <w:tab/>
+        <w:t xml:space="preserve">S. Bony, J.-L. Dufresne, Marine boundary layer clouds at the heart of tropical cloud feedback uncertainties in climate models. </w:t>
+      </w:r>
+      <w:r>
+        <w:rPr>
+          <w:rFonts w:ascii="Aptos" w:hAnsi="Aptos" w:cs="Helvetica"/>
+          <w:i/>
+          <w:iCs/>
+          <w:kern w:val="0"/>
+        </w:rPr>
+        <w:t>Geophysical Research Letters</w:t>
+      </w:r>
+      <w:r>
+        <w:rPr>
+          <w:rFonts w:ascii="Aptos" w:hAnsi="Aptos" w:cs="Helvetica"/>
+          <w:kern w:val="0"/>
+        </w:rPr>
+        <w:t xml:space="preserve"> </w:t>
+      </w:r>
+      <w:r>
+        <w:rPr>
+          <w:rFonts w:ascii="Aptos" w:hAnsi="Aptos" w:cs="Helvetica"/>
+          <w:b/>
+          <w:bCs/>
+          <w:kern w:val="0"/>
+        </w:rPr>
+        <w:t>32</w:t>
+      </w:r>
+      <w:r>
+        <w:rPr>
+          <w:rFonts w:ascii="Aptos" w:hAnsi="Aptos" w:cs="Helvetica"/>
+          <w:kern w:val="0"/>
+        </w:rPr>
+        <w:t xml:space="preserve"> (2005).</w:t>
+      </w:r>
+    </w:p>
+    <w:p>
+      <w:pPr>
+        <w:tabs>
+          <w:tab w:val="left" w:pos="504"/>
+        </w:tabs>
+        <w:autoSpaceDE w:val="0"/>
+        <w:autoSpaceDN w:val="0"/>
+        <w:adjustRightInd w:val="0"/>
+        <w:spacing w:after="240" w:line="240" w:lineRule="auto"/>
+        <w:ind w:left="504" w:hanging="504"/>
+        <w:rPr>
+          <w:rFonts w:ascii="Aptos" w:hAnsi="Aptos" w:cs="Helvetica"/>
+          <w:kern w:val="0"/>
+        </w:rPr>
+      </w:pPr>
+      <w:r>
+        <w:rPr>
+          <w:rFonts w:ascii="Aptos" w:hAnsi="Aptos" w:cs="Helvetica"/>
+          <w:kern w:val="0"/>
+        </w:rPr>
+        <w:t xml:space="preserve">4. </w:t>
+      </w:r>
+      <w:r>
+        <w:rPr>
+          <w:rFonts w:ascii="Aptos" w:hAnsi="Aptos" w:cs="Helvetica"/>
+          <w:kern w:val="0"/>
+        </w:rPr>
+        <w:tab/>
+        <w:t>S. Bony, M. Lothon, J. Delanoë, P. Coutris, J.-C. Etienne, F. Aemisegger, A. L. Albright, T. André, H. Bellec, A. Baron, J.-F. Bourdinot, P.-E. Brilouet, A. Bourdon, J.-C. Canonici, C. Caudoux, P. Chazette, M. Cluzeau, C. Cornet, J.-P. Desbios, D. Duchanoy, C. Flamant, B. Fildier, C. Gourbeyre, L. Guiraud, T. Jiang, C. Lainard, C. Le Gac, C. Lendroit, J. Lernould, T. Perrin, F. Pouvesle, P. Richard, N. Rochetin, K. Salaün, A. Schwarzenboeck, G. Seurat, B. Stevens, J. Totems, L. Touzé-Peiffer, G. Vergez, J. Vial, L. Villiger, R. Vogel, EUREC</w:t>
+      </w:r>
+      <w:r>
+        <w:rPr>
+          <w:rFonts w:ascii="Aptos" w:hAnsi="Aptos" w:cs="Helvetica"/>
+          <w:kern w:val="0"/>
+          <w:vertAlign w:val="superscript"/>
+        </w:rPr>
+        <w:t>4</w:t>
+      </w:r>
+      <w:r>
+        <w:rPr>
+          <w:rFonts w:ascii="Aptos" w:hAnsi="Aptos" w:cs="Helvetica"/>
+          <w:kern w:val="0"/>
+        </w:rPr>
+        <w:t xml:space="preserve">A observations from the SAFIRE ATR42 aircraft. </w:t>
+      </w:r>
+      <w:r>
+        <w:rPr>
+          <w:rFonts w:ascii="Aptos" w:hAnsi="Aptos" w:cs="Helvetica"/>
+          <w:i/>
+          <w:iCs/>
+          <w:kern w:val="0"/>
+        </w:rPr>
+        <w:t>Earth System Science Data</w:t>
+      </w:r>
+      <w:r>
+        <w:rPr>
+          <w:rFonts w:ascii="Aptos" w:hAnsi="Aptos" w:cs="Helvetica"/>
+          <w:kern w:val="0"/>
+        </w:rPr>
+        <w:t xml:space="preserve"> </w:t>
+      </w:r>
+      <w:r>
+        <w:rPr>
+          <w:rFonts w:ascii="Aptos" w:hAnsi="Aptos" w:cs="Helvetica"/>
+          <w:b/>
+          <w:bCs/>
+          <w:kern w:val="0"/>
+        </w:rPr>
+        <w:t>14</w:t>
+      </w:r>
+      <w:r>
+        <w:rPr>
+          <w:rFonts w:ascii="Aptos" w:hAnsi="Aptos" w:cs="Helvetica"/>
+          <w:kern w:val="0"/>
+        </w:rPr>
+        <w:t>, 2021–2064 (2022).</w:t>
+      </w:r>
+    </w:p>
+    <w:p>
+      <w:pPr>
+        <w:tabs>
+          <w:tab w:val="left" w:pos="504"/>
+        </w:tabs>
+        <w:autoSpaceDE w:val="0"/>
+        <w:autoSpaceDN w:val="0"/>
+        <w:adjustRightInd w:val="0"/>
+        <w:spacing w:after="240" w:line="240" w:lineRule="auto"/>
+        <w:ind w:left="504" w:hanging="504"/>
+        <w:rPr>
+          <w:rFonts w:ascii="Aptos" w:hAnsi="Aptos" w:cs="Helvetica"/>
+          <w:kern w:val="0"/>
+        </w:rPr>
+      </w:pPr>
+      <w:r>
+        <w:rPr>
+          <w:rFonts w:ascii="Aptos" w:hAnsi="Aptos" w:cs="Helvetica"/>
+          <w:kern w:val="0"/>
+        </w:rPr>
+        <w:t xml:space="preserve">5. </w:t>
+      </w:r>
+      <w:r>
+        <w:rPr>
+          <w:rFonts w:ascii="Aptos" w:hAnsi="Aptos" w:cs="Helvetica"/>
+          <w:kern w:val="0"/>
+        </w:rPr>
+        <w:tab/>
+        <w:t xml:space="preserve">C. S. Bretherton, P. N. Blossey, C. R. Jones, Mechanisms of marine low cloud sensitivity to idealized climate perturbations: A single-LES exploration extending the CGILS cases. </w:t>
+      </w:r>
+      <w:r>
+        <w:rPr>
+          <w:rFonts w:ascii="Aptos" w:hAnsi="Aptos" w:cs="Helvetica"/>
+          <w:i/>
+          <w:iCs/>
+          <w:kern w:val="0"/>
+        </w:rPr>
+        <w:t>Journal of Advances in Modeling Earth Systems</w:t>
+      </w:r>
+      <w:r>
+        <w:rPr>
+          <w:rFonts w:ascii="Aptos" w:hAnsi="Aptos" w:cs="Helvetica"/>
+          <w:kern w:val="0"/>
+        </w:rPr>
+        <w:t xml:space="preserve"> </w:t>
+      </w:r>
+      <w:r>
+        <w:rPr>
+          <w:rFonts w:ascii="Aptos" w:hAnsi="Aptos" w:cs="Helvetica"/>
+          <w:b/>
+          <w:bCs/>
+          <w:kern w:val="0"/>
+        </w:rPr>
+        <w:t>5</w:t>
+      </w:r>
+      <w:r>
+        <w:rPr>
+          <w:rFonts w:ascii="Aptos" w:hAnsi="Aptos" w:cs="Helvetica"/>
+          <w:kern w:val="0"/>
+        </w:rPr>
+        <w:t>, 316–337 (2013).</w:t>
+      </w:r>
+    </w:p>
+    <w:p>
+      <w:pPr>
+        <w:tabs>
+          <w:tab w:val="left" w:pos="504"/>
+        </w:tabs>
+        <w:autoSpaceDE w:val="0"/>
+        <w:autoSpaceDN w:val="0"/>
+        <w:adjustRightInd w:val="0"/>
+        <w:spacing w:after="240" w:line="240" w:lineRule="auto"/>
+        <w:ind w:left="504" w:hanging="504"/>
+        <w:rPr>
+          <w:rFonts w:ascii="Aptos" w:hAnsi="Aptos" w:cs="Helvetica"/>
+          <w:kern w:val="0"/>
+        </w:rPr>
+      </w:pPr>
+      <w:r>
+        <w:rPr>
+          <w:rFonts w:ascii="Aptos" w:hAnsi="Aptos" w:cs="Helvetica"/>
+          <w:kern w:val="0"/>
+        </w:rPr>
+        <w:t xml:space="preserve">6. </w:t>
+      </w:r>
+      <w:r>
+        <w:rPr>
+          <w:rFonts w:ascii="Aptos" w:hAnsi="Aptos" w:cs="Helvetica"/>
+          <w:kern w:val="0"/>
+        </w:rPr>
+        <w:tab/>
+        <w:t xml:space="preserve">F. Brient, T. Schneider, Z. Tan, S. Bony, X. Qu, A. Hall, Shallowness of tropical low clouds as a predictor of climate models’ response to warming. </w:t>
+      </w:r>
+      <w:r>
+        <w:rPr>
+          <w:rFonts w:ascii="Aptos" w:hAnsi="Aptos" w:cs="Helvetica"/>
+          <w:i/>
+          <w:iCs/>
+          <w:kern w:val="0"/>
+        </w:rPr>
+        <w:t>Clim Dyn</w:t>
+      </w:r>
+      <w:r>
+        <w:rPr>
+          <w:rFonts w:ascii="Aptos" w:hAnsi="Aptos" w:cs="Helvetica"/>
+          <w:kern w:val="0"/>
+        </w:rPr>
+        <w:t xml:space="preserve"> </w:t>
+      </w:r>
+      <w:r>
+        <w:rPr>
+          <w:rFonts w:ascii="Aptos" w:hAnsi="Aptos" w:cs="Helvetica"/>
+          <w:b/>
+          <w:bCs/>
+          <w:kern w:val="0"/>
+        </w:rPr>
+        <w:t>47</w:t>
+      </w:r>
+      <w:r>
+        <w:rPr>
+          <w:rFonts w:ascii="Aptos" w:hAnsi="Aptos" w:cs="Helvetica"/>
+          <w:kern w:val="0"/>
+        </w:rPr>
+        <w:t>, 433–449 (2016).</w:t>
+      </w:r>
+    </w:p>
+    <w:p>
+      <w:pPr>
+        <w:tabs>
+          <w:tab w:val="left" w:pos="504"/>
+        </w:tabs>
+        <w:autoSpaceDE w:val="0"/>
+        <w:autoSpaceDN w:val="0"/>
+        <w:adjustRightInd w:val="0"/>
+        <w:spacing w:after="240" w:line="240" w:lineRule="auto"/>
+        <w:ind w:left="504" w:hanging="504"/>
+        <w:rPr>
+          <w:rFonts w:ascii="Aptos" w:hAnsi="Aptos" w:cs="Helvetica"/>
+          <w:kern w:val="0"/>
+        </w:rPr>
+      </w:pPr>
+      <w:r>
+        <w:rPr>
+          <w:rFonts w:ascii="Aptos" w:hAnsi="Aptos" w:cs="Helvetica"/>
+          <w:kern w:val="0"/>
+        </w:rPr>
+        <w:t xml:space="preserve">7. </w:t>
+      </w:r>
+      <w:r>
+        <w:rPr>
+          <w:rFonts w:ascii="Aptos" w:hAnsi="Aptos" w:cs="Helvetica"/>
+          <w:kern w:val="0"/>
+        </w:rPr>
+        <w:tab/>
+        <w:t xml:space="preserve">J. A. Coakley, P. Chylek, The Two-Stream Approximation in Radiative Transfer: Including the Angle of the Incident Radiation. </w:t>
+      </w:r>
+      <w:r>
+        <w:rPr>
+          <w:rFonts w:ascii="Aptos" w:hAnsi="Aptos" w:cs="Helvetica"/>
+          <w:i/>
+          <w:iCs/>
+          <w:kern w:val="0"/>
+        </w:rPr>
+        <w:t>Journal of the Atmospheric Sciences</w:t>
+      </w:r>
+      <w:r>
+        <w:rPr>
+          <w:rFonts w:ascii="Aptos" w:hAnsi="Aptos" w:cs="Helvetica"/>
+          <w:kern w:val="0"/>
+        </w:rPr>
+        <w:t xml:space="preserve"> </w:t>
+      </w:r>
+      <w:r>
+        <w:rPr>
+          <w:rFonts w:ascii="Aptos" w:hAnsi="Aptos" w:cs="Helvetica"/>
+          <w:b/>
+          <w:bCs/>
+          <w:kern w:val="0"/>
+        </w:rPr>
+        <w:t>32</w:t>
+      </w:r>
+      <w:r>
+        <w:rPr>
+          <w:rFonts w:ascii="Aptos" w:hAnsi="Aptos" w:cs="Helvetica"/>
+          <w:kern w:val="0"/>
+        </w:rPr>
+        <w:t>, 409–418 (1975).</w:t>
+      </w:r>
+    </w:p>
+    <w:p>
+      <w:pPr>
+        <w:tabs>
+          <w:tab w:val="left" w:pos="504"/>
+        </w:tabs>
+        <w:autoSpaceDE w:val="0"/>
+        <w:autoSpaceDN w:val="0"/>
+        <w:adjustRightInd w:val="0"/>
+        <w:spacing w:after="240" w:line="240" w:lineRule="auto"/>
+        <w:ind w:left="504" w:hanging="504"/>
+        <w:rPr>
+          <w:rFonts w:ascii="Aptos" w:hAnsi="Aptos" w:cs="Helvetica"/>
+          <w:kern w:val="0"/>
+        </w:rPr>
+      </w:pPr>
+      <w:r>
+        <w:rPr>
+          <w:rFonts w:ascii="Aptos" w:hAnsi="Aptos" w:cs="Helvetica"/>
+          <w:kern w:val="0"/>
+        </w:rPr>
+        <w:t xml:space="preserve">8. </w:t>
+      </w:r>
+      <w:r>
+        <w:rPr>
+          <w:rFonts w:ascii="Aptos" w:hAnsi="Aptos" w:cs="Helvetica"/>
+          <w:kern w:val="0"/>
+        </w:rPr>
+        <w:tab/>
+        <w:t xml:space="preserve">I. M. Held, B. J. Soden, Robust Responses of the Hydrological Cycle to Global Warming. </w:t>
+      </w:r>
+      <w:r>
+        <w:rPr>
+          <w:rFonts w:ascii="Aptos" w:hAnsi="Aptos" w:cs="Helvetica"/>
+          <w:i/>
+          <w:iCs/>
+          <w:kern w:val="0"/>
+        </w:rPr>
+        <w:t>J. Climate</w:t>
+      </w:r>
+      <w:r>
+        <w:rPr>
+          <w:rFonts w:ascii="Aptos" w:hAnsi="Aptos" w:cs="Helvetica"/>
+          <w:kern w:val="0"/>
+        </w:rPr>
+        <w:t xml:space="preserve"> </w:t>
+      </w:r>
+      <w:r>
+        <w:rPr>
+          <w:rFonts w:ascii="Aptos" w:hAnsi="Aptos" w:cs="Helvetica"/>
+          <w:b/>
+          <w:bCs/>
+          <w:kern w:val="0"/>
+        </w:rPr>
+        <w:t>19</w:t>
+      </w:r>
+      <w:r>
+        <w:rPr>
+          <w:rFonts w:ascii="Aptos" w:hAnsi="Aptos" w:cs="Helvetica"/>
+          <w:kern w:val="0"/>
+        </w:rPr>
+        <w:t>, 5686–5699 (2006).</w:t>
+      </w:r>
+    </w:p>
+    <w:p>
+      <w:pPr>
+        <w:tabs>
+          <w:tab w:val="left" w:pos="504"/>
+        </w:tabs>
+        <w:autoSpaceDE w:val="0"/>
+        <w:autoSpaceDN w:val="0"/>
+        <w:adjustRightInd w:val="0"/>
+        <w:spacing w:after="240" w:line="240" w:lineRule="auto"/>
+        <w:ind w:left="504" w:hanging="504"/>
+        <w:rPr>
+          <w:rFonts w:ascii="Aptos" w:hAnsi="Aptos" w:cs="Helvetica"/>
+          <w:kern w:val="0"/>
+        </w:rPr>
+      </w:pPr>
+      <w:r>
+        <w:rPr>
+          <w:rFonts w:ascii="Aptos" w:hAnsi="Aptos" w:cs="Helvetica"/>
+          <w:kern w:val="0"/>
+        </w:rPr>
+        <w:t xml:space="preserve">9. </w:t>
+      </w:r>
+      <w:r>
+        <w:rPr>
+          <w:rFonts w:ascii="Aptos" w:hAnsi="Aptos" w:cs="Helvetica"/>
+          <w:kern w:val="0"/>
+        </w:rPr>
+        <w:tab/>
+        <w:t xml:space="preserve">M. Jacob, P. Kollias, F. Ament, V. Schemann, S. Crewell, Multilayer cloud conditions in trade wind shallow cumulus – confronting two ICON model derivatives with airborne observations. </w:t>
+      </w:r>
+      <w:r>
+        <w:rPr>
+          <w:rFonts w:ascii="Aptos" w:hAnsi="Aptos" w:cs="Helvetica"/>
+          <w:i/>
+          <w:iCs/>
+          <w:kern w:val="0"/>
+        </w:rPr>
+        <w:t>Geoscientific Model Development</w:t>
+      </w:r>
+      <w:r>
+        <w:rPr>
+          <w:rFonts w:ascii="Aptos" w:hAnsi="Aptos" w:cs="Helvetica"/>
+          <w:kern w:val="0"/>
+        </w:rPr>
+        <w:t xml:space="preserve"> </w:t>
+      </w:r>
+      <w:r>
+        <w:rPr>
+          <w:rFonts w:ascii="Aptos" w:hAnsi="Aptos" w:cs="Helvetica"/>
+          <w:b/>
+          <w:bCs/>
+          <w:kern w:val="0"/>
+        </w:rPr>
+        <w:t>13</w:t>
+      </w:r>
+      <w:r>
+        <w:rPr>
+          <w:rFonts w:ascii="Aptos" w:hAnsi="Aptos" w:cs="Helvetica"/>
+          <w:kern w:val="0"/>
+        </w:rPr>
+        <w:t>, 5757–5777 (2020).</w:t>
+      </w:r>
+    </w:p>
+    <w:p>
+      <w:pPr>
+        <w:tabs>
+          <w:tab w:val="left" w:pos="504"/>
+        </w:tabs>
+        <w:autoSpaceDE w:val="0"/>
+        <w:autoSpaceDN w:val="0"/>
+        <w:adjustRightInd w:val="0"/>
+        <w:spacing w:after="240" w:line="240" w:lineRule="auto"/>
+        <w:ind w:left="504" w:hanging="504"/>
+        <w:rPr>
+          <w:rFonts w:ascii="Aptos" w:hAnsi="Aptos" w:cs="Helvetica"/>
+          <w:kern w:val="0"/>
+        </w:rPr>
+      </w:pPr>
+      <w:r>
+        <w:rPr>
+          <w:rFonts w:ascii="Aptos" w:hAnsi="Aptos" w:cs="Helvetica"/>
+          <w:kern w:val="0"/>
+        </w:rPr>
+        <w:lastRenderedPageBreak/>
+        <w:t xml:space="preserve">10. </w:t>
+      </w:r>
+      <w:r>
+        <w:rPr>
+          <w:rFonts w:ascii="Aptos" w:hAnsi="Aptos" w:cs="Helvetica"/>
+          <w:kern w:val="0"/>
+        </w:rPr>
+        <w:tab/>
+        <w:t xml:space="preserve">F. Jansson, M. Janssens, J. H. Grönqvist, A. P. Siebesma, F. Glassmeier, J. Attema, V. Azizi, M. Satoh, Y. Sato, H. Schulz, T. Kölling, Cloud Botany: Shallow Cumulus Clouds in an Ensemble of Idealized Large-Domain Large-Eddy Simulations of the Trades. </w:t>
+      </w:r>
+      <w:r>
+        <w:rPr>
+          <w:rFonts w:ascii="Aptos" w:hAnsi="Aptos" w:cs="Helvetica"/>
+          <w:i/>
+          <w:iCs/>
+          <w:kern w:val="0"/>
+        </w:rPr>
+        <w:t>Journal of Advances in Modeling Earth Systems</w:t>
+      </w:r>
+      <w:r>
+        <w:rPr>
+          <w:rFonts w:ascii="Aptos" w:hAnsi="Aptos" w:cs="Helvetica"/>
+          <w:kern w:val="0"/>
+        </w:rPr>
+        <w:t xml:space="preserve"> </w:t>
+      </w:r>
+      <w:r>
+        <w:rPr>
+          <w:rFonts w:ascii="Aptos" w:hAnsi="Aptos" w:cs="Helvetica"/>
+          <w:b/>
+          <w:bCs/>
+          <w:kern w:val="0"/>
+        </w:rPr>
+        <w:t>15</w:t>
+      </w:r>
+      <w:r>
+        <w:rPr>
+          <w:rFonts w:ascii="Aptos" w:hAnsi="Aptos" w:cs="Helvetica"/>
+          <w:kern w:val="0"/>
+        </w:rPr>
+        <w:t>, e2023MS003796 (2023).</w:t>
+      </w:r>
+    </w:p>
+    <w:p>
+      <w:pPr>
+        <w:tabs>
+          <w:tab w:val="left" w:pos="504"/>
+        </w:tabs>
+        <w:autoSpaceDE w:val="0"/>
+        <w:autoSpaceDN w:val="0"/>
+        <w:adjustRightInd w:val="0"/>
+        <w:spacing w:after="240" w:line="240" w:lineRule="auto"/>
+        <w:ind w:left="504" w:hanging="504"/>
+        <w:rPr>
+          <w:rFonts w:ascii="Aptos" w:hAnsi="Aptos" w:cs="Helvetica"/>
+          <w:kern w:val="0"/>
+        </w:rPr>
+      </w:pPr>
+      <w:r>
+        <w:rPr>
+          <w:rFonts w:ascii="Aptos" w:hAnsi="Aptos" w:cs="Helvetica"/>
+          <w:kern w:val="0"/>
+        </w:rPr>
+        <w:t xml:space="preserve">11. </w:t>
+      </w:r>
+      <w:r>
+        <w:rPr>
+          <w:rFonts w:ascii="Aptos" w:hAnsi="Aptos" w:cs="Helvetica"/>
+          <w:kern w:val="0"/>
+        </w:rPr>
+        <w:tab/>
+        <w:t xml:space="preserve">D. Jin, L. Oreopoulos, D. Lee, K.-M. Kim, Cloud Regime Contributions to Recent Changes in Outgoing Radiation: A 22-year Satellite Data Analysis. </w:t>
+      </w:r>
+      <w:r>
+        <w:rPr>
+          <w:rFonts w:ascii="Aptos" w:hAnsi="Aptos" w:cs="Helvetica"/>
+          <w:i/>
+          <w:iCs/>
+          <w:kern w:val="0"/>
+        </w:rPr>
+        <w:t>Journal of Geophysical Research: Atmospheres</w:t>
+      </w:r>
+      <w:r>
+        <w:rPr>
+          <w:rFonts w:ascii="Aptos" w:hAnsi="Aptos" w:cs="Helvetica"/>
+          <w:kern w:val="0"/>
+        </w:rPr>
+        <w:t xml:space="preserve"> </w:t>
+      </w:r>
+      <w:r>
+        <w:rPr>
+          <w:rFonts w:ascii="Aptos" w:hAnsi="Aptos" w:cs="Helvetica"/>
+          <w:b/>
+          <w:bCs/>
+          <w:kern w:val="0"/>
+        </w:rPr>
+        <w:t>131</w:t>
+      </w:r>
+      <w:r>
+        <w:rPr>
+          <w:rFonts w:ascii="Aptos" w:hAnsi="Aptos" w:cs="Helvetica"/>
+          <w:kern w:val="0"/>
+        </w:rPr>
+        <w:t>, e2025JD045207 (2026).</w:t>
+      </w:r>
+    </w:p>
+    <w:p>
+      <w:pPr>
+        <w:tabs>
+          <w:tab w:val="left" w:pos="504"/>
+        </w:tabs>
+        <w:autoSpaceDE w:val="0"/>
+        <w:autoSpaceDN w:val="0"/>
+        <w:adjustRightInd w:val="0"/>
+        <w:spacing w:after="240" w:line="240" w:lineRule="auto"/>
+        <w:ind w:left="504" w:hanging="504"/>
+        <w:rPr>
+          <w:rFonts w:ascii="Aptos" w:hAnsi="Aptos" w:cs="Helvetica"/>
+          <w:kern w:val="0"/>
+        </w:rPr>
+      </w:pPr>
+      <w:r>
+        <w:rPr>
+          <w:rFonts w:ascii="Aptos" w:hAnsi="Aptos" w:cs="Helvetica"/>
+          <w:kern w:val="0"/>
+        </w:rPr>
+        <w:t xml:space="preserve">12. </w:t>
+      </w:r>
+      <w:r>
+        <w:rPr>
+          <w:rFonts w:ascii="Aptos" w:hAnsi="Aptos" w:cs="Helvetica"/>
+          <w:kern w:val="0"/>
+        </w:rPr>
+        <w:tab/>
+        <w:t xml:space="preserve">D. J. Lorenz, E. T. DeWeaver, D. J. Vimont, Evaporation Change and Global Warming: The Role of Net Radiation and Relative Humidity. </w:t>
+      </w:r>
+      <w:r>
+        <w:rPr>
+          <w:rFonts w:ascii="Aptos" w:hAnsi="Aptos" w:cs="Helvetica"/>
+          <w:i/>
+          <w:iCs/>
+          <w:kern w:val="0"/>
+        </w:rPr>
+        <w:t>Journal of Geophysical Research: Atmospheres</w:t>
+      </w:r>
+      <w:r>
+        <w:rPr>
+          <w:rFonts w:ascii="Aptos" w:hAnsi="Aptos" w:cs="Helvetica"/>
+          <w:kern w:val="0"/>
+        </w:rPr>
+        <w:t xml:space="preserve"> </w:t>
+      </w:r>
+      <w:r>
+        <w:rPr>
+          <w:rFonts w:ascii="Aptos" w:hAnsi="Aptos" w:cs="Helvetica"/>
+          <w:b/>
+          <w:bCs/>
+          <w:kern w:val="0"/>
+        </w:rPr>
+        <w:t>115</w:t>
+      </w:r>
+      <w:r>
+        <w:rPr>
+          <w:rFonts w:ascii="Aptos" w:hAnsi="Aptos" w:cs="Helvetica"/>
+          <w:kern w:val="0"/>
+        </w:rPr>
+        <w:t xml:space="preserve"> (2010).</w:t>
+      </w:r>
+    </w:p>
+    <w:p>
+      <w:pPr>
+        <w:tabs>
+          <w:tab w:val="left" w:pos="504"/>
+        </w:tabs>
+        <w:autoSpaceDE w:val="0"/>
+        <w:autoSpaceDN w:val="0"/>
+        <w:adjustRightInd w:val="0"/>
+        <w:spacing w:after="240" w:line="240" w:lineRule="auto"/>
+        <w:ind w:left="504" w:hanging="504"/>
+        <w:rPr>
+          <w:rFonts w:ascii="Aptos" w:hAnsi="Aptos" w:cs="Helvetica"/>
+          <w:kern w:val="0"/>
+        </w:rPr>
+      </w:pPr>
+      <w:r>
+        <w:rPr>
+          <w:rFonts w:ascii="Aptos" w:hAnsi="Aptos" w:cs="Helvetica"/>
+          <w:kern w:val="0"/>
+        </w:rPr>
+        <w:t xml:space="preserve">13. </w:t>
+      </w:r>
+      <w:r>
+        <w:rPr>
+          <w:rFonts w:ascii="Aptos" w:hAnsi="Aptos" w:cs="Helvetica"/>
+          <w:kern w:val="0"/>
+        </w:rPr>
+        <w:tab/>
+        <w:t xml:space="preserve">G. L. Mellor, The Gaussian Cloud Model Relations. </w:t>
+      </w:r>
+      <w:r>
+        <w:rPr>
+          <w:rFonts w:ascii="Aptos" w:hAnsi="Aptos" w:cs="Helvetica"/>
+          <w:i/>
+          <w:iCs/>
+          <w:kern w:val="0"/>
+        </w:rPr>
+        <w:t>Journal of the Atmospheric Sciences</w:t>
+      </w:r>
+      <w:r>
+        <w:rPr>
+          <w:rFonts w:ascii="Aptos" w:hAnsi="Aptos" w:cs="Helvetica"/>
+          <w:kern w:val="0"/>
+        </w:rPr>
+        <w:t xml:space="preserve"> </w:t>
+      </w:r>
+      <w:r>
+        <w:rPr>
+          <w:rFonts w:ascii="Aptos" w:hAnsi="Aptos" w:cs="Helvetica"/>
+          <w:b/>
+          <w:bCs/>
+          <w:kern w:val="0"/>
+        </w:rPr>
+        <w:t>34</w:t>
+      </w:r>
+      <w:r>
+        <w:rPr>
+          <w:rFonts w:ascii="Aptos" w:hAnsi="Aptos" w:cs="Helvetica"/>
+          <w:kern w:val="0"/>
+        </w:rPr>
+        <w:t>, 356–358 (1977).</w:t>
+      </w:r>
+    </w:p>
+    <w:p>
+      <w:pPr>
+        <w:tabs>
+          <w:tab w:val="left" w:pos="504"/>
+        </w:tabs>
+        <w:autoSpaceDE w:val="0"/>
+        <w:autoSpaceDN w:val="0"/>
+        <w:adjustRightInd w:val="0"/>
+        <w:spacing w:after="240" w:line="240" w:lineRule="auto"/>
+        <w:ind w:left="504" w:hanging="504"/>
+        <w:rPr>
+          <w:rFonts w:ascii="Aptos" w:hAnsi="Aptos" w:cs="Helvetica"/>
+          <w:kern w:val="0"/>
+        </w:rPr>
+      </w:pPr>
+      <w:r>
+        <w:rPr>
+          <w:rFonts w:ascii="Aptos" w:hAnsi="Aptos" w:cs="Helvetica"/>
+          <w:kern w:val="0"/>
+        </w:rPr>
+        <w:t xml:space="preserve">14. </w:t>
+      </w:r>
+      <w:r>
+        <w:rPr>
+          <w:rFonts w:ascii="Aptos" w:hAnsi="Aptos" w:cs="Helvetica"/>
+          <w:kern w:val="0"/>
+        </w:rPr>
+        <w:tab/>
+        <w:t xml:space="preserve">Minnis, Patrick, Nguyen, Louis, Palikonda, Rabindra, Heck, Patrick W., Spangenberg, Douglas A., Doelling, David R., Ayers, J. Kirk, Smith, William L., Jr., Khaiyerb, Mandana M., Trepte, Qing Z., Avery, Lance A., Chang, Fu-Lung, Yost, Chris R., Chee, Thad L., Sun-Mack, Szedung, “Near-real time cloud retrievals from operational and research meteorological satellites” in </w:t>
+      </w:r>
+      <w:r>
+        <w:rPr>
+          <w:rFonts w:ascii="Aptos" w:hAnsi="Aptos" w:cs="Helvetica"/>
+          <w:i/>
+          <w:iCs/>
+          <w:kern w:val="0"/>
+        </w:rPr>
+        <w:t>SPIE Europe Remote Sensing 2008</w:t>
+      </w:r>
+      <w:r>
+        <w:rPr>
+          <w:rFonts w:ascii="Aptos" w:hAnsi="Aptos" w:cs="Helvetica"/>
+          <w:kern w:val="0"/>
+        </w:rPr>
+        <w:t xml:space="preserve"> (Cardiff, Wales, UK, 2008; http://satcorps.larc.nasa.gov/site/doc-library/99-Minnis.etal.SPIE.abs.08.pdf).</w:t>
+      </w:r>
+    </w:p>
+    <w:p>
+      <w:pPr>
+        <w:tabs>
+          <w:tab w:val="left" w:pos="504"/>
+        </w:tabs>
+        <w:autoSpaceDE w:val="0"/>
+        <w:autoSpaceDN w:val="0"/>
+        <w:adjustRightInd w:val="0"/>
+        <w:spacing w:after="240" w:line="240" w:lineRule="auto"/>
+        <w:ind w:left="504" w:hanging="504"/>
+        <w:rPr>
+          <w:rFonts w:ascii="Aptos" w:hAnsi="Aptos" w:cs="Helvetica"/>
+          <w:kern w:val="0"/>
+        </w:rPr>
+      </w:pPr>
+      <w:r>
+        <w:rPr>
+          <w:rFonts w:ascii="Aptos" w:hAnsi="Aptos" w:cs="Helvetica"/>
+          <w:kern w:val="0"/>
+        </w:rPr>
+        <w:t xml:space="preserve">15. </w:t>
+      </w:r>
+      <w:r>
+        <w:rPr>
+          <w:rFonts w:ascii="Aptos" w:hAnsi="Aptos" w:cs="Helvetica"/>
+          <w:kern w:val="0"/>
+        </w:rPr>
+        <w:tab/>
+        <w:t xml:space="preserve">T. A. Myers, J. R. Norris, Observational Evidence That Enhanced Subsidence Reduces Subtropical Marine Boundary Layer Cloudiness. </w:t>
+      </w:r>
+      <w:r>
+        <w:rPr>
+          <w:rFonts w:ascii="Aptos" w:hAnsi="Aptos" w:cs="Helvetica"/>
+          <w:i/>
+          <w:iCs/>
+          <w:kern w:val="0"/>
+        </w:rPr>
+        <w:t>Journal of Climate</w:t>
+      </w:r>
+      <w:r>
+        <w:rPr>
+          <w:rFonts w:ascii="Aptos" w:hAnsi="Aptos" w:cs="Helvetica"/>
+          <w:kern w:val="0"/>
+        </w:rPr>
+        <w:t xml:space="preserve"> </w:t>
+      </w:r>
+      <w:r>
+        <w:rPr>
+          <w:rFonts w:ascii="Aptos" w:hAnsi="Aptos" w:cs="Helvetica"/>
+          <w:b/>
+          <w:bCs/>
+          <w:kern w:val="0"/>
+        </w:rPr>
+        <w:t>26</w:t>
+      </w:r>
+      <w:r>
+        <w:rPr>
+          <w:rFonts w:ascii="Aptos" w:hAnsi="Aptos" w:cs="Helvetica"/>
+          <w:kern w:val="0"/>
+        </w:rPr>
+        <w:t>, 7507–7524 (2013).</w:t>
+      </w:r>
+    </w:p>
+    <w:p>
+      <w:pPr>
+        <w:tabs>
+          <w:tab w:val="left" w:pos="504"/>
+        </w:tabs>
+        <w:autoSpaceDE w:val="0"/>
+        <w:autoSpaceDN w:val="0"/>
+        <w:adjustRightInd w:val="0"/>
+        <w:spacing w:after="240" w:line="240" w:lineRule="auto"/>
+        <w:ind w:left="504" w:hanging="504"/>
+        <w:rPr>
+          <w:rFonts w:ascii="Aptos" w:hAnsi="Aptos" w:cs="Helvetica"/>
+          <w:kern w:val="0"/>
+        </w:rPr>
+      </w:pPr>
+      <w:r>
+        <w:rPr>
+          <w:rFonts w:ascii="Aptos" w:hAnsi="Aptos" w:cs="Helvetica"/>
+          <w:kern w:val="0"/>
+        </w:rPr>
+        <w:t xml:space="preserve">16. </w:t>
+      </w:r>
+      <w:r>
+        <w:rPr>
+          <w:rFonts w:ascii="Aptos" w:hAnsi="Aptos" w:cs="Helvetica"/>
+          <w:kern w:val="0"/>
+        </w:rPr>
+        <w:tab/>
+        <w:t xml:space="preserve">L. Nuijens, I. Serikov, L. Hirsch, K. Lonitz, B. Stevens, The distribution and variability of low-level cloud in the North Atlantic trades. </w:t>
+      </w:r>
+      <w:r>
+        <w:rPr>
+          <w:rFonts w:ascii="Aptos" w:hAnsi="Aptos" w:cs="Helvetica"/>
+          <w:i/>
+          <w:iCs/>
+          <w:kern w:val="0"/>
+        </w:rPr>
+        <w:t>Quarterly Journal of the Royal Meteorological Society</w:t>
+      </w:r>
+      <w:r>
+        <w:rPr>
+          <w:rFonts w:ascii="Aptos" w:hAnsi="Aptos" w:cs="Helvetica"/>
+          <w:kern w:val="0"/>
+        </w:rPr>
+        <w:t xml:space="preserve"> </w:t>
+      </w:r>
+      <w:r>
+        <w:rPr>
+          <w:rFonts w:ascii="Aptos" w:hAnsi="Aptos" w:cs="Helvetica"/>
+          <w:b/>
+          <w:bCs/>
+          <w:kern w:val="0"/>
+        </w:rPr>
+        <w:t>140</w:t>
+      </w:r>
+      <w:r>
+        <w:rPr>
+          <w:rFonts w:ascii="Aptos" w:hAnsi="Aptos" w:cs="Helvetica"/>
+          <w:kern w:val="0"/>
+        </w:rPr>
+        <w:t>, 2364–2374 (2014).</w:t>
+      </w:r>
+    </w:p>
+    <w:p>
+      <w:pPr>
+        <w:tabs>
+          <w:tab w:val="left" w:pos="504"/>
+        </w:tabs>
+        <w:autoSpaceDE w:val="0"/>
+        <w:autoSpaceDN w:val="0"/>
+        <w:adjustRightInd w:val="0"/>
+        <w:spacing w:after="240" w:line="240" w:lineRule="auto"/>
+        <w:ind w:left="504" w:hanging="504"/>
+        <w:rPr>
+          <w:rFonts w:ascii="Aptos" w:hAnsi="Aptos" w:cs="Helvetica"/>
+          <w:kern w:val="0"/>
+        </w:rPr>
+      </w:pPr>
+      <w:r>
+        <w:rPr>
+          <w:rFonts w:ascii="Aptos" w:hAnsi="Aptos" w:cs="Helvetica"/>
+          <w:kern w:val="0"/>
+        </w:rPr>
+        <w:t xml:space="preserve">17. </w:t>
+      </w:r>
+      <w:r>
+        <w:rPr>
+          <w:rFonts w:ascii="Aptos" w:hAnsi="Aptos" w:cs="Helvetica"/>
+          <w:kern w:val="0"/>
+        </w:rPr>
+        <w:tab/>
+        <w:t xml:space="preserve">L. Nuijens, B. Medeiros, I. Sandu, M. Ahlgrimm, Observed and modeled patterns of covariability between low-level cloudiness and the structure of the trade-wind layer. </w:t>
+      </w:r>
+      <w:r>
+        <w:rPr>
+          <w:rFonts w:ascii="Aptos" w:hAnsi="Aptos" w:cs="Helvetica"/>
+          <w:i/>
+          <w:iCs/>
+          <w:kern w:val="0"/>
+        </w:rPr>
+        <w:t>Journal of Advances in Modeling Earth Systems</w:t>
+      </w:r>
+      <w:r>
+        <w:rPr>
+          <w:rFonts w:ascii="Aptos" w:hAnsi="Aptos" w:cs="Helvetica"/>
+          <w:kern w:val="0"/>
+        </w:rPr>
+        <w:t xml:space="preserve"> </w:t>
+      </w:r>
+      <w:r>
+        <w:rPr>
+          <w:rFonts w:ascii="Aptos" w:hAnsi="Aptos" w:cs="Helvetica"/>
+          <w:b/>
+          <w:bCs/>
+          <w:kern w:val="0"/>
+        </w:rPr>
+        <w:t>7</w:t>
+      </w:r>
+      <w:r>
+        <w:rPr>
+          <w:rFonts w:ascii="Aptos" w:hAnsi="Aptos" w:cs="Helvetica"/>
+          <w:kern w:val="0"/>
+        </w:rPr>
+        <w:t>, 1741–1764 (2015).</w:t>
+      </w:r>
+    </w:p>
+    <w:p>
+      <w:pPr>
+        <w:tabs>
+          <w:tab w:val="left" w:pos="504"/>
+        </w:tabs>
+        <w:autoSpaceDE w:val="0"/>
+        <w:autoSpaceDN w:val="0"/>
+        <w:adjustRightInd w:val="0"/>
+        <w:spacing w:after="240" w:line="240" w:lineRule="auto"/>
+        <w:ind w:left="504" w:hanging="504"/>
+        <w:rPr>
+          <w:rFonts w:ascii="Aptos" w:hAnsi="Aptos" w:cs="Helvetica"/>
+          <w:kern w:val="0"/>
+        </w:rPr>
+      </w:pPr>
+      <w:r>
+        <w:rPr>
+          <w:rFonts w:ascii="Aptos" w:hAnsi="Aptos" w:cs="Helvetica"/>
+          <w:kern w:val="0"/>
+        </w:rPr>
+        <w:t xml:space="preserve">18. </w:t>
+      </w:r>
+      <w:r>
+        <w:rPr>
+          <w:rFonts w:ascii="Aptos" w:hAnsi="Aptos" w:cs="Helvetica"/>
+          <w:kern w:val="0"/>
+        </w:rPr>
+        <w:tab/>
+        <w:t xml:space="preserve">I. Richter, S.-P. Xie, On the origin of equatorial Atlantic biases in coupled general circulation models. </w:t>
+      </w:r>
+      <w:r>
+        <w:rPr>
+          <w:rFonts w:ascii="Aptos" w:hAnsi="Aptos" w:cs="Helvetica"/>
+          <w:i/>
+          <w:iCs/>
+          <w:kern w:val="0"/>
+        </w:rPr>
+        <w:t>Climate Dynamics</w:t>
+      </w:r>
+      <w:r>
+        <w:rPr>
+          <w:rFonts w:ascii="Aptos" w:hAnsi="Aptos" w:cs="Helvetica"/>
+          <w:kern w:val="0"/>
+        </w:rPr>
+        <w:t xml:space="preserve"> </w:t>
+      </w:r>
+      <w:r>
+        <w:rPr>
+          <w:rFonts w:ascii="Aptos" w:hAnsi="Aptos" w:cs="Helvetica"/>
+          <w:b/>
+          <w:bCs/>
+          <w:kern w:val="0"/>
+        </w:rPr>
+        <w:t>31</w:t>
+      </w:r>
+      <w:r>
+        <w:rPr>
+          <w:rFonts w:ascii="Aptos" w:hAnsi="Aptos" w:cs="Helvetica"/>
+          <w:kern w:val="0"/>
+        </w:rPr>
+        <w:t>, 587–598 (2008).</w:t>
+      </w:r>
+    </w:p>
+    <w:p>
+      <w:pPr>
+        <w:tabs>
+          <w:tab w:val="left" w:pos="504"/>
+        </w:tabs>
+        <w:autoSpaceDE w:val="0"/>
+        <w:autoSpaceDN w:val="0"/>
+        <w:adjustRightInd w:val="0"/>
+        <w:spacing w:after="240" w:line="240" w:lineRule="auto"/>
+        <w:ind w:left="504" w:hanging="504"/>
+        <w:rPr>
+          <w:rFonts w:ascii="Aptos" w:hAnsi="Aptos" w:cs="Helvetica"/>
+          <w:kern w:val="0"/>
+        </w:rPr>
+      </w:pPr>
+      <w:r>
+        <w:rPr>
+          <w:rFonts w:ascii="Aptos" w:hAnsi="Aptos" w:cs="Helvetica"/>
+          <w:kern w:val="0"/>
+        </w:rPr>
+        <w:t xml:space="preserve">19. </w:t>
+      </w:r>
+      <w:r>
+        <w:rPr>
+          <w:rFonts w:ascii="Aptos" w:hAnsi="Aptos" w:cs="Helvetica"/>
+          <w:kern w:val="0"/>
+        </w:rPr>
+        <w:tab/>
+        <w:t xml:space="preserve">S. C. Sherwood, S. Bony, J.-L. Dufresne, Spread in model climate sensitivity traced to atmospheric convective mixing. </w:t>
+      </w:r>
+      <w:r>
+        <w:rPr>
+          <w:rFonts w:ascii="Aptos" w:hAnsi="Aptos" w:cs="Helvetica"/>
+          <w:i/>
+          <w:iCs/>
+          <w:kern w:val="0"/>
+        </w:rPr>
+        <w:t>Nature</w:t>
+      </w:r>
+      <w:r>
+        <w:rPr>
+          <w:rFonts w:ascii="Aptos" w:hAnsi="Aptos" w:cs="Helvetica"/>
+          <w:kern w:val="0"/>
+        </w:rPr>
+        <w:t xml:space="preserve"> </w:t>
+      </w:r>
+      <w:r>
+        <w:rPr>
+          <w:rFonts w:ascii="Aptos" w:hAnsi="Aptos" w:cs="Helvetica"/>
+          <w:b/>
+          <w:bCs/>
+          <w:kern w:val="0"/>
+        </w:rPr>
+        <w:t>505</w:t>
+      </w:r>
+      <w:r>
+        <w:rPr>
+          <w:rFonts w:ascii="Aptos" w:hAnsi="Aptos" w:cs="Helvetica"/>
+          <w:kern w:val="0"/>
+        </w:rPr>
+        <w:t>, 37–42 (2014).</w:t>
+      </w:r>
+    </w:p>
+    <w:p>
+      <w:pPr>
+        <w:tabs>
+          <w:tab w:val="left" w:pos="504"/>
+        </w:tabs>
+        <w:autoSpaceDE w:val="0"/>
+        <w:autoSpaceDN w:val="0"/>
+        <w:adjustRightInd w:val="0"/>
+        <w:spacing w:after="240" w:line="240" w:lineRule="auto"/>
+        <w:ind w:left="504" w:hanging="504"/>
+        <w:rPr>
+          <w:rFonts w:ascii="Aptos" w:hAnsi="Aptos" w:cs="Helvetica"/>
+          <w:kern w:val="0"/>
+        </w:rPr>
+      </w:pPr>
+      <w:r>
+        <w:rPr>
+          <w:rFonts w:ascii="Aptos" w:hAnsi="Aptos" w:cs="Helvetica"/>
+          <w:kern w:val="0"/>
+        </w:rPr>
+        <w:t xml:space="preserve">20. </w:t>
+      </w:r>
+      <w:r>
+        <w:rPr>
+          <w:rFonts w:ascii="Aptos" w:hAnsi="Aptos" w:cs="Helvetica"/>
+          <w:kern w:val="0"/>
+        </w:rPr>
+        <w:tab/>
+        <w:t xml:space="preserve">A. P. Siebesma, C. S. Bretherton, A. Brown, A. Chlond, J. Cuxart, P. G. Duynkerke, H. Jiang, M. Khairoutdinov, D. Lewellen, C.-H. Moeng, E. Sanchez, B. Stevens, D. E. Stevens, A Large Eddy Simulation Intercomparison Study of Shallow Cumulus Convection. </w:t>
+      </w:r>
+      <w:r>
+        <w:rPr>
+          <w:rFonts w:ascii="Aptos" w:hAnsi="Aptos" w:cs="Helvetica"/>
+          <w:i/>
+          <w:iCs/>
+          <w:kern w:val="0"/>
+        </w:rPr>
+        <w:t>Journal of the Atmospheric Sciences</w:t>
+      </w:r>
+      <w:r>
+        <w:rPr>
+          <w:rFonts w:ascii="Aptos" w:hAnsi="Aptos" w:cs="Helvetica"/>
+          <w:kern w:val="0"/>
+        </w:rPr>
+        <w:t xml:space="preserve"> </w:t>
+      </w:r>
+      <w:r>
+        <w:rPr>
+          <w:rFonts w:ascii="Aptos" w:hAnsi="Aptos" w:cs="Helvetica"/>
+          <w:b/>
+          <w:bCs/>
+          <w:kern w:val="0"/>
+        </w:rPr>
+        <w:t>60</w:t>
+      </w:r>
+      <w:r>
+        <w:rPr>
+          <w:rFonts w:ascii="Aptos" w:hAnsi="Aptos" w:cs="Helvetica"/>
+          <w:kern w:val="0"/>
+        </w:rPr>
+        <w:t>, 1201–1219 (2003).</w:t>
+      </w:r>
+    </w:p>
+    <w:p>
+      <w:pPr>
+        <w:tabs>
+          <w:tab w:val="left" w:pos="504"/>
+        </w:tabs>
+        <w:autoSpaceDE w:val="0"/>
+        <w:autoSpaceDN w:val="0"/>
+        <w:adjustRightInd w:val="0"/>
+        <w:spacing w:after="240" w:line="240" w:lineRule="auto"/>
+        <w:ind w:left="504" w:hanging="504"/>
+        <w:rPr>
+          <w:rFonts w:ascii="Aptos" w:hAnsi="Aptos" w:cs="Helvetica"/>
+          <w:kern w:val="0"/>
+        </w:rPr>
+      </w:pPr>
+      <w:r>
+        <w:rPr>
+          <w:rFonts w:ascii="Aptos" w:hAnsi="Aptos" w:cs="Helvetica"/>
+          <w:kern w:val="0"/>
+        </w:rPr>
+        <w:lastRenderedPageBreak/>
+        <w:t xml:space="preserve">21. </w:t>
+      </w:r>
+      <w:r>
+        <w:rPr>
+          <w:rFonts w:ascii="Aptos" w:hAnsi="Aptos" w:cs="Helvetica"/>
+          <w:kern w:val="0"/>
+        </w:rPr>
+        <w:tab/>
+        <w:t xml:space="preserve">G. Sommeria, J. Deardorff, Subgrid-scale condensation in models of nonprecipitating clouds. </w:t>
+      </w:r>
+      <w:r>
+        <w:rPr>
+          <w:rFonts w:ascii="Aptos" w:hAnsi="Aptos" w:cs="Helvetica"/>
+          <w:i/>
+          <w:iCs/>
+          <w:kern w:val="0"/>
+        </w:rPr>
+        <w:t>Journal of the Atmospheric Sciences</w:t>
+      </w:r>
+      <w:r>
+        <w:rPr>
+          <w:rFonts w:ascii="Aptos" w:hAnsi="Aptos" w:cs="Helvetica"/>
+          <w:kern w:val="0"/>
+        </w:rPr>
+        <w:t xml:space="preserve"> </w:t>
+      </w:r>
+      <w:r>
+        <w:rPr>
+          <w:rFonts w:ascii="Aptos" w:hAnsi="Aptos" w:cs="Helvetica"/>
+          <w:b/>
+          <w:bCs/>
+          <w:kern w:val="0"/>
+        </w:rPr>
+        <w:t>34</w:t>
+      </w:r>
+      <w:r>
+        <w:rPr>
+          <w:rFonts w:ascii="Aptos" w:hAnsi="Aptos" w:cs="Helvetica"/>
+          <w:kern w:val="0"/>
+        </w:rPr>
+        <w:t>, 344–355 (1977).</w:t>
+      </w:r>
+    </w:p>
+    <w:p>
+      <w:pPr>
+        <w:tabs>
+          <w:tab w:val="left" w:pos="504"/>
+        </w:tabs>
+        <w:autoSpaceDE w:val="0"/>
+        <w:autoSpaceDN w:val="0"/>
+        <w:adjustRightInd w:val="0"/>
+        <w:spacing w:after="240" w:line="240" w:lineRule="auto"/>
+        <w:ind w:left="504" w:hanging="504"/>
+        <w:rPr>
+          <w:rFonts w:ascii="Aptos" w:hAnsi="Aptos" w:cs="Helvetica"/>
+          <w:kern w:val="0"/>
+        </w:rPr>
+      </w:pPr>
+      <w:r>
+        <w:rPr>
+          <w:rFonts w:ascii="Aptos" w:hAnsi="Aptos" w:cs="Helvetica"/>
+          <w:kern w:val="0"/>
+        </w:rPr>
+        <w:t xml:space="preserve">22. </w:t>
+      </w:r>
+      <w:r>
+        <w:rPr>
+          <w:rFonts w:ascii="Aptos" w:hAnsi="Aptos" w:cs="Helvetica"/>
+          <w:kern w:val="0"/>
+        </w:rPr>
+        <w:tab/>
+        <w:t xml:space="preserve">C. C. Stephan, Mechanism for the Formation of Arc-Shaped Cloud Lines over the Tropical Oceans. </w:t>
+      </w:r>
+      <w:r>
+        <w:rPr>
+          <w:rFonts w:ascii="Aptos" w:hAnsi="Aptos" w:cs="Helvetica"/>
+          <w:i/>
+          <w:iCs/>
+          <w:kern w:val="0"/>
+        </w:rPr>
+        <w:t>Journal of the Atmospheric Sciences</w:t>
+      </w:r>
+      <w:r>
+        <w:rPr>
+          <w:rFonts w:ascii="Aptos" w:hAnsi="Aptos" w:cs="Helvetica"/>
+          <w:kern w:val="0"/>
+        </w:rPr>
+        <w:t xml:space="preserve"> </w:t>
+      </w:r>
+      <w:r>
+        <w:rPr>
+          <w:rFonts w:ascii="Aptos" w:hAnsi="Aptos" w:cs="Helvetica"/>
+          <w:b/>
+          <w:bCs/>
+          <w:kern w:val="0"/>
+        </w:rPr>
+        <w:t>78</w:t>
+      </w:r>
+      <w:r>
+        <w:rPr>
+          <w:rFonts w:ascii="Aptos" w:hAnsi="Aptos" w:cs="Helvetica"/>
+          <w:kern w:val="0"/>
+        </w:rPr>
+        <w:t>, 817–824 (2021).</w:t>
+      </w:r>
+    </w:p>
+    <w:p>
+      <w:pPr>
+        <w:tabs>
+          <w:tab w:val="left" w:pos="504"/>
+        </w:tabs>
+        <w:autoSpaceDE w:val="0"/>
+        <w:autoSpaceDN w:val="0"/>
+        <w:adjustRightInd w:val="0"/>
+        <w:spacing w:after="240" w:line="240" w:lineRule="auto"/>
+        <w:ind w:left="504" w:hanging="504"/>
+        <w:rPr>
+          <w:rFonts w:ascii="Aptos" w:hAnsi="Aptos" w:cs="Helvetica"/>
+          <w:kern w:val="0"/>
+        </w:rPr>
+      </w:pPr>
+      <w:r>
+        <w:rPr>
+          <w:rFonts w:ascii="Aptos" w:hAnsi="Aptos" w:cs="Helvetica"/>
+          <w:kern w:val="0"/>
+        </w:rPr>
+        <w:t xml:space="preserve">23. </w:t>
+      </w:r>
+      <w:r>
+        <w:rPr>
+          <w:rFonts w:ascii="Aptos" w:hAnsi="Aptos" w:cs="Helvetica"/>
+          <w:kern w:val="0"/>
+        </w:rPr>
+        <w:tab/>
+        <w:t>C. C. Stephan, S. Schnitt, H. Schulz, H. Bellenger, S. P. de Szoeke, C. Acquistapace, K. Baier, T. Dauhut, R. Laxenaire, Y. Morfa-Avalos, R. Person, E. Quiñones Meléndez, G. Bagheri, T. Böck, A. Daley, J. Güttler, K. C. Helfer, S. A. Los, A. Neuberger, J. Röttenbacher, A. Raeke, M. Ringel, M. Ritschel, P. Sadoulet, I. Schirmacher, M. K. Stolla, E. Wright, B. Charpentier, A. Doerenbecher, R. Wilson, F. Jansen, S. Kinne, G. Reverdin, S. Speich, S. Bony, B. Stevens, Ship- and island-based atmospheric soundings from the 2020 EUREC</w:t>
+      </w:r>
+      <w:r>
+        <w:rPr>
+          <w:rFonts w:ascii="Aptos" w:hAnsi="Aptos" w:cs="Helvetica"/>
+          <w:kern w:val="0"/>
+          <w:vertAlign w:val="superscript"/>
+        </w:rPr>
+        <w:t>4</w:t>
+      </w:r>
+      <w:r>
+        <w:rPr>
+          <w:rFonts w:ascii="Aptos" w:hAnsi="Aptos" w:cs="Helvetica"/>
+          <w:kern w:val="0"/>
+        </w:rPr>
+        <w:t xml:space="preserve">A field campaign. </w:t>
+      </w:r>
+      <w:r>
+        <w:rPr>
+          <w:rFonts w:ascii="Aptos" w:hAnsi="Aptos" w:cs="Helvetica"/>
+          <w:i/>
+          <w:iCs/>
+          <w:kern w:val="0"/>
+        </w:rPr>
+        <w:t>Earth System Science Data</w:t>
+      </w:r>
+      <w:r>
+        <w:rPr>
+          <w:rFonts w:ascii="Aptos" w:hAnsi="Aptos" w:cs="Helvetica"/>
+          <w:kern w:val="0"/>
+        </w:rPr>
+        <w:t xml:space="preserve"> </w:t>
+      </w:r>
+      <w:r>
+        <w:rPr>
+          <w:rFonts w:ascii="Aptos" w:hAnsi="Aptos" w:cs="Helvetica"/>
+          <w:b/>
+          <w:bCs/>
+          <w:kern w:val="0"/>
+        </w:rPr>
+        <w:t>13</w:t>
+      </w:r>
+      <w:r>
+        <w:rPr>
+          <w:rFonts w:ascii="Aptos" w:hAnsi="Aptos" w:cs="Helvetica"/>
+          <w:kern w:val="0"/>
+        </w:rPr>
+        <w:t>, 491–514 (2021).</w:t>
+      </w:r>
+    </w:p>
+    <w:p>
+      <w:pPr>
+        <w:tabs>
+          <w:tab w:val="left" w:pos="504"/>
+        </w:tabs>
+        <w:autoSpaceDE w:val="0"/>
+        <w:autoSpaceDN w:val="0"/>
+        <w:adjustRightInd w:val="0"/>
+        <w:spacing w:after="240" w:line="240" w:lineRule="auto"/>
+        <w:ind w:left="504" w:hanging="504"/>
+        <w:rPr>
+          <w:rFonts w:ascii="Aptos" w:hAnsi="Aptos" w:cs="Helvetica"/>
+          <w:kern w:val="0"/>
+        </w:rPr>
+      </w:pPr>
+      <w:r>
+        <w:rPr>
+          <w:rFonts w:ascii="Aptos" w:hAnsi="Aptos" w:cs="Helvetica"/>
+          <w:kern w:val="0"/>
+        </w:rPr>
+        <w:t xml:space="preserve">24. </w:t>
+      </w:r>
+      <w:r>
+        <w:rPr>
+          <w:rFonts w:ascii="Aptos" w:hAnsi="Aptos" w:cs="Helvetica"/>
+          <w:kern w:val="0"/>
+        </w:rPr>
+        <w:tab/>
+        <w:t xml:space="preserve">B. Stevens, F. Ament, S. Bony, S. Crewell, F. Ewald, S. Gross, A. Hansen, L. Hirsch, M. Jacob, T. Kölling, H. Konow, B. Mayer, M. Wendisch, M. Wirth, K. Wolf, S. Bakan, M. Bauer-Pfundstein, M. Brueck, J. Delanoë, A. Ehrlich, D. Farrell, M. Forde, F. Gödde, H. Grob, M. Hagen, E. Jäkel, F. Jansen, C. Klepp, M. Klingebiel, M. Mech, G. Peters, M. Rapp, A. A. Wing, T. Zinner, A High-Altitude Long-Range Aircraft Configured as a Cloud Observatory: The NARVAL Expeditions. </w:t>
+      </w:r>
+      <w:r>
+        <w:rPr>
+          <w:rFonts w:ascii="Aptos" w:hAnsi="Aptos" w:cs="Helvetica"/>
+          <w:i/>
+          <w:iCs/>
+          <w:kern w:val="0"/>
+        </w:rPr>
+        <w:t>Bulletin of the American Meteorological Society</w:t>
+      </w:r>
+      <w:r>
+        <w:rPr>
+          <w:rFonts w:ascii="Aptos" w:hAnsi="Aptos" w:cs="Helvetica"/>
+          <w:kern w:val="0"/>
+        </w:rPr>
+        <w:t xml:space="preserve"> </w:t>
+      </w:r>
+      <w:r>
+        <w:rPr>
+          <w:rFonts w:ascii="Aptos" w:hAnsi="Aptos" w:cs="Helvetica"/>
+          <w:b/>
+          <w:bCs/>
+          <w:kern w:val="0"/>
+        </w:rPr>
+        <w:t>100</w:t>
+      </w:r>
+      <w:r>
+        <w:rPr>
+          <w:rFonts w:ascii="Aptos" w:hAnsi="Aptos" w:cs="Helvetica"/>
+          <w:kern w:val="0"/>
+        </w:rPr>
+        <w:t>, 1061–1077 (2019).</w:t>
+      </w:r>
+    </w:p>
+    <w:p>
+      <w:pPr>
+        <w:tabs>
+          <w:tab w:val="left" w:pos="504"/>
+        </w:tabs>
+        <w:autoSpaceDE w:val="0"/>
+        <w:autoSpaceDN w:val="0"/>
+        <w:adjustRightInd w:val="0"/>
+        <w:spacing w:after="240" w:line="240" w:lineRule="auto"/>
+        <w:ind w:left="504" w:hanging="504"/>
+        <w:rPr>
+          <w:rFonts w:ascii="Aptos" w:hAnsi="Aptos" w:cs="Helvetica"/>
+          <w:kern w:val="0"/>
+        </w:rPr>
+      </w:pPr>
+      <w:r>
+        <w:rPr>
+          <w:rFonts w:ascii="Aptos" w:hAnsi="Aptos" w:cs="Helvetica"/>
+          <w:kern w:val="0"/>
+        </w:rPr>
+        <w:t xml:space="preserve">25. </w:t>
+      </w:r>
+      <w:r>
+        <w:rPr>
+          <w:rFonts w:ascii="Aptos" w:hAnsi="Aptos" w:cs="Helvetica"/>
+          <w:kern w:val="0"/>
+        </w:rPr>
+        <w:tab/>
+        <w:t xml:space="preserve">B. Stevens, S. Bony, D. Farrell, F. Ament, A. Blyth, C. Fairall, J. Karstensen, P. K. Quinn, S. Speich, C. Acquistapace, F. Aemisegger, A. L. Albright, H. Bellenger, E. Bodenschatz, K.-A. Caesar, R. Chewitt-Lucas, G. de Boer, J. Delanoë, L. Denby, F. Ewald, B. Fildier, M. Forde, G. George, S. Gross, M. Hagen, A. Hausold, K. J. Heywood, L. Hirsch, M. Jacob, F. Jansen, S. Kinne, D. Klocke, T. Kölling, H. Konow, M. Lothon, W. Mohr, A. K. Naumann, L. Nuijens, L. Olivier, R. Pincus, M. Pöhlker, G. Reverdin, G. Roberts, S. Schnitt, H. Schulz, A. P. Siebesma, C. C. Stephan, P. Sullivan, L. Touzé-Peiffer, J. Vial, R. Vogel, P. Zuidema, N. Alexander, L. Alves, S. Arixi, H. Asmath, G. Bagheri, K. Baier, A. Bailey, D. Baranowski, A. Baron, S. Barrau, P. A. Barrett, F. Batier, A. Behrendt, A. Bendinger, F. Beucher, S. Bigorre, E. Blades, P. Blossey, O. Bock, S. Böing, P. Bosser, D. Bourras, P. Bouruet-Aubertot, K. Bower, P. Branellec, H. Branger, M. Brennek, A. Brewer, P.-E. Brilouet, B. Brügmann, S. A. Buehler, E. Burke, R. Burton, R. Calmer, J.-C. Canonici, X. Carton, G. Cato Jr., J. A. Charles, P. Chazette, Y. Chen, M. T. Chilinski, T. Choularton, P. Chuang, S. Clarke, H. Coe, C. Cornet, P. Coutris, F. Couvreux, S. Crewell, T. Cronin, Z. Cui, Y. Cuypers, A. Daley, G. M. Damerell, T. Dauhut, H. Deneke, J.-P. Desbios, S. Dörner, S. Donner, V. Douet, K. Drushka, M. Dütsch, A. Ehrlich, K. Emanuel, A. Emmanouilidis, J.-C. Etienne, S. Etienne-Leblanc, G. Faure, G. Feingold, L. Ferrero, A. Fix, C. Flamant, P. J. Flatau, G. R. Foltz, L. Forster, I. Furtuna, A. Gadian, J. Galewsky, M. Gallagher, P. Gallimore, C. Gaston, C. Gentemann, N. Geyskens, A. Giez, J. Gollop, I. Gouirand, C. Gourbeyre, D. de Graaf, G. E. de Groot, R. Grosz, J. Güttler, M. Gutleben, K. Hall, G. Harris, K. C. Helfer, D. </w:t>
+      </w:r>
+      <w:r>
+        <w:rPr>
+          <w:rFonts w:ascii="Aptos" w:hAnsi="Aptos" w:cs="Helvetica"/>
+          <w:kern w:val="0"/>
+        </w:rPr>
+        <w:lastRenderedPageBreak/>
+        <w:t>Henze, C. Herbert, B. Holanda, A. Ibanez-Landeta, J. Intrieri, S. Iyer, F. Julien, H. Kalesse, J. Kazil, A. Kellman, A. T. Kidane, U. Kirchner, M. Klingebiel, M. Körner, L. A. Kremper, J. Kretzschmar, O. Krüger, W. Kumala, A. Kurz, P. L’Hégaret, M. Labaste, T. Lachlan-Cope, A. Laing, P. Landschützer, T. Lang, D. Lange, I. Lange, C. Laplace, G. Lavik, R. Laxenaire, C. Le Bihan, M. Leandro, N. Lefevre, M. Lena, D. Lenschow, Q. Li, G. Lloyd, S. Los, N. Losi, O. Lovell, C. Luneau, P. Makuch, S. Malinowski, G. Manta, E. Marinou, N. Marsden, S. Masson, N. Maury, B. Mayer, M. Mayers-Als, C. Mazel, W. McGeary, J. C. McWilliams, M. Mech, M. Mehlmann, A. N. Meroni, T. Mieslinger, A. Minikin, P. Minnett, G. Möller, Y. Morfa Avalos, C. Muller, I. Musat, A. Napoli, A. Neuberger, C. Noisel, D. Noone, F. Nordsiek, J. L. Nowak, L. Oswald, D. J. Parker, C. Peck, R. Person, M. Philippi, A. Plueddemann, C. Pöhlker, V. Pörtge, U. Pöschl, L. Pologne, M. Posyniak, M. Prange, E. Quiñones Meléndez, J. Radtke, K. Ramage, J. Reimann, L. Renault, K. Reus, A. Reyes, J. Ribbe, M. Ringel, M. Ritschel, C. B. Rocha, N. Rochetin, J. Röttenbacher, C. Rollo, H. Royer, P. Sadoulet, L. Saffin, S. Sandiford, I. Sandu, M. Schäfer, V. Schemann, I. Schirmacher, O. Schlenczek, J. Schmidt, M. Schröder, A. Schwarzenboeck, A. Sealy, C. J. Senff, I. Serikov, S. Shohan, E. Siddle, A. Smirnov, F. Späth, B. Spooner, M. K. Stolla, W. Szkółka, S. P. de Szoeke, S. Tarot, E. Tetoni, E. Thompson, J. Thomson, L. Tomassini, J. Totems, A. A. Ubele, L. Villiger, J. von Arx, T. Wagner, A. Walther, B. Webber, M. Wendisch, S. Whitehall, A. Wiltshire, A. A. Wing, M. Wirth, J. Wiskandt, K. Wolf, L. Worbes, E. Wright, V. Wulfmeyer, S. Young, C. Zhang, D. Zhang, F. Ziemen, T. Zinner, M. Zöger, EUREC</w:t>
+      </w:r>
+      <w:r>
+        <w:rPr>
+          <w:rFonts w:ascii="Aptos" w:hAnsi="Aptos" w:cs="Helvetica"/>
+          <w:kern w:val="0"/>
+          <w:vertAlign w:val="superscript"/>
+        </w:rPr>
+        <w:t>4</w:t>
+      </w:r>
+      <w:r>
+        <w:rPr>
+          <w:rFonts w:ascii="Aptos" w:hAnsi="Aptos" w:cs="Helvetica"/>
+          <w:kern w:val="0"/>
+        </w:rPr>
+        <w:t xml:space="preserve">A. </w:t>
+      </w:r>
+      <w:r>
+        <w:rPr>
+          <w:rFonts w:ascii="Aptos" w:hAnsi="Aptos" w:cs="Helvetica"/>
+          <w:i/>
+          <w:iCs/>
+          <w:kern w:val="0"/>
+        </w:rPr>
+        <w:t>Earth System Science Data</w:t>
+      </w:r>
+      <w:r>
+        <w:rPr>
+          <w:rFonts w:ascii="Aptos" w:hAnsi="Aptos" w:cs="Helvetica"/>
+          <w:kern w:val="0"/>
+        </w:rPr>
+        <w:t xml:space="preserve"> </w:t>
+      </w:r>
+      <w:r>
+        <w:rPr>
+          <w:rFonts w:ascii="Aptos" w:hAnsi="Aptos" w:cs="Helvetica"/>
+          <w:b/>
+          <w:bCs/>
+          <w:kern w:val="0"/>
+        </w:rPr>
+        <w:t>13</w:t>
+      </w:r>
+      <w:r>
+        <w:rPr>
+          <w:rFonts w:ascii="Aptos" w:hAnsi="Aptos" w:cs="Helvetica"/>
+          <w:kern w:val="0"/>
+        </w:rPr>
+        <w:t>, 4067–4119 (2021).</w:t>
+      </w:r>
+    </w:p>
+    <w:p>
+      <w:pPr>
+        <w:tabs>
+          <w:tab w:val="left" w:pos="504"/>
+        </w:tabs>
+        <w:autoSpaceDE w:val="0"/>
+        <w:autoSpaceDN w:val="0"/>
+        <w:adjustRightInd w:val="0"/>
+        <w:spacing w:after="240" w:line="240" w:lineRule="auto"/>
+        <w:ind w:left="504" w:hanging="504"/>
+        <w:rPr>
+          <w:rFonts w:ascii="Aptos" w:hAnsi="Aptos" w:cs="Helvetica"/>
+          <w:kern w:val="0"/>
+        </w:rPr>
+      </w:pPr>
+      <w:r>
+        <w:rPr>
+          <w:rFonts w:ascii="Aptos" w:hAnsi="Aptos" w:cs="Helvetica"/>
+          <w:kern w:val="0"/>
+        </w:rPr>
+        <w:t xml:space="preserve">26. </w:t>
+      </w:r>
+      <w:r>
+        <w:rPr>
+          <w:rFonts w:ascii="Aptos" w:hAnsi="Aptos" w:cs="Helvetica"/>
+          <w:kern w:val="0"/>
+        </w:rPr>
+        <w:tab/>
+        <w:t xml:space="preserve">M. Sun, D. R. Doelling, N. G. Loeb, R. C. Scott, J. Wilkins, L. T. Nguyen, P. Mlynczak, Clouds and the Earth’s Radiant Energy System (CERES) FluxByCldTyp Edition 4 Data Product. </w:t>
+      </w:r>
+      <w:r>
+        <w:rPr>
+          <w:rFonts w:ascii="Aptos" w:hAnsi="Aptos" w:cs="Helvetica"/>
+          <w:i/>
+          <w:iCs/>
+          <w:kern w:val="0"/>
+        </w:rPr>
+        <w:t>Journal of Atmospheric and Oceanic Technology</w:t>
+      </w:r>
+      <w:r>
+        <w:rPr>
+          <w:rFonts w:ascii="Aptos" w:hAnsi="Aptos" w:cs="Helvetica"/>
+          <w:kern w:val="0"/>
+        </w:rPr>
+        <w:t xml:space="preserve"> </w:t>
+      </w:r>
+      <w:r>
+        <w:rPr>
+          <w:rFonts w:ascii="Aptos" w:hAnsi="Aptos" w:cs="Helvetica"/>
+          <w:b/>
+          <w:bCs/>
+          <w:kern w:val="0"/>
+        </w:rPr>
+        <w:t>39</w:t>
+      </w:r>
+      <w:r>
+        <w:rPr>
+          <w:rFonts w:ascii="Aptos" w:hAnsi="Aptos" w:cs="Helvetica"/>
+          <w:kern w:val="0"/>
+        </w:rPr>
+        <w:t>, 303–318 (2022).</w:t>
+      </w:r>
+    </w:p>
+    <w:p>
+      <w:pPr>
+        <w:tabs>
+          <w:tab w:val="left" w:pos="504"/>
+        </w:tabs>
+        <w:autoSpaceDE w:val="0"/>
+        <w:autoSpaceDN w:val="0"/>
+        <w:adjustRightInd w:val="0"/>
+        <w:spacing w:after="240" w:line="240" w:lineRule="auto"/>
+        <w:ind w:left="504" w:hanging="504"/>
+        <w:rPr>
+          <w:rFonts w:ascii="Aptos" w:hAnsi="Aptos" w:cs="Helvetica"/>
+          <w:kern w:val="0"/>
+        </w:rPr>
+      </w:pPr>
+      <w:r>
+        <w:rPr>
+          <w:rFonts w:ascii="Aptos" w:hAnsi="Aptos" w:cs="Helvetica"/>
+          <w:kern w:val="0"/>
+        </w:rPr>
+        <w:t xml:space="preserve">27. </w:t>
+      </w:r>
+      <w:r>
+        <w:rPr>
+          <w:rFonts w:ascii="Aptos" w:hAnsi="Aptos" w:cs="Helvetica"/>
+          <w:kern w:val="0"/>
+        </w:rPr>
+        <w:tab/>
+        <w:t xml:space="preserve">F. Tornow, C. Domenech, H. W. Barker, R. Preusker, J. Fischer, Using two-stream theory to capture fluctuations of satellite-perceived TOA SW radiances reflected from clouds over ocean. </w:t>
+      </w:r>
+      <w:r>
+        <w:rPr>
+          <w:rFonts w:ascii="Aptos" w:hAnsi="Aptos" w:cs="Helvetica"/>
+          <w:i/>
+          <w:iCs/>
+          <w:kern w:val="0"/>
+        </w:rPr>
+        <w:t>Atmospheric Measurement Techniques</w:t>
+      </w:r>
+      <w:r>
+        <w:rPr>
+          <w:rFonts w:ascii="Aptos" w:hAnsi="Aptos" w:cs="Helvetica"/>
+          <w:kern w:val="0"/>
+        </w:rPr>
+        <w:t xml:space="preserve"> </w:t>
+      </w:r>
+      <w:r>
+        <w:rPr>
+          <w:rFonts w:ascii="Aptos" w:hAnsi="Aptos" w:cs="Helvetica"/>
+          <w:b/>
+          <w:bCs/>
+          <w:kern w:val="0"/>
+        </w:rPr>
+        <w:t>13</w:t>
+      </w:r>
+      <w:r>
+        <w:rPr>
+          <w:rFonts w:ascii="Aptos" w:hAnsi="Aptos" w:cs="Helvetica"/>
+          <w:kern w:val="0"/>
+        </w:rPr>
+        <w:t>, 3909–3922 (2020).</w:t>
+      </w:r>
+    </w:p>
+    <w:p>
+      <w:pPr>
+        <w:tabs>
+          <w:tab w:val="left" w:pos="504"/>
+        </w:tabs>
+        <w:autoSpaceDE w:val="0"/>
+        <w:autoSpaceDN w:val="0"/>
+        <w:adjustRightInd w:val="0"/>
+        <w:spacing w:after="240" w:line="240" w:lineRule="auto"/>
+        <w:ind w:left="504" w:hanging="504"/>
+        <w:rPr>
+          <w:rFonts w:ascii="Aptos" w:hAnsi="Aptos" w:cs="Helvetica"/>
+          <w:kern w:val="0"/>
+        </w:rPr>
+      </w:pPr>
+      <w:r>
+        <w:rPr>
+          <w:rFonts w:ascii="Aptos" w:hAnsi="Aptos" w:cs="Helvetica"/>
+          <w:kern w:val="0"/>
+        </w:rPr>
+        <w:t xml:space="preserve">28. </w:t>
+      </w:r>
+      <w:r>
+        <w:rPr>
+          <w:rFonts w:ascii="Aptos" w:hAnsi="Aptos" w:cs="Helvetica"/>
+          <w:kern w:val="0"/>
+        </w:rPr>
+        <w:tab/>
+        <w:t xml:space="preserve">G. Tselioudis, W. B. Rossow, C. Jakob, J. Remillard, D. Tropf, Y. Zhang, Evaluation of Clouds, Radiation, and Precipitation in CMIP6 Models Using Global Weather States Derived from ISCCP-H Cloud Property Data. </w:t>
+      </w:r>
+      <w:r>
+        <w:rPr>
+          <w:rFonts w:ascii="Aptos" w:hAnsi="Aptos" w:cs="Helvetica"/>
+          <w:i/>
+          <w:iCs/>
+          <w:kern w:val="0"/>
+        </w:rPr>
+        <w:t>Journal of Climate</w:t>
+      </w:r>
+      <w:r>
+        <w:rPr>
+          <w:rFonts w:ascii="Aptos" w:hAnsi="Aptos" w:cs="Helvetica"/>
+          <w:kern w:val="0"/>
+        </w:rPr>
+        <w:t xml:space="preserve"> </w:t>
+      </w:r>
+      <w:r>
+        <w:rPr>
+          <w:rFonts w:ascii="Aptos" w:hAnsi="Aptos" w:cs="Helvetica"/>
+          <w:b/>
+          <w:bCs/>
+          <w:kern w:val="0"/>
+        </w:rPr>
+        <w:t>34</w:t>
+      </w:r>
+      <w:r>
+        <w:rPr>
+          <w:rFonts w:ascii="Aptos" w:hAnsi="Aptos" w:cs="Helvetica"/>
+          <w:kern w:val="0"/>
+        </w:rPr>
+        <w:t>, 7311–7324 (2021).</w:t>
+      </w:r>
+    </w:p>
+    <w:p>
+      <w:pPr>
+        <w:tabs>
+          <w:tab w:val="left" w:pos="504"/>
+        </w:tabs>
+        <w:autoSpaceDE w:val="0"/>
+        <w:autoSpaceDN w:val="0"/>
+        <w:adjustRightInd w:val="0"/>
+        <w:spacing w:after="240" w:line="240" w:lineRule="auto"/>
+        <w:ind w:left="504" w:hanging="504"/>
+        <w:rPr>
+          <w:rFonts w:ascii="Aptos" w:hAnsi="Aptos" w:cs="Helvetica"/>
+          <w:kern w:val="0"/>
+        </w:rPr>
+      </w:pPr>
+      <w:r>
+        <w:rPr>
+          <w:rFonts w:ascii="Aptos" w:hAnsi="Aptos" w:cs="Helvetica"/>
+          <w:kern w:val="0"/>
+        </w:rPr>
+        <w:t xml:space="preserve">29. </w:t>
+      </w:r>
+      <w:r>
+        <w:rPr>
+          <w:rFonts w:ascii="Aptos" w:hAnsi="Aptos" w:cs="Helvetica"/>
+          <w:kern w:val="0"/>
+        </w:rPr>
+        <w:tab/>
+        <w:t xml:space="preserve">G. A. Vecchi, B. J. Soden, Global Warming and the Weakening of the Tropical Circulation. </w:t>
+      </w:r>
+      <w:r>
+        <w:rPr>
+          <w:rFonts w:ascii="Aptos" w:hAnsi="Aptos" w:cs="Helvetica"/>
+          <w:i/>
+          <w:iCs/>
+          <w:kern w:val="0"/>
+        </w:rPr>
+        <w:t>Journal of Climate</w:t>
+      </w:r>
+      <w:r>
+        <w:rPr>
+          <w:rFonts w:ascii="Aptos" w:hAnsi="Aptos" w:cs="Helvetica"/>
+          <w:kern w:val="0"/>
+        </w:rPr>
+        <w:t xml:space="preserve"> </w:t>
+      </w:r>
+      <w:r>
+        <w:rPr>
+          <w:rFonts w:ascii="Aptos" w:hAnsi="Aptos" w:cs="Helvetica"/>
+          <w:b/>
+          <w:bCs/>
+          <w:kern w:val="0"/>
+        </w:rPr>
+        <w:t>20</w:t>
+      </w:r>
+      <w:r>
+        <w:rPr>
+          <w:rFonts w:ascii="Aptos" w:hAnsi="Aptos" w:cs="Helvetica"/>
+          <w:kern w:val="0"/>
+        </w:rPr>
+        <w:t>, 4316–4340 (2007).</w:t>
+      </w:r>
+    </w:p>
+    <w:p>
+      <w:pPr>
+        <w:tabs>
+          <w:tab w:val="left" w:pos="504"/>
+        </w:tabs>
+        <w:autoSpaceDE w:val="0"/>
+        <w:autoSpaceDN w:val="0"/>
+        <w:adjustRightInd w:val="0"/>
+        <w:spacing w:after="240" w:line="240" w:lineRule="auto"/>
+        <w:ind w:left="504" w:hanging="504"/>
+        <w:rPr>
+          <w:rFonts w:ascii="Aptos" w:hAnsi="Aptos" w:cs="Helvetica"/>
+          <w:kern w:val="0"/>
+        </w:rPr>
+      </w:pPr>
+      <w:r>
+        <w:rPr>
+          <w:rFonts w:ascii="Aptos" w:hAnsi="Aptos" w:cs="Helvetica"/>
+          <w:kern w:val="0"/>
+        </w:rPr>
+        <w:t xml:space="preserve">30. </w:t>
+      </w:r>
+      <w:r>
+        <w:rPr>
+          <w:rFonts w:ascii="Aptos" w:hAnsi="Aptos" w:cs="Helvetica"/>
+          <w:kern w:val="0"/>
+        </w:rPr>
+        <w:tab/>
+        <w:t xml:space="preserve">J. Vial, S. Bony, B. Stevens, R. Vogel, Mechanisms and Model Diversity of Trade-Wind Shallow Cumulus Cloud Feedbacks: A Review. </w:t>
+      </w:r>
+      <w:r>
+        <w:rPr>
+          <w:rFonts w:ascii="Aptos" w:hAnsi="Aptos" w:cs="Helvetica"/>
+          <w:i/>
+          <w:iCs/>
+          <w:kern w:val="0"/>
+        </w:rPr>
+        <w:t>Surv Geophys</w:t>
+      </w:r>
+      <w:r>
+        <w:rPr>
+          <w:rFonts w:ascii="Aptos" w:hAnsi="Aptos" w:cs="Helvetica"/>
+          <w:kern w:val="0"/>
+        </w:rPr>
+        <w:t xml:space="preserve"> </w:t>
+      </w:r>
+      <w:r>
+        <w:rPr>
+          <w:rFonts w:ascii="Aptos" w:hAnsi="Aptos" w:cs="Helvetica"/>
+          <w:b/>
+          <w:bCs/>
+          <w:kern w:val="0"/>
+        </w:rPr>
+        <w:t>38</w:t>
+      </w:r>
+      <w:r>
+        <w:rPr>
+          <w:rFonts w:ascii="Aptos" w:hAnsi="Aptos" w:cs="Helvetica"/>
+          <w:kern w:val="0"/>
+        </w:rPr>
+        <w:t>, 1331–1353 (2017).</w:t>
+      </w:r>
+    </w:p>
+    <w:p>
+      <w:pPr>
+        <w:tabs>
+          <w:tab w:val="left" w:pos="504"/>
+        </w:tabs>
+        <w:autoSpaceDE w:val="0"/>
+        <w:autoSpaceDN w:val="0"/>
+        <w:adjustRightInd w:val="0"/>
+        <w:spacing w:after="240" w:line="240" w:lineRule="auto"/>
+        <w:ind w:left="504" w:hanging="504"/>
+        <w:rPr>
+          <w:rFonts w:ascii="Aptos" w:hAnsi="Aptos" w:cs="Helvetica"/>
+          <w:kern w:val="0"/>
+        </w:rPr>
+      </w:pPr>
+      <w:r>
+        <w:rPr>
+          <w:rFonts w:ascii="Aptos" w:hAnsi="Aptos" w:cs="Helvetica"/>
+          <w:kern w:val="0"/>
+        </w:rPr>
+        <w:t xml:space="preserve">31. </w:t>
+      </w:r>
+      <w:r>
+        <w:rPr>
+          <w:rFonts w:ascii="Aptos" w:hAnsi="Aptos" w:cs="Helvetica"/>
+          <w:kern w:val="0"/>
+        </w:rPr>
+        <w:tab/>
+        <w:t xml:space="preserve">R. Vogel, A. L. Albright, J. Vial, G. George, B. Stevens, S. Bony, Strong cloud–circulation coupling explains weak trade cumulus feedback. </w:t>
+      </w:r>
+      <w:r>
+        <w:rPr>
+          <w:rFonts w:ascii="Aptos" w:hAnsi="Aptos" w:cs="Helvetica"/>
+          <w:i/>
+          <w:iCs/>
+          <w:kern w:val="0"/>
+        </w:rPr>
+        <w:t>Nature</w:t>
+      </w:r>
+      <w:r>
+        <w:rPr>
+          <w:rFonts w:ascii="Aptos" w:hAnsi="Aptos" w:cs="Helvetica"/>
+          <w:kern w:val="0"/>
+        </w:rPr>
+        <w:t xml:space="preserve"> </w:t>
+      </w:r>
+      <w:r>
+        <w:rPr>
+          <w:rFonts w:ascii="Aptos" w:hAnsi="Aptos" w:cs="Helvetica"/>
+          <w:b/>
+          <w:bCs/>
+          <w:kern w:val="0"/>
+        </w:rPr>
+        <w:t>612</w:t>
+      </w:r>
+      <w:r>
+        <w:rPr>
+          <w:rFonts w:ascii="Aptos" w:hAnsi="Aptos" w:cs="Helvetica"/>
+          <w:kern w:val="0"/>
+        </w:rPr>
+        <w:t>, 696–700 (2022).</w:t>
+      </w:r>
+    </w:p>
+    <w:p>
+      <w:pPr>
+        <w:tabs>
+          <w:tab w:val="left" w:pos="504"/>
+        </w:tabs>
+        <w:autoSpaceDE w:val="0"/>
+        <w:autoSpaceDN w:val="0"/>
+        <w:adjustRightInd w:val="0"/>
+        <w:spacing w:after="240" w:line="240" w:lineRule="auto"/>
+        <w:ind w:left="504" w:hanging="504"/>
+        <w:rPr>
+          <w:rFonts w:ascii="Aptos" w:hAnsi="Aptos" w:cs="Helvetica"/>
+          <w:kern w:val="0"/>
+        </w:rPr>
+      </w:pPr>
+      <w:r>
+        <w:rPr>
+          <w:rFonts w:ascii="Aptos" w:hAnsi="Aptos" w:cs="Helvetica"/>
+          <w:kern w:val="0"/>
+        </w:rPr>
+        <w:lastRenderedPageBreak/>
+        <w:t xml:space="preserve">32. </w:t>
+      </w:r>
+      <w:r>
+        <w:rPr>
+          <w:rFonts w:ascii="Aptos" w:hAnsi="Aptos" w:cs="Helvetica"/>
+          <w:kern w:val="0"/>
+        </w:rPr>
+        <w:tab/>
+        <w:t xml:space="preserve">R. Vogel, S. Bony, B. Stevens, Estimating the Shallow Convective Mass Flux from the Subcloud-Layer Mass Budget. </w:t>
+      </w:r>
+      <w:r>
+        <w:rPr>
+          <w:rFonts w:ascii="Aptos" w:hAnsi="Aptos" w:cs="Helvetica"/>
+          <w:i/>
+          <w:iCs/>
+          <w:kern w:val="0"/>
+        </w:rPr>
+        <w:t>Journal of the Atmospheric Sciences</w:t>
+      </w:r>
+      <w:r>
+        <w:rPr>
+          <w:rFonts w:ascii="Aptos" w:hAnsi="Aptos" w:cs="Helvetica"/>
+          <w:kern w:val="0"/>
+        </w:rPr>
+        <w:t xml:space="preserve"> </w:t>
+      </w:r>
+      <w:r>
+        <w:rPr>
+          <w:rFonts w:ascii="Aptos" w:hAnsi="Aptos" w:cs="Helvetica"/>
+          <w:b/>
+          <w:bCs/>
+          <w:kern w:val="0"/>
+        </w:rPr>
+        <w:t>77</w:t>
+      </w:r>
+      <w:r>
+        <w:rPr>
+          <w:rFonts w:ascii="Aptos" w:hAnsi="Aptos" w:cs="Helvetica"/>
+          <w:kern w:val="0"/>
+        </w:rPr>
+        <w:t>, 1559–1574 (2020).</w:t>
+      </w:r>
+    </w:p>
+    <w:p>
+      <w:pPr>
+        <w:tabs>
+          <w:tab w:val="left" w:pos="504"/>
+        </w:tabs>
+        <w:autoSpaceDE w:val="0"/>
+        <w:autoSpaceDN w:val="0"/>
+        <w:adjustRightInd w:val="0"/>
+        <w:spacing w:after="240" w:line="240" w:lineRule="auto"/>
+        <w:ind w:left="504" w:hanging="504"/>
+        <w:rPr>
+          <w:rFonts w:ascii="Aptos" w:hAnsi="Aptos" w:cs="Helvetica"/>
+          <w:kern w:val="0"/>
+        </w:rPr>
+      </w:pPr>
+      <w:r>
+        <w:rPr>
+          <w:rFonts w:ascii="Aptos" w:hAnsi="Aptos" w:cs="Helvetica"/>
+          <w:kern w:val="0"/>
+        </w:rPr>
+        <w:t xml:space="preserve">33. </w:t>
+      </w:r>
+      <w:r>
+        <w:rPr>
+          <w:rFonts w:ascii="Aptos" w:hAnsi="Aptos" w:cs="Helvetica"/>
+          <w:kern w:val="0"/>
+        </w:rPr>
+        <w:tab/>
+        <w:t xml:space="preserve">M. J. Webb, T. Andrews, A. Bodas-Salcedo, S. Bony, C. S. Bretherton, R. Chadwick, H. Chepfer, H. Douville, P. Good, J. E. Kay, S. A. Klein, R. Marchand, B. Medeiros, A. P. Siebesma, C. B. Skinner, B. Stevens, G. Tselioudis, Y. Tsushima, M. Watanabe, The Cloud Feedback Model Intercomparison Project (CFMIP) contribution to CMIP6. </w:t>
+      </w:r>
+      <w:r>
+        <w:rPr>
+          <w:rFonts w:ascii="Aptos" w:hAnsi="Aptos" w:cs="Helvetica"/>
+          <w:i/>
+          <w:iCs/>
+          <w:kern w:val="0"/>
+        </w:rPr>
+        <w:t>Geosci. Model Dev.</w:t>
+      </w:r>
+      <w:r>
+        <w:rPr>
+          <w:rFonts w:ascii="Aptos" w:hAnsi="Aptos" w:cs="Helvetica"/>
+          <w:kern w:val="0"/>
+        </w:rPr>
+        <w:t xml:space="preserve"> </w:t>
+      </w:r>
+      <w:r>
+        <w:rPr>
+          <w:rFonts w:ascii="Aptos" w:hAnsi="Aptos" w:cs="Helvetica"/>
+          <w:b/>
+          <w:bCs/>
+          <w:kern w:val="0"/>
+        </w:rPr>
+        <w:t>10</w:t>
+      </w:r>
+      <w:r>
+        <w:rPr>
+          <w:rFonts w:ascii="Aptos" w:hAnsi="Aptos" w:cs="Helvetica"/>
+          <w:kern w:val="0"/>
+        </w:rPr>
+        <w:t>, 359–384 (2017).</w:t>
+      </w:r>
+    </w:p>
+    <w:p>
+      <w:pPr>
+        <w:tabs>
+          <w:tab w:val="left" w:pos="504"/>
+        </w:tabs>
+        <w:autoSpaceDE w:val="0"/>
+        <w:autoSpaceDN w:val="0"/>
+        <w:adjustRightInd w:val="0"/>
+        <w:spacing w:after="240" w:line="240" w:lineRule="auto"/>
+        <w:ind w:left="504" w:hanging="504"/>
+        <w:rPr>
+          <w:rFonts w:ascii="Aptos" w:hAnsi="Aptos" w:cs="Helvetica"/>
+          <w:kern w:val="0"/>
+        </w:rPr>
+      </w:pPr>
+      <w:r>
+        <w:rPr>
+          <w:rFonts w:ascii="Aptos" w:hAnsi="Aptos" w:cs="Helvetica"/>
+          <w:kern w:val="0"/>
+        </w:rPr>
+        <w:t xml:space="preserve">34. </w:t>
+      </w:r>
+      <w:r>
+        <w:rPr>
+          <w:rFonts w:ascii="Aptos" w:hAnsi="Aptos" w:cs="Helvetica"/>
+          <w:kern w:val="0"/>
+        </w:rPr>
+        <w:tab/>
+        <w:t xml:space="preserve">M. J. Webb, T. Andrews, A. Bodas-Salcedo, S. Bony, C. S. Bretherton, R. Chadwick, H. Chepfer, H. Douville, P. Good, J. E. Kay, S. A. Klein, R. Marchand, B. Medeiros, A. P. Siebesma, C. B. Skinner, B. Stevens, G. Tselioudis, Y. Tsushima, M. Watanabe, The Cloud Feedback Model Intercomparison Project (CFMIP) contribution to CMIP6. </w:t>
+      </w:r>
+      <w:r>
+        <w:rPr>
+          <w:rFonts w:ascii="Aptos" w:hAnsi="Aptos" w:cs="Helvetica"/>
+          <w:i/>
+          <w:iCs/>
+          <w:kern w:val="0"/>
+        </w:rPr>
+        <w:t>Geoscientific Model Development</w:t>
+      </w:r>
+      <w:r>
+        <w:rPr>
+          <w:rFonts w:ascii="Aptos" w:hAnsi="Aptos" w:cs="Helvetica"/>
+          <w:kern w:val="0"/>
+        </w:rPr>
+        <w:t xml:space="preserve"> </w:t>
+      </w:r>
+      <w:r>
+        <w:rPr>
+          <w:rFonts w:ascii="Aptos" w:hAnsi="Aptos" w:cs="Helvetica"/>
+          <w:b/>
+          <w:bCs/>
+          <w:kern w:val="0"/>
+        </w:rPr>
+        <w:t>10</w:t>
+      </w:r>
+      <w:r>
+        <w:rPr>
+          <w:rFonts w:ascii="Aptos" w:hAnsi="Aptos" w:cs="Helvetica"/>
+          <w:kern w:val="0"/>
+        </w:rPr>
+        <w:t>, 359–384 (2017).</w:t>
+      </w:r>
+    </w:p>
+    <w:p>
+      <w:pPr>
+        <w:tabs>
+          <w:tab w:val="left" w:pos="504"/>
+        </w:tabs>
+        <w:autoSpaceDE w:val="0"/>
+        <w:autoSpaceDN w:val="0"/>
+        <w:adjustRightInd w:val="0"/>
+        <w:spacing w:after="240" w:line="240" w:lineRule="auto"/>
+        <w:ind w:left="504" w:hanging="504"/>
+        <w:rPr>
+          <w:rFonts w:ascii="Aptos" w:hAnsi="Aptos" w:cs="Helvetica"/>
+          <w:kern w:val="0"/>
+        </w:rPr>
+      </w:pPr>
+      <w:r>
+        <w:rPr>
+          <w:rFonts w:ascii="Aptos" w:hAnsi="Aptos" w:cs="Helvetica"/>
+          <w:kern w:val="0"/>
+        </w:rPr>
+        <w:t xml:space="preserve">35. </w:t>
+      </w:r>
+      <w:r>
+        <w:rPr>
+          <w:rFonts w:ascii="Aptos" w:hAnsi="Aptos" w:cs="Helvetica"/>
+          <w:kern w:val="0"/>
+        </w:rPr>
+        <w:tab/>
+        <w:t xml:space="preserve">Mark. J. Webb, A. P. Lock, Coupling between subtropical cloud feedback and the local hydrological cycle in a climate model. </w:t>
+      </w:r>
+      <w:r>
+        <w:rPr>
+          <w:rFonts w:ascii="Aptos" w:hAnsi="Aptos" w:cs="Helvetica"/>
+          <w:i/>
+          <w:iCs/>
+          <w:kern w:val="0"/>
+        </w:rPr>
+        <w:t>Clim Dyn</w:t>
+      </w:r>
+      <w:r>
+        <w:rPr>
+          <w:rFonts w:ascii="Aptos" w:hAnsi="Aptos" w:cs="Helvetica"/>
+          <w:kern w:val="0"/>
+        </w:rPr>
+        <w:t xml:space="preserve"> </w:t>
+      </w:r>
+      <w:r>
+        <w:rPr>
+          <w:rFonts w:ascii="Aptos" w:hAnsi="Aptos" w:cs="Helvetica"/>
+          <w:b/>
+          <w:bCs/>
+          <w:kern w:val="0"/>
+        </w:rPr>
+        <w:t>41</w:t>
+      </w:r>
+      <w:r>
+        <w:rPr>
+          <w:rFonts w:ascii="Aptos" w:hAnsi="Aptos" w:cs="Helvetica"/>
+          <w:kern w:val="0"/>
+        </w:rPr>
+        <w:t>, 1923–1939 (2013).</w:t>
+      </w:r>
+    </w:p>
+    <w:p>
+      <w:pPr>
+        <w:tabs>
+          <w:tab w:val="left" w:pos="504"/>
+        </w:tabs>
+        <w:autoSpaceDE w:val="0"/>
+        <w:autoSpaceDN w:val="0"/>
+        <w:adjustRightInd w:val="0"/>
+        <w:spacing w:after="240" w:line="240" w:lineRule="auto"/>
+        <w:ind w:left="504" w:hanging="504"/>
+        <w:rPr>
+          <w:rFonts w:ascii="Aptos" w:hAnsi="Aptos" w:cs="Helvetica"/>
+          <w:kern w:val="0"/>
+        </w:rPr>
+      </w:pPr>
+      <w:r>
+        <w:rPr>
+          <w:rFonts w:ascii="Aptos" w:hAnsi="Aptos" w:cs="Helvetica"/>
+          <w:kern w:val="0"/>
+        </w:rPr>
+        <w:t xml:space="preserve">36. </w:t>
+      </w:r>
+      <w:r>
+        <w:rPr>
+          <w:rFonts w:ascii="Aptos" w:hAnsi="Aptos" w:cs="Helvetica"/>
+          <w:kern w:val="0"/>
+        </w:rPr>
+        <w:tab/>
+        <w:t xml:space="preserve">M. D. Zelinka, S. A. Klein, D. L. Hartmann, Computing and Partitioning Cloud Feedbacks Using Cloud Property Histograms. Part II: Attribution to Changes in Cloud Amount, Altitude, and Optical Depth. </w:t>
+      </w:r>
+      <w:r>
+        <w:rPr>
+          <w:rFonts w:ascii="Aptos" w:hAnsi="Aptos" w:cs="Helvetica"/>
+          <w:i/>
+          <w:iCs/>
+          <w:kern w:val="0"/>
+        </w:rPr>
+        <w:t>Journal of Climate</w:t>
+      </w:r>
+      <w:r>
+        <w:rPr>
+          <w:rFonts w:ascii="Aptos" w:hAnsi="Aptos" w:cs="Helvetica"/>
+          <w:kern w:val="0"/>
+        </w:rPr>
+        <w:t xml:space="preserve"> </w:t>
+      </w:r>
+      <w:r>
+        <w:rPr>
+          <w:rFonts w:ascii="Aptos" w:hAnsi="Aptos" w:cs="Helvetica"/>
+          <w:b/>
+          <w:bCs/>
+          <w:kern w:val="0"/>
+        </w:rPr>
+        <w:t>25</w:t>
+      </w:r>
+      <w:r>
+        <w:rPr>
+          <w:rFonts w:ascii="Aptos" w:hAnsi="Aptos" w:cs="Helvetica"/>
+          <w:kern w:val="0"/>
+        </w:rPr>
+        <w:t>, 3736–3754 (2012).</w:t>
+      </w:r>
+    </w:p>
+    <w:p>
+      <w:pPr>
+        <w:tabs>
+          <w:tab w:val="left" w:pos="504"/>
+        </w:tabs>
+        <w:autoSpaceDE w:val="0"/>
+        <w:autoSpaceDN w:val="0"/>
+        <w:adjustRightInd w:val="0"/>
+        <w:spacing w:after="240" w:line="240" w:lineRule="auto"/>
+        <w:ind w:left="504" w:hanging="504"/>
+        <w:rPr>
+          <w:rFonts w:ascii="Aptos" w:hAnsi="Aptos" w:cs="Helvetica"/>
+          <w:kern w:val="0"/>
+        </w:rPr>
+      </w:pPr>
+      <w:r>
+        <w:rPr>
+          <w:rFonts w:ascii="Aptos" w:hAnsi="Aptos" w:cs="Helvetica"/>
+          <w:kern w:val="0"/>
+        </w:rPr>
+        <w:t xml:space="preserve">37. </w:t>
+      </w:r>
+      <w:r>
+        <w:rPr>
+          <w:rFonts w:ascii="Aptos" w:hAnsi="Aptos" w:cs="Helvetica"/>
+          <w:kern w:val="0"/>
+        </w:rPr>
+        <w:tab/>
+        <w:t xml:space="preserve">M. D. Zelinka, I. Tan, L. Oreopoulos, G. Tselioudis, Detailing cloud property feedbacks with a regime-based decomposition. </w:t>
+      </w:r>
+      <w:r>
+        <w:rPr>
+          <w:rFonts w:ascii="Aptos" w:hAnsi="Aptos" w:cs="Helvetica"/>
+          <w:i/>
+          <w:iCs/>
+          <w:kern w:val="0"/>
+        </w:rPr>
+        <w:t>Clim Dyn</w:t>
+      </w:r>
+      <w:r>
+        <w:rPr>
+          <w:rFonts w:ascii="Aptos" w:hAnsi="Aptos" w:cs="Helvetica"/>
+          <w:kern w:val="0"/>
+        </w:rPr>
+        <w:t xml:space="preserve"> </w:t>
+      </w:r>
+      <w:r>
+        <w:rPr>
+          <w:rFonts w:ascii="Aptos" w:hAnsi="Aptos" w:cs="Helvetica"/>
+          <w:b/>
+          <w:bCs/>
+          <w:kern w:val="0"/>
+        </w:rPr>
+        <w:t>60</w:t>
+      </w:r>
+      <w:r>
+        <w:rPr>
+          <w:rFonts w:ascii="Aptos" w:hAnsi="Aptos" w:cs="Helvetica"/>
+          <w:kern w:val="0"/>
+        </w:rPr>
+        <w:t>, 2983–3003 (2023).</w:t>
+      </w:r>
+    </w:p>
+    <w:p>
+      <w:pPr>
+        <w:rPr>
+          <w:rFonts w:ascii="Aptos" w:hAnsi="Aptos"/>
+        </w:rPr>
+      </w:pPr>
+    </w:p>
     <w:sectPr>
       <w:headerReference w:type="default" r:id="rId18"/>
       <w:footerReference w:type="default" r:id="rId19"/>
@@ -30036,7 +32126,7 @@
 </file>
 
 <file path=word/comments.xml><?xml version="1.0" encoding="utf-8"?>
-<w:comments xmlns:wpc="http://schemas.microsoft.com/office/word/2010/wordprocessingCanvas" xmlns:cx="http://schemas.microsoft.com/office/drawing/2014/chartex" xmlns:cx1="http://schemas.microsoft.com/office/drawing/2015/9/8/chartex" xmlns:cx2="http://schemas.microsoft.com/office/drawing/2015/10/21/chartex" xmlns:cx3="http://schemas.microsoft.com/office/drawing/2016/5/9/chartex" xmlns:cx4="http://schemas.microsoft.com/office/drawing/2016/5/10/chartex" xmlns:cx5="http://schemas.microsoft.com/office/drawing/2016/5/11/chartex" xmlns:cx6="http://schemas.microsoft.com/office/drawing/2016/5/12/chartex" xmlns:cx7="http://schemas.microsoft.com/office/drawing/2016/5/13/chartex" xmlns:cx8="http://schemas.microsoft.com/office/drawing/2016/5/14/chartex" xmlns:mc="http://schemas.openxmlformats.org/markup-compatibility/2006" xmlns:aink="http://schemas.microsoft.com/office/drawing/2016/ink" xmlns:am3d="http://schemas.microsoft.com/office/drawing/2017/model3d" xmlns:o="urn:schemas-microsoft-com:office:office" xmlns:oel="http://schemas.microsoft.com/office/2019/extlst" xmlns:r="http://schemas.openxmlformats.org/officeDocument/2006/relationships" xmlns:m="http://schemas.openxmlformats.org/officeDocument/2006/math" xmlns:v="urn:schemas-microsoft-com:vml" xmlns:wp14="http://schemas.microsoft.com/office/word/2010/wordprocessingDrawing" xmlns:wp="http://schemas.openxmlformats.org/drawingml/2006/wordprocessingDrawing" xmlns:w10="urn:schemas-microsoft-com:office:word" xmlns:w="http://schemas.openxmlformats.org/wordprocessingml/2006/main" xmlns:w14="http://schemas.microsoft.com/office/word/2010/wordml" xmlns:w15="http://schemas.microsoft.com/office/word/2012/wordml" xmlns:w16cex="http://schemas.microsoft.com/office/word/2018/wordml/cex" xmlns:w16cid="http://schemas.microsoft.com/office/word/2016/wordml/cid" xmlns:w16="http://schemas.microsoft.com/office/word/2018/wordml" xmlns:w16du="http://schemas.microsoft.com/office/word/2023/wordml/word16du" xmlns:w16sdtdh="http://schemas.microsoft.com/office/word/2020/wordml/sdtdatahash" xmlns:w16sdtfl="http://schemas.microsoft.com/office/word/2024/wordml/sdtformatlock" xmlns:w16se="http://schemas.microsoft.com/office/word/2015/wordml/symex" xmlns:wpg="http://schemas.microsoft.com/office/word/2010/wordprocessingGroup" xmlns:wpi="http://schemas.microsoft.com/office/word/2010/wordprocessingInk" xmlns:wne="http://schemas.microsoft.com/office/word/2006/wordml" xmlns:wps="http://schemas.microsoft.com/office/word/2010/wordprocessingShape" mc:Ignorable="w14 w15 w16se w16cid w16 w16cex w16sdtdh w16sdtfl w16du wp14">
+<w:comments xmlns:wpc="http://schemas.microsoft.com/office/word/2010/wordprocessingCanvas" xmlns:cx="http://schemas.microsoft.com/office/drawing/2014/chartex" xmlns:cx1="http://schemas.microsoft.com/office/drawing/2015/9/8/chartex" xmlns:cx2="http://schemas.microsoft.com/office/drawing/2015/10/21/chartex" xmlns:cx3="http://schemas.microsoft.com/office/drawing/2016/5/9/chartex" xmlns:cx4="http://schemas.microsoft.com/office/drawing/2016/5/10/chartex" xmlns:cx5="http://schemas.microsoft.com/office/drawing/2016/5/11/chartex" xmlns:cx6="http://schemas.microsoft.com/office/drawing/2016/5/12/chartex" xmlns:cx7="http://schemas.microsoft.com/office/drawing/2016/5/13/chartex" xmlns:cx8="http://schemas.microsoft.com/office/drawing/2016/5/14/chartex" xmlns:mc="http://schemas.openxmlformats.org/markup-compatibility/2006" xmlns:m="http://schemas.openxmlformats.org/officeDocument/2006/math" xmlns:aink="http://schemas.microsoft.com/office/drawing/2016/ink" xmlns:am3d="http://schemas.microsoft.com/office/drawing/2017/model3d" xmlns:oel="http://schemas.microsoft.com/office/2019/extlst" xmlns:r="http://schemas.openxmlformats.org/officeDocument/2006/relationships" xmlns:wp14="http://schemas.microsoft.com/office/word/2010/wordprocessingDrawing" xmlns:wp="http://schemas.openxmlformats.org/drawingml/2006/wordprocessingDrawing" xmlns:wpg="http://schemas.microsoft.com/office/word/2010/wordprocessingGroup" xmlns:wpi="http://schemas.microsoft.com/office/word/2010/wordprocessingInk" xmlns:wps="http://schemas.microsoft.com/office/word/2010/wordprocessingShape" xmlns:o="urn:schemas-microsoft-com:office:office" xmlns:v="urn:schemas-microsoft-com:vml" xmlns:w10="urn:schemas-microsoft-com:office:word" xmlns:w="http://schemas.openxmlformats.org/wordprocessingml/2006/main" xmlns:w14="http://schemas.microsoft.com/office/word/2010/wordml" xmlns:w15="http://schemas.microsoft.com/office/word/2012/wordml" xmlns:w16cex="http://schemas.microsoft.com/office/word/2018/wordml/cex" xmlns:w16cid="http://schemas.microsoft.com/office/word/2016/wordml/cid" xmlns:w16="http://schemas.microsoft.com/office/word/2018/wordml" xmlns:w16sdtdh="http://schemas.microsoft.com/office/word/2020/wordml/sdtdatahash" xmlns:w16sdtfl="http://schemas.microsoft.com/office/word/2024/wordml/sdtformatlock" xmlns:w16se="http://schemas.microsoft.com/office/word/2015/wordml/symex" xmlns:w16du="http://schemas.microsoft.com/office/word/2023/wordml/word16du" xmlns:wne="http://schemas.microsoft.com/office/word/2006/wordml" mc:Ignorable="w14 w15 w16se w16cid w16 w16cex w16sdtdh w16sdtfl w16du wp14">
   <w:comment w:id="4" w:author="Andrea Jenney" w:date="2026-08-06T10:00:00Z" w:initials="AJ">
     <w:p>
       <w:r>
@@ -30416,7 +32506,7 @@
 </file>
 
 <file path=word/commentsExtended.xml><?xml version="1.0" encoding="utf-8"?>
-<w15:commentsEx xmlns:wpc="http://schemas.microsoft.com/office/word/2010/wordprocessingCanvas" xmlns:cx="http://schemas.microsoft.com/office/drawing/2014/chartex" xmlns:cx1="http://schemas.microsoft.com/office/drawing/2015/9/8/chartex" xmlns:cx2="http://schemas.microsoft.com/office/drawing/2015/10/21/chartex" xmlns:cx3="http://schemas.microsoft.com/office/drawing/2016/5/9/chartex" xmlns:cx4="http://schemas.microsoft.com/office/drawing/2016/5/10/chartex" xmlns:cx5="http://schemas.microsoft.com/office/drawing/2016/5/11/chartex" xmlns:cx6="http://schemas.microsoft.com/office/drawing/2016/5/12/chartex" xmlns:cx7="http://schemas.microsoft.com/office/drawing/2016/5/13/chartex" xmlns:cx8="http://schemas.microsoft.com/office/drawing/2016/5/14/chartex" xmlns:mc="http://schemas.openxmlformats.org/markup-compatibility/2006" xmlns:aink="http://schemas.microsoft.com/office/drawing/2016/ink" xmlns:am3d="http://schemas.microsoft.com/office/drawing/2017/model3d" xmlns:o="urn:schemas-microsoft-com:office:office" xmlns:oel="http://schemas.microsoft.com/office/2019/extlst" xmlns:r="http://schemas.openxmlformats.org/officeDocument/2006/relationships" xmlns:m="http://schemas.openxmlformats.org/officeDocument/2006/math" xmlns:v="urn:schemas-microsoft-com:vml" xmlns:wp14="http://schemas.microsoft.com/office/word/2010/wordprocessingDrawing" xmlns:wp="http://schemas.openxmlformats.org/drawingml/2006/wordprocessingDrawing" xmlns:w10="urn:schemas-microsoft-com:office:word" xmlns:w="http://schemas.openxmlformats.org/wordprocessingml/2006/main" xmlns:w14="http://schemas.microsoft.com/office/word/2010/wordml" xmlns:w15="http://schemas.microsoft.com/office/word/2012/wordml" xmlns:w16cex="http://schemas.microsoft.com/office/word/2018/wordml/cex" xmlns:w16cid="http://schemas.microsoft.com/office/word/2016/wordml/cid" xmlns:w16="http://schemas.microsoft.com/office/word/2018/wordml" xmlns:w16du="http://schemas.microsoft.com/office/word/2023/wordml/word16du" xmlns:w16sdtdh="http://schemas.microsoft.com/office/word/2020/wordml/sdtdatahash" xmlns:w16sdtfl="http://schemas.microsoft.com/office/word/2024/wordml/sdtformatlock" xmlns:w16se="http://schemas.microsoft.com/office/word/2015/wordml/symex" xmlns:wpg="http://schemas.microsoft.com/office/word/2010/wordprocessingGroup" xmlns:wpi="http://schemas.microsoft.com/office/word/2010/wordprocessingInk" xmlns:wne="http://schemas.microsoft.com/office/word/2006/wordml" xmlns:wps="http://schemas.microsoft.com/office/word/2010/wordprocessingShape" mc:Ignorable="w14 w15 w16se w16cid w16 w16cex w16sdtdh w16sdtfl w16du wp14">
+<w15:commentsEx xmlns:wpc="http://schemas.microsoft.com/office/word/2010/wordprocessingCanvas" xmlns:cx="http://schemas.microsoft.com/office/drawing/2014/chartex" xmlns:cx1="http://schemas.microsoft.com/office/drawing/2015/9/8/chartex" xmlns:cx2="http://schemas.microsoft.com/office/drawing/2015/10/21/chartex" xmlns:cx3="http://schemas.microsoft.com/office/drawing/2016/5/9/chartex" xmlns:cx4="http://schemas.microsoft.com/office/drawing/2016/5/10/chartex" xmlns:cx5="http://schemas.microsoft.com/office/drawing/2016/5/11/chartex" xmlns:cx6="http://schemas.microsoft.com/office/drawing/2016/5/12/chartex" xmlns:cx7="http://schemas.microsoft.com/office/drawing/2016/5/13/chartex" xmlns:cx8="http://schemas.microsoft.com/office/drawing/2016/5/14/chartex" xmlns:mc="http://schemas.openxmlformats.org/markup-compatibility/2006" xmlns:m="http://schemas.openxmlformats.org/officeDocument/2006/math" xmlns:aink="http://schemas.microsoft.com/office/drawing/2016/ink" xmlns:am3d="http://schemas.microsoft.com/office/drawing/2017/model3d" xmlns:oel="http://schemas.microsoft.com/office/2019/extlst" xmlns:r="http://schemas.openxmlformats.org/officeDocument/2006/relationships" xmlns:wp14="http://schemas.microsoft.com/office/word/2010/wordprocessingDrawing" xmlns:wp="http://schemas.openxmlformats.org/drawingml/2006/wordprocessingDrawing" xmlns:wpg="http://schemas.microsoft.com/office/word/2010/wordprocessingGroup" xmlns:wpi="http://schemas.microsoft.com/office/word/2010/wordprocessingInk" xmlns:wps="http://schemas.microsoft.com/office/word/2010/wordprocessingShape" xmlns:o="urn:schemas-microsoft-com:office:office" xmlns:v="urn:schemas-microsoft-com:vml" xmlns:w10="urn:schemas-microsoft-com:office:word" xmlns:w="http://schemas.openxmlformats.org/wordprocessingml/2006/main" xmlns:w14="http://schemas.microsoft.com/office/word/2010/wordml" xmlns:w15="http://schemas.microsoft.com/office/word/2012/wordml" xmlns:w16cex="http://schemas.microsoft.com/office/word/2018/wordml/cex" xmlns:w16cid="http://schemas.microsoft.com/office/word/2016/wordml/cid" xmlns:w16="http://schemas.microsoft.com/office/word/2018/wordml" xmlns:w16sdtdh="http://schemas.microsoft.com/office/word/2020/wordml/sdtdatahash" xmlns:w16sdtfl="http://schemas.microsoft.com/office/word/2024/wordml/sdtformatlock" xmlns:w16se="http://schemas.microsoft.com/office/word/2015/wordml/symex" xmlns:w16du="http://schemas.microsoft.com/office/word/2023/wordml/word16du" xmlns:wne="http://schemas.microsoft.com/office/word/2006/wordml" mc:Ignorable="w14 w15 w16se w16cid w16 w16cex w16sdtdh w16sdtfl w16du wp14">
   <w15:commentEx w15:paraId="7A99665A" w15:done="1"/>
   <w15:commentEx w15:paraId="0A8CAEF5" w15:done="1"/>
   <w15:commentEx w15:paraId="5220B2D6" w15:paraIdParent="0A8CAEF5" w15:done="1"/>
@@ -30449,7 +32539,7 @@
 </file>
 
 <file path=word/commentsExtensible.xml><?xml version="1.0" encoding="utf-8"?>
-<w16cex:commentsExtensible xmlns:wpc="http://schemas.microsoft.com/office/word/2010/wordprocessingCanvas" xmlns:cx="http://schemas.microsoft.com/office/drawing/2014/chartex" xmlns:cx1="http://schemas.microsoft.com/office/drawing/2015/9/8/chartex" xmlns:cx2="http://schemas.microsoft.com/office/drawing/2015/10/21/chartex" xmlns:cx3="http://schemas.microsoft.com/office/drawing/2016/5/9/chartex" xmlns:cx4="http://schemas.microsoft.com/office/drawing/2016/5/10/chartex" xmlns:cx5="http://schemas.microsoft.com/office/drawing/2016/5/11/chartex" xmlns:cx6="http://schemas.microsoft.com/office/drawing/2016/5/12/chartex" xmlns:cx7="http://schemas.microsoft.com/office/drawing/2016/5/13/chartex" xmlns:cx8="http://schemas.microsoft.com/office/drawing/2016/5/14/chartex" xmlns:cr="http://schemas.microsoft.com/office/comments/2020/reactions" xmlns:mc="http://schemas.openxmlformats.org/markup-compatibility/2006" xmlns:aink="http://schemas.microsoft.com/office/drawing/2016/ink" xmlns:am3d="http://schemas.microsoft.com/office/drawing/2017/model3d" xmlns:o="urn:schemas-microsoft-com:office:office" xmlns:oel="http://schemas.microsoft.com/office/2019/extlst" xmlns:r="http://schemas.openxmlformats.org/officeDocument/2006/relationships" xmlns:m="http://schemas.openxmlformats.org/officeDocument/2006/math" xmlns:v="urn:schemas-microsoft-com:vml" xmlns:wp14="http://schemas.microsoft.com/office/word/2010/wordprocessingDrawing" xmlns:wp="http://schemas.openxmlformats.org/drawingml/2006/wordprocessingDrawing" xmlns:w10="urn:schemas-microsoft-com:office:word" xmlns:w="http://schemas.openxmlformats.org/wordprocessingml/2006/main" xmlns:w14="http://schemas.microsoft.com/office/word/2010/wordml" xmlns:w15="http://schemas.microsoft.com/office/word/2012/wordml" xmlns:w16cex="http://schemas.microsoft.com/office/word/2018/wordml/cex" xmlns:w16cid="http://schemas.microsoft.com/office/word/2016/wordml/cid" xmlns:w16="http://schemas.microsoft.com/office/word/2018/wordml" xmlns:w16du="http://schemas.microsoft.com/office/word/2023/wordml/word16du" xmlns:w16sdtdh="http://schemas.microsoft.com/office/word/2020/wordml/sdtdatahash" xmlns:w16sdtfl="http://schemas.microsoft.com/office/word/2024/wordml/sdtformatlock" xmlns:w16se="http://schemas.microsoft.com/office/word/2015/wordml/symex" xmlns:wpg="http://schemas.microsoft.com/office/word/2010/wordprocessingGroup" xmlns:wpi="http://schemas.microsoft.com/office/word/2010/wordprocessingInk" xmlns:wne="http://schemas.microsoft.com/office/word/2006/wordml" xmlns:wps="http://schemas.microsoft.com/office/word/2010/wordprocessingShape" mc:Ignorable="w14 w15 w16se w16cid w16 w16cex w16sdtdh w16sdtfl cr w16du wp14">
+<w16cex:commentsExtensible xmlns:wpc="http://schemas.microsoft.com/office/word/2010/wordprocessingCanvas" xmlns:cx="http://schemas.microsoft.com/office/drawing/2014/chartex" xmlns:cx1="http://schemas.microsoft.com/office/drawing/2015/9/8/chartex" xmlns:cx2="http://schemas.microsoft.com/office/drawing/2015/10/21/chartex" xmlns:cx3="http://schemas.microsoft.com/office/drawing/2016/5/9/chartex" xmlns:cx4="http://schemas.microsoft.com/office/drawing/2016/5/10/chartex" xmlns:cx5="http://schemas.microsoft.com/office/drawing/2016/5/11/chartex" xmlns:cx6="http://schemas.microsoft.com/office/drawing/2016/5/12/chartex" xmlns:cx7="http://schemas.microsoft.com/office/drawing/2016/5/13/chartex" xmlns:cx8="http://schemas.microsoft.com/office/drawing/2016/5/14/chartex" xmlns:cr="http://schemas.microsoft.com/office/comments/2020/reactions" xmlns:mc="http://schemas.openxmlformats.org/markup-compatibility/2006" xmlns:m="http://schemas.openxmlformats.org/officeDocument/2006/math" xmlns:aink="http://schemas.microsoft.com/office/drawing/2016/ink" xmlns:am3d="http://schemas.microsoft.com/office/drawing/2017/model3d" xmlns:oel="http://schemas.microsoft.com/office/2019/extlst" xmlns:r="http://schemas.openxmlformats.org/officeDocument/2006/relationships" xmlns:wp14="http://schemas.microsoft.com/office/word/2010/wordprocessingDrawing" xmlns:wp="http://schemas.openxmlformats.org/drawingml/2006/wordprocessingDrawing" xmlns:wpg="http://schemas.microsoft.com/office/word/2010/wordprocessingGroup" xmlns:wpi="http://schemas.microsoft.com/office/word/2010/wordprocessingInk" xmlns:wps="http://schemas.microsoft.com/office/word/2010/wordprocessingShape" xmlns:o="urn:schemas-microsoft-com:office:office" xmlns:v="urn:schemas-microsoft-com:vml" xmlns:w10="urn:schemas-microsoft-com:office:word" xmlns:w="http://schemas.openxmlformats.org/wordprocessingml/2006/main" xmlns:w14="http://schemas.microsoft.com/office/word/2010/wordml" xmlns:w15="http://schemas.microsoft.com/office/word/2012/wordml" xmlns:w16cex="http://schemas.microsoft.com/office/word/2018/wordml/cex" xmlns:w16cid="http://schemas.microsoft.com/office/word/2016/wordml/cid" xmlns:w16="http://schemas.microsoft.com/office/word/2018/wordml" xmlns:w16sdtdh="http://schemas.microsoft.com/office/word/2020/wordml/sdtdatahash" xmlns:w16sdtfl="http://schemas.microsoft.com/office/word/2024/wordml/sdtformatlock" xmlns:w16se="http://schemas.microsoft.com/office/word/2015/wordml/symex" xmlns:w16du="http://schemas.microsoft.com/office/word/2023/wordml/word16du" xmlns:wne="http://schemas.microsoft.com/office/word/2006/wordml" mc:Ignorable="w14 w15 w16se w16cid w16 w16cex w16sdtdh w16sdtfl cr w16du wp14">
   <w16cex:commentExtensible w16cex:durableId="0DAECF79" w16cex:dateUtc="2026-08-06T17:00:00Z">
     <w16cex:extLst>
       <w16:ext w16:uri="{CE6994B0-6A32-4C9F-8C6B-6E91EDA988CE}">
@@ -30494,7 +32584,7 @@
 </file>
 
 <file path=word/commentsIds.xml><?xml version="1.0" encoding="utf-8"?>
-<w16cid:commentsIds xmlns:wpc="http://schemas.microsoft.com/office/word/2010/wordprocessingCanvas" xmlns:cx="http://schemas.microsoft.com/office/drawing/2014/chartex" xmlns:cx1="http://schemas.microsoft.com/office/drawing/2015/9/8/chartex" xmlns:cx2="http://schemas.microsoft.com/office/drawing/2015/10/21/chartex" xmlns:cx3="http://schemas.microsoft.com/office/drawing/2016/5/9/chartex" xmlns:cx4="http://schemas.microsoft.com/office/drawing/2016/5/10/chartex" xmlns:cx5="http://schemas.microsoft.com/office/drawing/2016/5/11/chartex" xmlns:cx6="http://schemas.microsoft.com/office/drawing/2016/5/12/chartex" xmlns:cx7="http://schemas.microsoft.com/office/drawing/2016/5/13/chartex" xmlns:cx8="http://schemas.microsoft.com/office/drawing/2016/5/14/chartex" xmlns:mc="http://schemas.openxmlformats.org/markup-compatibility/2006" xmlns:aink="http://schemas.microsoft.com/office/drawing/2016/ink" xmlns:am3d="http://schemas.microsoft.com/office/drawing/2017/model3d" xmlns:o="urn:schemas-microsoft-com:office:office" xmlns:oel="http://schemas.microsoft.com/office/2019/extlst" xmlns:r="http://schemas.openxmlformats.org/officeDocument/2006/relationships" xmlns:m="http://schemas.openxmlformats.org/officeDocument/2006/math" xmlns:v="urn:schemas-microsoft-com:vml" xmlns:wp14="http://schemas.microsoft.com/office/word/2010/wordprocessingDrawing" xmlns:wp="http://schemas.openxmlformats.org/drawingml/2006/wordprocessingDrawing" xmlns:w10="urn:schemas-microsoft-com:office:word" xmlns:w="http://schemas.openxmlformats.org/wordprocessingml/2006/main" xmlns:w14="http://schemas.microsoft.com/office/word/2010/wordml" xmlns:w15="http://schemas.microsoft.com/office/word/2012/wordml" xmlns:w16cex="http://schemas.microsoft.com/office/word/2018/wordml/cex" xmlns:w16cid="http://schemas.microsoft.com/office/word/2016/wordml/cid" xmlns:w16="http://schemas.microsoft.com/office/word/2018/wordml" xmlns:w16du="http://schemas.microsoft.com/office/word/2023/wordml/word16du" xmlns:w16sdtdh="http://schemas.microsoft.com/office/word/2020/wordml/sdtdatahash" xmlns:w16sdtfl="http://schemas.microsoft.com/office/word/2024/wordml/sdtformatlock" xmlns:w16se="http://schemas.microsoft.com/office/word/2015/wordml/symex" xmlns:wpg="http://schemas.microsoft.com/office/word/2010/wordprocessingGroup" xmlns:wpi="http://schemas.microsoft.com/office/word/2010/wordprocessingInk" xmlns:wne="http://schemas.microsoft.com/office/word/2006/wordml" xmlns:wps="http://schemas.microsoft.com/office/word/2010/wordprocessingShape" mc:Ignorable="w14 w15 w16se w16cid w16 w16cex w16sdtdh w16sdtfl w16du wp14">
+<w16cid:commentsIds xmlns:wpc="http://schemas.microsoft.com/office/word/2010/wordprocessingCanvas" xmlns:cx="http://schemas.microsoft.com/office/drawing/2014/chartex" xmlns:cx1="http://schemas.microsoft.com/office/drawing/2015/9/8/chartex" xmlns:cx2="http://schemas.microsoft.com/office/drawing/2015/10/21/chartex" xmlns:cx3="http://schemas.microsoft.com/office/drawing/2016/5/9/chartex" xmlns:cx4="http://schemas.microsoft.com/office/drawing/2016/5/10/chartex" xmlns:cx5="http://schemas.microsoft.com/office/drawing/2016/5/11/chartex" xmlns:cx6="http://schemas.microsoft.com/office/drawing/2016/5/12/chartex" xmlns:cx7="http://schemas.microsoft.com/office/drawing/2016/5/13/chartex" xmlns:cx8="http://schemas.microsoft.com/office/drawing/2016/5/14/chartex" xmlns:mc="http://schemas.openxmlformats.org/markup-compatibility/2006" xmlns:m="http://schemas.openxmlformats.org/officeDocument/2006/math" xmlns:aink="http://schemas.microsoft.com/office/drawing/2016/ink" xmlns:am3d="http://schemas.microsoft.com/office/drawing/2017/model3d" xmlns:oel="http://schemas.microsoft.com/office/2019/extlst" xmlns:r="http://schemas.openxmlformats.org/officeDocument/2006/relationships" xmlns:wp14="http://schemas.microsoft.com/office/word/2010/wordprocessingDrawing" xmlns:wp="http://schemas.openxmlformats.org/drawingml/2006/wordprocessingDrawing" xmlns:wpg="http://schemas.microsoft.com/office/word/2010/wordprocessingGroup" xmlns:wpi="http://schemas.microsoft.com/office/word/2010/wordprocessingInk" xmlns:wps="http://schemas.microsoft.com/office/word/2010/wordprocessingShape" xmlns:o="urn:schemas-microsoft-com:office:office" xmlns:v="urn:schemas-microsoft-com:vml" xmlns:w10="urn:schemas-microsoft-com:office:word" xmlns:w="http://schemas.openxmlformats.org/wordprocessingml/2006/main" xmlns:w14="http://schemas.microsoft.com/office/word/2010/wordml" xmlns:w15="http://schemas.microsoft.com/office/word/2012/wordml" xmlns:w16cex="http://schemas.microsoft.com/office/word/2018/wordml/cex" xmlns:w16cid="http://schemas.microsoft.com/office/word/2016/wordml/cid" xmlns:w16="http://schemas.microsoft.com/office/word/2018/wordml" xmlns:w16sdtdh="http://schemas.microsoft.com/office/word/2020/wordml/sdtdatahash" xmlns:w16sdtfl="http://schemas.microsoft.com/office/word/2024/wordml/sdtformatlock" xmlns:w16se="http://schemas.microsoft.com/office/word/2015/wordml/symex" xmlns:w16du="http://schemas.microsoft.com/office/word/2023/wordml/word16du" xmlns:wne="http://schemas.microsoft.com/office/word/2006/wordml" mc:Ignorable="w14 w15 w16se w16cid w16 w16cex w16sdtdh w16sdtfl w16du wp14">
   <w16cid:commentId w16cid:paraId="7A99665A" w16cid:durableId="0DAECF79"/>
   <w16cid:commentId w16cid:paraId="0A8CAEF5" w16cid:durableId="2546D5B5"/>
   <w16cid:commentId w16cid:paraId="5220B2D6" w16cid:durableId="48A902C4"/>
@@ -30527,7 +32617,7 @@
 </file>
 
 <file path=word/endnotes.xml><?xml version="1.0" encoding="utf-8"?>
-<w:endnotes xmlns:wpc="http://schemas.microsoft.com/office/word/2010/wordprocessingCanvas" xmlns:cx="http://schemas.microsoft.com/office/drawing/2014/chartex" xmlns:cx1="http://schemas.microsoft.com/office/drawing/2015/9/8/chartex" xmlns:cx2="http://schemas.microsoft.com/office/drawing/2015/10/21/chartex" xmlns:cx3="http://schemas.microsoft.com/office/drawing/2016/5/9/chartex" xmlns:cx4="http://schemas.microsoft.com/office/drawing/2016/5/10/chartex" xmlns:cx5="http://schemas.microsoft.com/office/drawing/2016/5/11/chartex" xmlns:cx6="http://schemas.microsoft.com/office/drawing/2016/5/12/chartex" xmlns:cx7="http://schemas.microsoft.com/office/drawing/2016/5/13/chartex" xmlns:cx8="http://schemas.microsoft.com/office/drawing/2016/5/14/chartex" xmlns:mc="http://schemas.openxmlformats.org/markup-compatibility/2006" xmlns:aink="http://schemas.microsoft.com/office/drawing/2016/ink" xmlns:am3d="http://schemas.microsoft.com/office/drawing/2017/model3d" xmlns:o="urn:schemas-microsoft-com:office:office" xmlns:oel="http://schemas.microsoft.com/office/2019/extlst" xmlns:r="http://schemas.openxmlformats.org/officeDocument/2006/relationships" xmlns:m="http://schemas.openxmlformats.org/officeDocument/2006/math" xmlns:v="urn:schemas-microsoft-com:vml" xmlns:wp14="http://schemas.microsoft.com/office/word/2010/wordprocessingDrawing" xmlns:wp="http://schemas.openxmlformats.org/drawingml/2006/wordprocessingDrawing" xmlns:w10="urn:schemas-microsoft-com:office:word" xmlns:w="http://schemas.openxmlformats.org/wordprocessingml/2006/main" xmlns:w14="http://schemas.microsoft.com/office/word/2010/wordml" xmlns:w15="http://schemas.microsoft.com/office/word/2012/wordml" xmlns:w16cex="http://schemas.microsoft.com/office/word/2018/wordml/cex" xmlns:w16cid="http://schemas.microsoft.com/office/word/2016/wordml/cid" xmlns:w16="http://schemas.microsoft.com/office/word/2018/wordml" xmlns:w16du="http://schemas.microsoft.com/office/word/2023/wordml/word16du" xmlns:w16sdtdh="http://schemas.microsoft.com/office/word/2020/wordml/sdtdatahash" xmlns:w16sdtfl="http://schemas.microsoft.com/office/word/2024/wordml/sdtformatlock" xmlns:w16se="http://schemas.microsoft.com/office/word/2015/wordml/symex" xmlns:wpg="http://schemas.microsoft.com/office/word/2010/wordprocessingGroup" xmlns:wpi="http://schemas.microsoft.com/office/word/2010/wordprocessingInk" xmlns:wne="http://schemas.microsoft.com/office/word/2006/wordml" xmlns:wps="http://schemas.microsoft.com/office/word/2010/wordprocessingShape" mc:Ignorable="w14 w15 w16se w16cid w16 w16cex w16sdtdh w16sdtfl w16du wp14">
+<w:endnotes xmlns:wpc="http://schemas.microsoft.com/office/word/2010/wordprocessingCanvas" xmlns:cx="http://schemas.microsoft.com/office/drawing/2014/chartex" xmlns:cx1="http://schemas.microsoft.com/office/drawing/2015/9/8/chartex" xmlns:cx2="http://schemas.microsoft.com/office/drawing/2015/10/21/chartex" xmlns:cx3="http://schemas.microsoft.com/office/drawing/2016/5/9/chartex" xmlns:cx4="http://schemas.microsoft.com/office/drawing/2016/5/10/chartex" xmlns:cx5="http://schemas.microsoft.com/office/drawing/2016/5/11/chartex" xmlns:cx6="http://schemas.microsoft.com/office/drawing/2016/5/12/chartex" xmlns:cx7="http://schemas.microsoft.com/office/drawing/2016/5/13/chartex" xmlns:cx8="http://schemas.microsoft.com/office/drawing/2016/5/14/chartex" xmlns:mc="http://schemas.openxmlformats.org/markup-compatibility/2006" xmlns:m="http://schemas.openxmlformats.org/officeDocument/2006/math" xmlns:aink="http://schemas.microsoft.com/office/drawing/2016/ink" xmlns:am3d="http://schemas.microsoft.com/office/drawing/2017/model3d" xmlns:oel="http://schemas.microsoft.com/office/2019/extlst" xmlns:r="http://schemas.openxmlformats.org/officeDocument/2006/relationships" xmlns:wp14="http://schemas.microsoft.com/office/word/2010/wordprocessingDrawing" xmlns:wp="http://schemas.openxmlformats.org/drawingml/2006/wordprocessingDrawing" xmlns:wpg="http://schemas.microsoft.com/office/word/2010/wordprocessingGroup" xmlns:wpi="http://schemas.microsoft.com/office/word/2010/wordprocessingInk" xmlns:wps="http://schemas.microsoft.com/office/word/2010/wordprocessingShape" xmlns:o="urn:schemas-microsoft-com:office:office" xmlns:v="urn:schemas-microsoft-com:vml" xmlns:w10="urn:schemas-microsoft-com:office:word" xmlns:w="http://schemas.openxmlformats.org/wordprocessingml/2006/main" xmlns:w14="http://schemas.microsoft.com/office/word/2010/wordml" xmlns:w15="http://schemas.microsoft.com/office/word/2012/wordml" xmlns:w16cex="http://schemas.microsoft.com/office/word/2018/wordml/cex" xmlns:w16cid="http://schemas.microsoft.com/office/word/2016/wordml/cid" xmlns:w16="http://schemas.microsoft.com/office/word/2018/wordml" xmlns:w16sdtdh="http://schemas.microsoft.com/office/word/2020/wordml/sdtdatahash" xmlns:w16sdtfl="http://schemas.microsoft.com/office/word/2024/wordml/sdtformatlock" xmlns:w16se="http://schemas.microsoft.com/office/word/2015/wordml/symex" xmlns:w16du="http://schemas.microsoft.com/office/word/2023/wordml/word16du" xmlns:wne="http://schemas.microsoft.com/office/word/2006/wordml" mc:Ignorable="w14 w15 w16se w16cid w16 w16cex w16sdtdh w16sdtfl w16du wp14">
   <w:endnote w:type="separator" w:id="-1">
     <w:p>
       <w:pPr>
@@ -30552,7 +32642,7 @@
 </file>
 
 <file path=word/footer1.xml><?xml version="1.0" encoding="utf-8"?>
-<w:ftr xmlns:wpc="http://schemas.microsoft.com/office/word/2010/wordprocessingCanvas" xmlns:cx="http://schemas.microsoft.com/office/drawing/2014/chartex" xmlns:cx1="http://schemas.microsoft.com/office/drawing/2015/9/8/chartex" xmlns:cx2="http://schemas.microsoft.com/office/drawing/2015/10/21/chartex" xmlns:cx3="http://schemas.microsoft.com/office/drawing/2016/5/9/chartex" xmlns:cx4="http://schemas.microsoft.com/office/drawing/2016/5/10/chartex" xmlns:cx5="http://schemas.microsoft.com/office/drawing/2016/5/11/chartex" xmlns:cx6="http://schemas.microsoft.com/office/drawing/2016/5/12/chartex" xmlns:cx7="http://schemas.microsoft.com/office/drawing/2016/5/13/chartex" xmlns:cx8="http://schemas.microsoft.com/office/drawing/2016/5/14/chartex" xmlns:mc="http://schemas.openxmlformats.org/markup-compatibility/2006" xmlns:aink="http://schemas.microsoft.com/office/drawing/2016/ink" xmlns:am3d="http://schemas.microsoft.com/office/drawing/2017/model3d" xmlns:o="urn:schemas-microsoft-com:office:office" xmlns:oel="http://schemas.microsoft.com/office/2019/extlst" xmlns:r="http://schemas.openxmlformats.org/officeDocument/2006/relationships" xmlns:m="http://schemas.openxmlformats.org/officeDocument/2006/math" xmlns:v="urn:schemas-microsoft-com:vml" xmlns:wp14="http://schemas.microsoft.com/office/word/2010/wordprocessingDrawing" xmlns:wp="http://schemas.openxmlformats.org/drawingml/2006/wordprocessingDrawing" xmlns:w10="urn:schemas-microsoft-com:office:word" xmlns:w="http://schemas.openxmlformats.org/wordprocessingml/2006/main" xmlns:w14="http://schemas.microsoft.com/office/word/2010/wordml" xmlns:w15="http://schemas.microsoft.com/office/word/2012/wordml" xmlns:w16cex="http://schemas.microsoft.com/office/word/2018/wordml/cex" xmlns:w16cid="http://schemas.microsoft.com/office/word/2016/wordml/cid" xmlns:w16="http://schemas.microsoft.com/office/word/2018/wordml" xmlns:w16du="http://schemas.microsoft.com/office/word/2023/wordml/word16du" xmlns:w16sdtdh="http://schemas.microsoft.com/office/word/2020/wordml/sdtdatahash" xmlns:w16sdtfl="http://schemas.microsoft.com/office/word/2024/wordml/sdtformatlock" xmlns:w16se="http://schemas.microsoft.com/office/word/2015/wordml/symex" xmlns:wpg="http://schemas.microsoft.com/office/word/2010/wordprocessingGroup" xmlns:wpi="http://schemas.microsoft.com/office/word/2010/wordprocessingInk" xmlns:wne="http://schemas.microsoft.com/office/word/2006/wordml" xmlns:wps="http://schemas.microsoft.com/office/word/2010/wordprocessingShape" mc:Ignorable="w14 w15 w16se w16cid w16 w16cex w16sdtdh w16sdtfl w16du wp14">
+<w:ftr xmlns:wpc="http://schemas.microsoft.com/office/word/2010/wordprocessingCanvas" xmlns:cx="http://schemas.microsoft.com/office/drawing/2014/chartex" xmlns:cx1="http://schemas.microsoft.com/office/drawing/2015/9/8/chartex" xmlns:cx2="http://schemas.microsoft.com/office/drawing/2015/10/21/chartex" xmlns:cx3="http://schemas.microsoft.com/office/drawing/2016/5/9/chartex" xmlns:cx4="http://schemas.microsoft.com/office/drawing/2016/5/10/chartex" xmlns:cx5="http://schemas.microsoft.com/office/drawing/2016/5/11/chartex" xmlns:cx6="http://schemas.microsoft.com/office/drawing/2016/5/12/chartex" xmlns:cx7="http://schemas.microsoft.com/office/drawing/2016/5/13/chartex" xmlns:cx8="http://schemas.microsoft.com/office/drawing/2016/5/14/chartex" xmlns:mc="http://schemas.openxmlformats.org/markup-compatibility/2006" xmlns:m="http://schemas.openxmlformats.org/officeDocument/2006/math" xmlns:aink="http://schemas.microsoft.com/office/drawing/2016/ink" xmlns:am3d="http://schemas.microsoft.com/office/drawing/2017/model3d" xmlns:oel="http://schemas.microsoft.com/office/2019/extlst" xmlns:r="http://schemas.openxmlformats.org/officeDocument/2006/relationships" xmlns:wp14="http://schemas.microsoft.com/office/word/2010/wordprocessingDrawing" xmlns:wp="http://schemas.openxmlformats.org/drawingml/2006/wordprocessingDrawing" xmlns:wpg="http://schemas.microsoft.com/office/word/2010/wordprocessingGroup" xmlns:wpi="http://schemas.microsoft.com/office/word/2010/wordprocessingInk" xmlns:wps="http://schemas.microsoft.com/office/word/2010/wordprocessingShape" xmlns:o="urn:schemas-microsoft-com:office:office" xmlns:v="urn:schemas-microsoft-com:vml" xmlns:w10="urn:schemas-microsoft-com:office:word" xmlns:w="http://schemas.openxmlformats.org/wordprocessingml/2006/main" xmlns:w14="http://schemas.microsoft.com/office/word/2010/wordml" xmlns:w15="http://schemas.microsoft.com/office/word/2012/wordml" xmlns:w16cex="http://schemas.microsoft.com/office/word/2018/wordml/cex" xmlns:w16cid="http://schemas.microsoft.com/office/word/2016/wordml/cid" xmlns:w16="http://schemas.microsoft.com/office/word/2018/wordml" xmlns:w16sdtdh="http://schemas.microsoft.com/office/word/2020/wordml/sdtdatahash" xmlns:w16sdtfl="http://schemas.microsoft.com/office/word/2024/wordml/sdtformatlock" xmlns:w16se="http://schemas.microsoft.com/office/word/2015/wordml/symex" xmlns:w16du="http://schemas.microsoft.com/office/word/2023/wordml/word16du" xmlns:wne="http://schemas.microsoft.com/office/word/2006/wordml" mc:Ignorable="w14 w15 w16se w16cid w16 w16cex w16sdtdh w16sdtfl w16du wp14">
   <w:sdt>
     <w:sdtPr>
       <w:id w:val="1090047267"/>
@@ -30605,7 +32695,7 @@
 </file>
 
 <file path=word/footnotes.xml><?xml version="1.0" encoding="utf-8"?>
-<w:footnotes xmlns:wpc="http://schemas.microsoft.com/office/word/2010/wordprocessingCanvas" xmlns:cx="http://schemas.microsoft.com/office/drawing/2014/chartex" xmlns:cx1="http://schemas.microsoft.com/office/drawing/2015/9/8/chartex" xmlns:cx2="http://schemas.microsoft.com/office/drawing/2015/10/21/chartex" xmlns:cx3="http://schemas.microsoft.com/office/drawing/2016/5/9/chartex" xmlns:cx4="http://schemas.microsoft.com/office/drawing/2016/5/10/chartex" xmlns:cx5="http://schemas.microsoft.com/office/drawing/2016/5/11/chartex" xmlns:cx6="http://schemas.microsoft.com/office/drawing/2016/5/12/chartex" xmlns:cx7="http://schemas.microsoft.com/office/drawing/2016/5/13/chartex" xmlns:cx8="http://schemas.microsoft.com/office/drawing/2016/5/14/chartex" xmlns:mc="http://schemas.openxmlformats.org/markup-compatibility/2006" xmlns:aink="http://schemas.microsoft.com/office/drawing/2016/ink" xmlns:am3d="http://schemas.microsoft.com/office/drawing/2017/model3d" xmlns:o="urn:schemas-microsoft-com:office:office" xmlns:oel="http://schemas.microsoft.com/office/2019/extlst" xmlns:r="http://schemas.openxmlformats.org/officeDocument/2006/relationships" xmlns:m="http://schemas.openxmlformats.org/officeDocument/2006/math" xmlns:v="urn:schemas-microsoft-com:vml" xmlns:wp14="http://schemas.microsoft.com/office/word/2010/wordprocessingDrawing" xmlns:wp="http://schemas.openxmlformats.org/drawingml/2006/wordprocessingDrawing" xmlns:w10="urn:schemas-microsoft-com:office:word" xmlns:w="http://schemas.openxmlformats.org/wordprocessingml/2006/main" xmlns:w14="http://schemas.microsoft.com/office/word/2010/wordml" xmlns:w15="http://schemas.microsoft.com/office/word/2012/wordml" xmlns:w16cex="http://schemas.microsoft.com/office/word/2018/wordml/cex" xmlns:w16cid="http://schemas.microsoft.com/office/word/2016/wordml/cid" xmlns:w16="http://schemas.microsoft.com/office/word/2018/wordml" xmlns:w16du="http://schemas.microsoft.com/office/word/2023/wordml/word16du" xmlns:w16sdtdh="http://schemas.microsoft.com/office/word/2020/wordml/sdtdatahash" xmlns:w16sdtfl="http://schemas.microsoft.com/office/word/2024/wordml/sdtformatlock" xmlns:w16se="http://schemas.microsoft.com/office/word/2015/wordml/symex" xmlns:wpg="http://schemas.microsoft.com/office/word/2010/wordprocessingGroup" xmlns:wpi="http://schemas.microsoft.com/office/word/2010/wordprocessingInk" xmlns:wne="http://schemas.microsoft.com/office/word/2006/wordml" xmlns:wps="http://schemas.microsoft.com/office/word/2010/wordprocessingShape" mc:Ignorable="w14 w15 w16se w16cid w16 w16cex w16sdtdh w16sdtfl w16du wp14">
+<w:footnotes xmlns:wpc="http://schemas.microsoft.com/office/word/2010/wordprocessingCanvas" xmlns:cx="http://schemas.microsoft.com/office/drawing/2014/chartex" xmlns:cx1="http://schemas.microsoft.com/office/drawing/2015/9/8/chartex" xmlns:cx2="http://schemas.microsoft.com/office/drawing/2015/10/21/chartex" xmlns:cx3="http://schemas.microsoft.com/office/drawing/2016/5/9/chartex" xmlns:cx4="http://schemas.microsoft.com/office/drawing/2016/5/10/chartex" xmlns:cx5="http://schemas.microsoft.com/office/drawing/2016/5/11/chartex" xmlns:cx6="http://schemas.microsoft.com/office/drawing/2016/5/12/chartex" xmlns:cx7="http://schemas.microsoft.com/office/drawing/2016/5/13/chartex" xmlns:cx8="http://schemas.microsoft.com/office/drawing/2016/5/14/chartex" xmlns:mc="http://schemas.openxmlformats.org/markup-compatibility/2006" xmlns:m="http://schemas.openxmlformats.org/officeDocument/2006/math" xmlns:aink="http://schemas.microsoft.com/office/drawing/2016/ink" xmlns:am3d="http://schemas.microsoft.com/office/drawing/2017/model3d" xmlns:oel="http://schemas.microsoft.com/office/2019/extlst" xmlns:r="http://schemas.openxmlformats.org/officeDocument/2006/relationships" xmlns:wp14="http://schemas.microsoft.com/office/word/2010/wordprocessingDrawing" xmlns:wp="http://schemas.openxmlformats.org/drawingml/2006/wordprocessingDrawing" xmlns:wpg="http://schemas.microsoft.com/office/word/2010/wordprocessingGroup" xmlns:wpi="http://schemas.microsoft.com/office/word/2010/wordprocessingInk" xmlns:wps="http://schemas.microsoft.com/office/word/2010/wordprocessingShape" xmlns:o="urn:schemas-microsoft-com:office:office" xmlns:v="urn:schemas-microsoft-com:vml" xmlns:w10="urn:schemas-microsoft-com:office:word" xmlns:w="http://schemas.openxmlformats.org/wordprocessingml/2006/main" xmlns:w14="http://schemas.microsoft.com/office/word/2010/wordml" xmlns:w15="http://schemas.microsoft.com/office/word/2012/wordml" xmlns:w16cex="http://schemas.microsoft.com/office/word/2018/wordml/cex" xmlns:w16cid="http://schemas.microsoft.com/office/word/2016/wordml/cid" xmlns:w16="http://schemas.microsoft.com/office/word/2018/wordml" xmlns:w16sdtdh="http://schemas.microsoft.com/office/word/2020/wordml/sdtdatahash" xmlns:w16sdtfl="http://schemas.microsoft.com/office/word/2024/wordml/sdtformatlock" xmlns:w16se="http://schemas.microsoft.com/office/word/2015/wordml/symex" xmlns:w16du="http://schemas.microsoft.com/office/word/2023/wordml/word16du" xmlns:wne="http://schemas.microsoft.com/office/word/2006/wordml" mc:Ignorable="w14 w15 w16se w16cid w16 w16cex w16sdtdh w16sdtfl w16du wp14">
   <w:footnote w:type="separator" w:id="-1">
     <w:p>
       <w:pPr>
@@ -30630,7 +32720,7 @@
 </file>
 
 <file path=word/header1.xml><?xml version="1.0" encoding="utf-8"?>
-<w:hdr xmlns:wpc="http://schemas.microsoft.com/office/word/2010/wordprocessingCanvas" xmlns:cx="http://schemas.microsoft.com/office/drawing/2014/chartex" xmlns:cx1="http://schemas.microsoft.com/office/drawing/2015/9/8/chartex" xmlns:cx2="http://schemas.microsoft.com/office/drawing/2015/10/21/chartex" xmlns:cx3="http://schemas.microsoft.com/office/drawing/2016/5/9/chartex" xmlns:cx4="http://schemas.microsoft.com/office/drawing/2016/5/10/chartex" xmlns:cx5="http://schemas.microsoft.com/office/drawing/2016/5/11/chartex" xmlns:cx6="http://schemas.microsoft.com/office/drawing/2016/5/12/chartex" xmlns:cx7="http://schemas.microsoft.com/office/drawing/2016/5/13/chartex" xmlns:cx8="http://schemas.microsoft.com/office/drawing/2016/5/14/chartex" xmlns:mc="http://schemas.openxmlformats.org/markup-compatibility/2006" xmlns:aink="http://schemas.microsoft.com/office/drawing/2016/ink" xmlns:am3d="http://schemas.microsoft.com/office/drawing/2017/model3d" xmlns:o="urn:schemas-microsoft-com:office:office" xmlns:oel="http://schemas.microsoft.com/office/2019/extlst" xmlns:r="http://schemas.openxmlformats.org/officeDocument/2006/relationships" xmlns:m="http://schemas.openxmlformats.org/officeDocument/2006/math" xmlns:v="urn:schemas-microsoft-com:vml" xmlns:wp14="http://schemas.microsoft.com/office/word/2010/wordprocessingDrawing" xmlns:wp="http://schemas.openxmlformats.org/drawingml/2006/wordprocessingDrawing" xmlns:w10="urn:schemas-microsoft-com:office:word" xmlns:w="http://schemas.openxmlformats.org/wordprocessingml/2006/main" xmlns:w14="http://schemas.microsoft.com/office/word/2010/wordml" xmlns:w15="http://schemas.microsoft.com/office/word/2012/wordml" xmlns:w16cex="http://schemas.microsoft.com/office/word/2018/wordml/cex" xmlns:w16cid="http://schemas.microsoft.com/office/word/2016/wordml/cid" xmlns:w16="http://schemas.microsoft.com/office/word/2018/wordml" xmlns:w16du="http://schemas.microsoft.com/office/word/2023/wordml/word16du" xmlns:w16sdtdh="http://schemas.microsoft.com/office/word/2020/wordml/sdtdatahash" xmlns:w16sdtfl="http://schemas.microsoft.com/office/word/2024/wordml/sdtformatlock" xmlns:w16se="http://schemas.microsoft.com/office/word/2015/wordml/symex" xmlns:wpg="http://schemas.microsoft.com/office/word/2010/wordprocessingGroup" xmlns:wpi="http://schemas.microsoft.com/office/word/2010/wordprocessingInk" xmlns:wne="http://schemas.microsoft.com/office/word/2006/wordml" xmlns:wps="http://schemas.microsoft.com/office/word/2010/wordprocessingShape" mc:Ignorable="w14 w15 w16se w16cid w16 w16cex w16sdtdh w16sdtfl w16du wp14">
+<w:hdr xmlns:wpc="http://schemas.microsoft.com/office/word/2010/wordprocessingCanvas" xmlns:cx="http://schemas.microsoft.com/office/drawing/2014/chartex" xmlns:cx1="http://schemas.microsoft.com/office/drawing/2015/9/8/chartex" xmlns:cx2="http://schemas.microsoft.com/office/drawing/2015/10/21/chartex" xmlns:cx3="http://schemas.microsoft.com/office/drawing/2016/5/9/chartex" xmlns:cx4="http://schemas.microsoft.com/office/drawing/2016/5/10/chartex" xmlns:cx5="http://schemas.microsoft.com/office/drawing/2016/5/11/chartex" xmlns:cx6="http://schemas.microsoft.com/office/drawing/2016/5/12/chartex" xmlns:cx7="http://schemas.microsoft.com/office/drawing/2016/5/13/chartex" xmlns:cx8="http://schemas.microsoft.com/office/drawing/2016/5/14/chartex" xmlns:mc="http://schemas.openxmlformats.org/markup-compatibility/2006" xmlns:m="http://schemas.openxmlformats.org/officeDocument/2006/math" xmlns:aink="http://schemas.microsoft.com/office/drawing/2016/ink" xmlns:am3d="http://schemas.microsoft.com/office/drawing/2017/model3d" xmlns:oel="http://schemas.microsoft.com/office/2019/extlst" xmlns:r="http://schemas.openxmlformats.org/officeDocument/2006/relationships" xmlns:wp14="http://schemas.microsoft.com/office/word/2010/wordprocessingDrawing" xmlns:wp="http://schemas.openxmlformats.org/drawingml/2006/wordprocessingDrawing" xmlns:wpg="http://schemas.microsoft.com/office/word/2010/wordprocessingGroup" xmlns:wpi="http://schemas.microsoft.com/office/word/2010/wordprocessingInk" xmlns:wps="http://schemas.microsoft.com/office/word/2010/wordprocessingShape" xmlns:o="urn:schemas-microsoft-com:office:office" xmlns:v="urn:schemas-microsoft-com:vml" xmlns:w10="urn:schemas-microsoft-com:office:word" xmlns:w="http://schemas.openxmlformats.org/wordprocessingml/2006/main" xmlns:w14="http://schemas.microsoft.com/office/word/2010/wordml" xmlns:w15="http://schemas.microsoft.com/office/word/2012/wordml" xmlns:w16cex="http://schemas.microsoft.com/office/word/2018/wordml/cex" xmlns:w16cid="http://schemas.microsoft.com/office/word/2016/wordml/cid" xmlns:w16="http://schemas.microsoft.com/office/word/2018/wordml" xmlns:w16sdtdh="http://schemas.microsoft.com/office/word/2020/wordml/sdtdatahash" xmlns:w16sdtfl="http://schemas.microsoft.com/office/word/2024/wordml/sdtformatlock" xmlns:w16se="http://schemas.microsoft.com/office/word/2015/wordml/symex" xmlns:w16du="http://schemas.microsoft.com/office/word/2023/wordml/word16du" xmlns:wne="http://schemas.microsoft.com/office/word/2006/wordml" mc:Ignorable="w14 w15 w16se w16cid w16 w16cex w16sdtdh w16sdtfl w16du wp14">
   <w:p>
     <w:pPr>
       <w:pStyle w:val="Header"/>
@@ -30640,7 +32730,7 @@
 </file>
 
 <file path=word/numbering.xml><?xml version="1.0" encoding="utf-8"?>
-<w:numbering xmlns:wpc="http://schemas.microsoft.com/office/word/2010/wordprocessingCanvas" xmlns:cx="http://schemas.microsoft.com/office/drawing/2014/chartex" xmlns:cx1="http://schemas.microsoft.com/office/drawing/2015/9/8/chartex" xmlns:cx2="http://schemas.microsoft.com/office/drawing/2015/10/21/chartex" xmlns:cx3="http://schemas.microsoft.com/office/drawing/2016/5/9/chartex" xmlns:cx4="http://schemas.microsoft.com/office/drawing/2016/5/10/chartex" xmlns:cx5="http://schemas.microsoft.com/office/drawing/2016/5/11/chartex" xmlns:cx6="http://schemas.microsoft.com/office/drawing/2016/5/12/chartex" xmlns:cx7="http://schemas.microsoft.com/office/drawing/2016/5/13/chartex" xmlns:cx8="http://schemas.microsoft.com/office/drawing/2016/5/14/chartex" xmlns:mc="http://schemas.openxmlformats.org/markup-compatibility/2006" xmlns:aink="http://schemas.microsoft.com/office/drawing/2016/ink" xmlns:am3d="http://schemas.microsoft.com/office/drawing/2017/model3d" xmlns:o="urn:schemas-microsoft-com:office:office" xmlns:oel="http://schemas.microsoft.com/office/2019/extlst" xmlns:r="http://schemas.openxmlformats.org/officeDocument/2006/relationships" xmlns:m="http://schemas.openxmlformats.org/officeDocument/2006/math" xmlns:v="urn:schemas-microsoft-com:vml" xmlns:wp14="http://schemas.microsoft.com/office/word/2010/wordprocessingDrawing" xmlns:wp="http://schemas.openxmlformats.org/drawingml/2006/wordprocessingDrawing" xmlns:w10="urn:schemas-microsoft-com:office:word" xmlns:w="http://schemas.openxmlformats.org/wordprocessingml/2006/main" xmlns:w14="http://schemas.microsoft.com/office/word/2010/wordml" xmlns:w15="http://schemas.microsoft.com/office/word/2012/wordml" xmlns:w16cex="http://schemas.microsoft.com/office/word/2018/wordml/cex" xmlns:w16cid="http://schemas.microsoft.com/office/word/2016/wordml/cid" xmlns:w16="http://schemas.microsoft.com/office/word/2018/wordml" xmlns:w16du="http://schemas.microsoft.com/office/word/2023/wordml/word16du" xmlns:w16sdtdh="http://schemas.microsoft.com/office/word/2020/wordml/sdtdatahash" xmlns:w16sdtfl="http://schemas.microsoft.com/office/word/2024/wordml/sdtformatlock" xmlns:w16se="http://schemas.microsoft.com/office/word/2015/wordml/symex" xmlns:wpg="http://schemas.microsoft.com/office/word/2010/wordprocessingGroup" xmlns:wpi="http://schemas.microsoft.com/office/word/2010/wordprocessingInk" xmlns:wne="http://schemas.microsoft.com/office/word/2006/wordml" xmlns:wps="http://schemas.microsoft.com/office/word/2010/wordprocessingShape" mc:Ignorable="w14 w15 w16se w16cid w16 w16cex w16sdtdh w16sdtfl w16du wp14">
+<w:numbering xmlns:wpc="http://schemas.microsoft.com/office/word/2010/wordprocessingCanvas" xmlns:cx="http://schemas.microsoft.com/office/drawing/2014/chartex" xmlns:cx1="http://schemas.microsoft.com/office/drawing/2015/9/8/chartex" xmlns:cx2="http://schemas.microsoft.com/office/drawing/2015/10/21/chartex" xmlns:cx3="http://schemas.microsoft.com/office/drawing/2016/5/9/chartex" xmlns:cx4="http://schemas.microsoft.com/office/drawing/2016/5/10/chartex" xmlns:cx5="http://schemas.microsoft.com/office/drawing/2016/5/11/chartex" xmlns:cx6="http://schemas.microsoft.com/office/drawing/2016/5/12/chartex" xmlns:cx7="http://schemas.microsoft.com/office/drawing/2016/5/13/chartex" xmlns:cx8="http://schemas.microsoft.com/office/drawing/2016/5/14/chartex" xmlns:mc="http://schemas.openxmlformats.org/markup-compatibility/2006" xmlns:m="http://schemas.openxmlformats.org/officeDocument/2006/math" xmlns:aink="http://schemas.microsoft.com/office/drawing/2016/ink" xmlns:am3d="http://schemas.microsoft.com/office/drawing/2017/model3d" xmlns:oel="http://schemas.microsoft.com/office/2019/extlst" xmlns:r="http://schemas.openxmlformats.org/officeDocument/2006/relationships" xmlns:wp14="http://schemas.microsoft.com/office/word/2010/wordprocessingDrawing" xmlns:wp="http://schemas.openxmlformats.org/drawingml/2006/wordprocessingDrawing" xmlns:wpg="http://schemas.microsoft.com/office/word/2010/wordprocessingGroup" xmlns:wpi="http://schemas.microsoft.com/office/word/2010/wordprocessingInk" xmlns:wps="http://schemas.microsoft.com/office/word/2010/wordprocessingShape" xmlns:o="urn:schemas-microsoft-com:office:office" xmlns:v="urn:schemas-microsoft-com:vml" xmlns:w10="urn:schemas-microsoft-com:office:word" xmlns:w="http://schemas.openxmlformats.org/wordprocessingml/2006/main" xmlns:w14="http://schemas.microsoft.com/office/word/2010/wordml" xmlns:w15="http://schemas.microsoft.com/office/word/2012/wordml" xmlns:w16cex="http://schemas.microsoft.com/office/word/2018/wordml/cex" xmlns:w16cid="http://schemas.microsoft.com/office/word/2016/wordml/cid" xmlns:w16="http://schemas.microsoft.com/office/word/2018/wordml" xmlns:w16sdtdh="http://schemas.microsoft.com/office/word/2020/wordml/sdtdatahash" xmlns:w16sdtfl="http://schemas.microsoft.com/office/word/2024/wordml/sdtformatlock" xmlns:w16se="http://schemas.microsoft.com/office/word/2015/wordml/symex" xmlns:w16du="http://schemas.microsoft.com/office/word/2023/wordml/word16du" xmlns:wne="http://schemas.microsoft.com/office/word/2006/wordml" mc:Ignorable="w14 w15 w16se w16cid w16 w16cex w16sdtdh w16sdtfl w16du wp14">
   <w:abstractNum w:abstractNumId="0" w15:restartNumberingAfterBreak="0">
     <w:nsid w:val="018F7683"/>
     <w:multiLevelType w:val="hybridMultilevel"/>
@@ -31191,7 +33281,7 @@
 </file>
 
 <file path=word/people.xml><?xml version="1.0" encoding="utf-8"?>
-<w15:people xmlns:wpc="http://schemas.microsoft.com/office/word/2010/wordprocessingCanvas" xmlns:cx="http://schemas.microsoft.com/office/drawing/2014/chartex" xmlns:cx1="http://schemas.microsoft.com/office/drawing/2015/9/8/chartex" xmlns:cx2="http://schemas.microsoft.com/office/drawing/2015/10/21/chartex" xmlns:cx3="http://schemas.microsoft.com/office/drawing/2016/5/9/chartex" xmlns:cx4="http://schemas.microsoft.com/office/drawing/2016/5/10/chartex" xmlns:cx5="http://schemas.microsoft.com/office/drawing/2016/5/11/chartex" xmlns:cx6="http://schemas.microsoft.com/office/drawing/2016/5/12/chartex" xmlns:cx7="http://schemas.microsoft.com/office/drawing/2016/5/13/chartex" xmlns:cx8="http://schemas.microsoft.com/office/drawing/2016/5/14/chartex" xmlns:mc="http://schemas.openxmlformats.org/markup-compatibility/2006" xmlns:aink="http://schemas.microsoft.com/office/drawing/2016/ink" xmlns:am3d="http://schemas.microsoft.com/office/drawing/2017/model3d" xmlns:o="urn:schemas-microsoft-com:office:office" xmlns:oel="http://schemas.microsoft.com/office/2019/extlst" xmlns:r="http://schemas.openxmlformats.org/officeDocument/2006/relationships" xmlns:m="http://schemas.openxmlformats.org/officeDocument/2006/math" xmlns:v="urn:schemas-microsoft-com:vml" xmlns:wp14="http://schemas.microsoft.com/office/word/2010/wordprocessingDrawing" xmlns:wp="http://schemas.openxmlformats.org/drawingml/2006/wordprocessingDrawing" xmlns:w10="urn:schemas-microsoft-com:office:word" xmlns:w="http://schemas.openxmlformats.org/wordprocessingml/2006/main" xmlns:w14="http://schemas.microsoft.com/office/word/2010/wordml" xmlns:w15="http://schemas.microsoft.com/office/word/2012/wordml" xmlns:w16cex="http://schemas.microsoft.com/office/word/2018/wordml/cex" xmlns:w16cid="http://schemas.microsoft.com/office/word/2016/wordml/cid" xmlns:w16="http://schemas.microsoft.com/office/word/2018/wordml" xmlns:w16du="http://schemas.microsoft.com/office/word/2023/wordml/word16du" xmlns:w16sdtdh="http://schemas.microsoft.com/office/word/2020/wordml/sdtdatahash" xmlns:w16sdtfl="http://schemas.microsoft.com/office/word/2024/wordml/sdtformatlock" xmlns:w16se="http://schemas.microsoft.com/office/word/2015/wordml/symex" xmlns:wpg="http://schemas.microsoft.com/office/word/2010/wordprocessingGroup" xmlns:wpi="http://schemas.microsoft.com/office/word/2010/wordprocessingInk" xmlns:wne="http://schemas.microsoft.com/office/word/2006/wordml" xmlns:wps="http://schemas.microsoft.com/office/word/2010/wordprocessingShape" mc:Ignorable="w14 w15 w16se w16cid w16 w16cex w16sdtdh w16sdtfl w16du wp14">
+<w15:people xmlns:wpc="http://schemas.microsoft.com/office/word/2010/wordprocessingCanvas" xmlns:cx="http://schemas.microsoft.com/office/drawing/2014/chartex" xmlns:cx1="http://schemas.microsoft.com/office/drawing/2015/9/8/chartex" xmlns:cx2="http://schemas.microsoft.com/office/drawing/2015/10/21/chartex" xmlns:cx3="http://schemas.microsoft.com/office/drawing/2016/5/9/chartex" xmlns:cx4="http://schemas.microsoft.com/office/drawing/2016/5/10/chartex" xmlns:cx5="http://schemas.microsoft.com/office/drawing/2016/5/11/chartex" xmlns:cx6="http://schemas.microsoft.com/office/drawing/2016/5/12/chartex" xmlns:cx7="http://schemas.microsoft.com/office/drawing/2016/5/13/chartex" xmlns:cx8="http://schemas.microsoft.com/office/drawing/2016/5/14/chartex" xmlns:mc="http://schemas.openxmlformats.org/markup-compatibility/2006" xmlns:m="http://schemas.openxmlformats.org/officeDocument/2006/math" xmlns:aink="http://schemas.microsoft.com/office/drawing/2016/ink" xmlns:am3d="http://schemas.microsoft.com/office/drawing/2017/model3d" xmlns:oel="http://schemas.microsoft.com/office/2019/extlst" xmlns:r="http://schemas.openxmlformats.org/officeDocument/2006/relationships" xmlns:wp14="http://schemas.microsoft.com/office/word/2010/wordprocessingDrawing" xmlns:wp="http://schemas.openxmlformats.org/drawingml/2006/wordprocessingDrawing" xmlns:wpg="http://schemas.microsoft.com/office/word/2010/wordprocessingGroup" xmlns:wpi="http://schemas.microsoft.com/office/word/2010/wordprocessingInk" xmlns:wps="http://schemas.microsoft.com/office/word/2010/wordprocessingShape" xmlns:o="urn:schemas-microsoft-com:office:office" xmlns:v="urn:schemas-microsoft-com:vml" xmlns:w10="urn:schemas-microsoft-com:office:word" xmlns:w="http://schemas.openxmlformats.org/wordprocessingml/2006/main" xmlns:w14="http://schemas.microsoft.com/office/word/2010/wordml" xmlns:w15="http://schemas.microsoft.com/office/word/2012/wordml" xmlns:w16cex="http://schemas.microsoft.com/office/word/2018/wordml/cex" xmlns:w16cid="http://schemas.microsoft.com/office/word/2016/wordml/cid" xmlns:w16="http://schemas.microsoft.com/office/word/2018/wordml" xmlns:w16sdtdh="http://schemas.microsoft.com/office/word/2020/wordml/sdtdatahash" xmlns:w16sdtfl="http://schemas.microsoft.com/office/word/2024/wordml/sdtformatlock" xmlns:w16se="http://schemas.microsoft.com/office/word/2015/wordml/symex" xmlns:w16du="http://schemas.microsoft.com/office/word/2023/wordml/word16du" xmlns:wne="http://schemas.microsoft.com/office/word/2006/wordml" mc:Ignorable="w14 w15 w16se w16cid w16 w16cex w16sdtdh w16sdtfl w16du wp14">
   <w15:person w15:author="de Szoeke, Simon">
     <w15:presenceInfo w15:providerId="AD" w15:userId="S::deszoeks@oregonstate.edu::2a772c8a-8ee4-4018-9aea-1f1b0a725b5f"/>
   </w15:person>
@@ -31199,7 +33289,7 @@
 </file>
 
 <file path=word/styles.xml><?xml version="1.0" encoding="utf-8"?>
-<w:styles xmlns:mc="http://schemas.openxmlformats.org/markup-compatibility/2006" xmlns:r="http://schemas.openxmlformats.org/officeDocument/2006/relationships" xmlns:w="http://schemas.openxmlformats.org/wordprocessingml/2006/main" xmlns:w14="http://schemas.microsoft.com/office/word/2010/wordml" xmlns:w15="http://schemas.microsoft.com/office/word/2012/wordml" xmlns:w16cex="http://schemas.microsoft.com/office/word/2018/wordml/cex" xmlns:w16cid="http://schemas.microsoft.com/office/word/2016/wordml/cid" xmlns:w16="http://schemas.microsoft.com/office/word/2018/wordml" xmlns:w16du="http://schemas.microsoft.com/office/word/2023/wordml/word16du" xmlns:w16sdtdh="http://schemas.microsoft.com/office/word/2020/wordml/sdtdatahash" xmlns:w16sdtfl="http://schemas.microsoft.com/office/word/2024/wordml/sdtformatlock" xmlns:w16se="http://schemas.microsoft.com/office/word/2015/wordml/symex" mc:Ignorable="w14 w15 w16se w16cid w16 w16cex w16sdtdh w16sdtfl w16du">
+<w:styles xmlns:mc="http://schemas.openxmlformats.org/markup-compatibility/2006" xmlns:r="http://schemas.openxmlformats.org/officeDocument/2006/relationships" xmlns:w="http://schemas.openxmlformats.org/wordprocessingml/2006/main" xmlns:w14="http://schemas.microsoft.com/office/word/2010/wordml" xmlns:w15="http://schemas.microsoft.com/office/word/2012/wordml" xmlns:w16cex="http://schemas.microsoft.com/office/word/2018/wordml/cex" xmlns:w16cid="http://schemas.microsoft.com/office/word/2016/wordml/cid" xmlns:w16="http://schemas.microsoft.com/office/word/2018/wordml" xmlns:w16sdtdh="http://schemas.microsoft.com/office/word/2020/wordml/sdtdatahash" xmlns:w16sdtfl="http://schemas.microsoft.com/office/word/2024/wordml/sdtformatlock" xmlns:w16se="http://schemas.microsoft.com/office/word/2015/wordml/symex" xmlns:w16du="http://schemas.microsoft.com/office/word/2023/wordml/word16du" mc:Ignorable="w14 w15 w16se w16cid w16 w16cex w16sdtdh w16sdtfl w16du">
   <w:docDefaults>
     <w:rPrDefault>
       <w:rPr>

</xml_diff>